<commit_message>
Complete lab 3 calculations for dictionary sizes, archive types and manual coding
</commit_message>
<xml_diff>
--- a/lab3_450389.docx
+++ b/lab3_450389.docx
@@ -277,6 +277,96 @@
           <w:rPr>
             <w:color w:val="1155CC"/>
           </w:rPr>
+          <w:t>Задание 3. Влияние размера словаря</w:t>
+        </w:r>
+      </w:hyperlink>
+    </w:p>
+    <w:p>
+      <w:pPr>
+        <w:pStyle w:val="Мойтекст"/>
+        <w:spacing w:after="100"/>
+        <w:ind w:firstLine="0"/>
+      </w:pPr>
+      <w:hyperlink w:anchor="lab3_10">
+        <w:r>
+          <w:rPr>
+            <w:color w:val="1155CC"/>
+          </w:rPr>
+          <w:t>Задание 4. Максимальное сжатие из командной строки</w:t>
+        </w:r>
+      </w:hyperlink>
+    </w:p>
+    <w:p>
+      <w:pPr>
+        <w:pStyle w:val="Мойтекст"/>
+        <w:spacing w:after="100"/>
+        <w:ind w:firstLine="0"/>
+      </w:pPr>
+      <w:hyperlink w:anchor="lab3_11">
+        <w:r>
+          <w:rPr>
+            <w:color w:val="1155CC"/>
+          </w:rPr>
+          <w:t>Задание 5. Solid- и SFX-архивы</w:t>
+        </w:r>
+      </w:hyperlink>
+    </w:p>
+    <w:p>
+      <w:pPr>
+        <w:pStyle w:val="Мойтекст"/>
+        <w:spacing w:after="100"/>
+        <w:ind w:firstLine="0"/>
+      </w:pPr>
+      <w:hyperlink w:anchor="lab3_12">
+        <w:r>
+          <w:rPr>
+            <w:color w:val="1155CC"/>
+          </w:rPr>
+          <w:t>Задание 6. Ручное сжатие RLE и Хаффмана</w:t>
+        </w:r>
+      </w:hyperlink>
+    </w:p>
+    <w:p>
+      <w:pPr>
+        <w:pStyle w:val="Мойтекст"/>
+        <w:spacing w:after="100"/>
+        <w:ind w:firstLine="0" w:left="340"/>
+      </w:pPr>
+      <w:hyperlink w:anchor="lab3_13">
+        <w:r>
+          <w:rPr>
+            <w:color w:val="1155CC"/>
+          </w:rPr>
+          <w:t>6.1. Кодирование RLE</w:t>
+        </w:r>
+      </w:hyperlink>
+    </w:p>
+    <w:p>
+      <w:pPr>
+        <w:pStyle w:val="Мойтекст"/>
+        <w:spacing w:after="100"/>
+        <w:ind w:firstLine="0" w:left="340"/>
+      </w:pPr>
+      <w:hyperlink w:anchor="lab3_14">
+        <w:r>
+          <w:rPr>
+            <w:color w:val="1155CC"/>
+          </w:rPr>
+          <w:t>6.2. Кодирование Хаффмана</w:t>
+        </w:r>
+      </w:hyperlink>
+    </w:p>
+    <w:p>
+      <w:pPr>
+        <w:pStyle w:val="Мойтекст"/>
+        <w:spacing w:after="100"/>
+        <w:ind w:firstLine="0"/>
+      </w:pPr>
+      <w:hyperlink w:anchor="lab3_15">
+        <w:r>
+          <w:rPr>
+            <w:color w:val="1155CC"/>
+          </w:rPr>
           <w:t>Выводы</w:t>
         </w:r>
       </w:hyperlink>
@@ -287,7 +377,7 @@
         <w:spacing w:after="100"/>
         <w:ind w:firstLine="0"/>
       </w:pPr>
-      <w:hyperlink w:anchor="lab3_10">
+      <w:hyperlink w:anchor="lab3_16">
         <w:r>
           <w:rPr>
             <w:color w:val="1155CC"/>
@@ -4942,11 +5032,4222 @@
       <w:bookmarkStart w:id="809" w:name="lab3_9"/>
       <w:pPr>
         <w:pStyle w:val="Heading1"/>
+        <w:pageBreakBefore/>
+      </w:pPr>
+      <w:r>
+        <w:t>Задание 3. Влияние размера словаря</w:t>
+      </w:r>
+      <w:bookmarkEnd w:id="809"/>
+    </w:p>
+    <w:p>
+      <w:pPr>
+        <w:pStyle w:val="Мойтекст"/>
+        <w:spacing w:after="100"/>
+      </w:pPr>
+      <w:r>
+        <w:t>Для каталога 450389TXT выбран метод LZMA2, уровень сжатия «5 — Нормальный». Исследованы словари 64 КБ, 16 МБ, 128 МБ и максимальный доступный размер 3840 МБ. По сообщению исполнителя вручную изменялся только словарь. В окне максимального словаря 7-Zip отображает два потока; вручную число потоков не менялось. Поэтому фиксируется фактически показанная оценка памяти программы.</w:t>
+      </w:r>
+    </w:p>
+    <w:tbl>
+      <w:tblPr>
+        <w:tblStyle w:val="TableGrid"/>
+        <w:tblW w:type="auto" w:w="0"/>
+        <w:jc w:val="center"/>
+        <w:tblLayout w:type="fixed"/>
+        <w:tblLook w:firstColumn="1" w:firstRow="1" w:lastColumn="0" w:lastRow="0" w:noHBand="0" w:noVBand="1" w:val="04A0"/>
+      </w:tblPr>
+      <w:tblGrid>
+        <w:gridCol w:w="1474"/>
+        <w:gridCol w:w="1928"/>
+        <w:gridCol w:w="1928"/>
+        <w:gridCol w:w="1701"/>
+        <w:gridCol w:w="1757"/>
+      </w:tblGrid>
+      <w:tr>
+        <w:trPr>
+          <w:cantSplit/>
+          <w:tblHeader/>
+        </w:trPr>
+        <w:tc>
+          <w:tcPr>
+            <w:tcW w:type="dxa" w:w="1474"/>
+            <w:vAlign w:val="center"/>
+            <w:shd w:fill="E8EEF5"/>
+          </w:tcPr>
+          <w:p>
+            <w:pPr>
+              <w:pStyle w:val="Мойтекст"/>
+              <w:keepNext/>
+              <w:spacing w:before="80" w:after="80" w:line="240" w:lineRule="auto"/>
+              <w:ind w:firstLine="0" w:left="0"/>
+            </w:pPr>
+            <w:r>
+              <w:rPr>
+                <w:b/>
+                <w:sz w:val="18"/>
+              </w:rPr>
+              <w:t>Словарь</w:t>
+            </w:r>
+          </w:p>
+        </w:tc>
+        <w:tc>
+          <w:tcPr>
+            <w:tcW w:type="dxa" w:w="1928"/>
+            <w:vAlign w:val="center"/>
+            <w:shd w:fill="E8EEF5"/>
+          </w:tcPr>
+          <w:p>
+            <w:pPr>
+              <w:pStyle w:val="Мойтекст"/>
+              <w:keepNext/>
+              <w:spacing w:before="80" w:after="80" w:line="240" w:lineRule="auto"/>
+              <w:ind w:firstLine="0" w:left="0"/>
+            </w:pPr>
+            <w:r>
+              <w:rPr>
+                <w:b/>
+                <w:sz w:val="18"/>
+              </w:rPr>
+              <w:t>Память для сжатия, МБ</w:t>
+            </w:r>
+          </w:p>
+        </w:tc>
+        <w:tc>
+          <w:tcPr>
+            <w:tcW w:type="dxa" w:w="1928"/>
+            <w:vAlign w:val="center"/>
+            <w:shd w:fill="E8EEF5"/>
+          </w:tcPr>
+          <w:p>
+            <w:pPr>
+              <w:pStyle w:val="Мойтекст"/>
+              <w:keepNext/>
+              <w:spacing w:before="80" w:after="80" w:line="240" w:lineRule="auto"/>
+              <w:ind w:firstLine="0" w:left="0"/>
+            </w:pPr>
+            <w:r>
+              <w:rPr>
+                <w:b/>
+                <w:sz w:val="18"/>
+              </w:rPr>
+              <w:t>Память для распаковки, МБ</w:t>
+            </w:r>
+          </w:p>
+        </w:tc>
+        <w:tc>
+          <w:tcPr>
+            <w:tcW w:type="dxa" w:w="1701"/>
+            <w:vAlign w:val="center"/>
+            <w:shd w:fill="E8EEF5"/>
+          </w:tcPr>
+          <w:p>
+            <w:pPr>
+              <w:pStyle w:val="Мойтекст"/>
+              <w:keepNext/>
+              <w:spacing w:before="80" w:after="80" w:line="240" w:lineRule="auto"/>
+              <w:ind w:firstLine="0" w:left="0"/>
+            </w:pPr>
+            <w:r>
+              <w:rPr>
+                <w:b/>
+                <w:sz w:val="18"/>
+              </w:rPr>
+              <w:t>Архив, байт</w:t>
+            </w:r>
+          </w:p>
+        </w:tc>
+        <w:tc>
+          <w:tcPr>
+            <w:tcW w:type="dxa" w:w="1757"/>
+            <w:vAlign w:val="center"/>
+            <w:shd w:fill="E8EEF5"/>
+          </w:tcPr>
+          <w:p>
+            <w:pPr>
+              <w:pStyle w:val="Мойтекст"/>
+              <w:keepNext/>
+              <w:spacing w:before="80" w:after="80" w:line="240" w:lineRule="auto"/>
+              <w:ind w:firstLine="0" w:left="0"/>
+            </w:pPr>
+            <w:r>
+              <w:rPr>
+                <w:b/>
+                <w:sz w:val="18"/>
+              </w:rPr>
+              <w:t>Коэффициент, %</w:t>
+            </w:r>
+          </w:p>
+        </w:tc>
+      </w:tr>
+      <w:tr>
+        <w:trPr>
+          <w:cantSplit/>
+        </w:trPr>
+        <w:tc>
+          <w:tcPr>
+            <w:tcW w:type="dxa" w:w="1474"/>
+            <w:vAlign w:val="center"/>
+          </w:tcPr>
+          <w:p>
+            <w:pPr>
+              <w:pStyle w:val="Мойтекст"/>
+              <w:keepNext w:val="0"/>
+              <w:spacing w:before="80" w:after="80" w:line="240" w:lineRule="auto"/>
+              <w:ind w:firstLine="0" w:left="0"/>
+            </w:pPr>
+            <w:r>
+              <w:rPr>
+                <w:b w:val="0"/>
+                <w:sz w:val="18"/>
+              </w:rPr>
+              <w:t>64 КБ</w:t>
+            </w:r>
+          </w:p>
+        </w:tc>
+        <w:tc>
+          <w:tcPr>
+            <w:tcW w:type="dxa" w:w="1928"/>
+            <w:vAlign w:val="center"/>
+          </w:tcPr>
+          <w:p>
+            <w:pPr>
+              <w:pStyle w:val="Мойтекст"/>
+              <w:keepNext w:val="0"/>
+              <w:spacing w:before="80" w:after="80" w:line="240" w:lineRule="auto"/>
+              <w:ind w:firstLine="0" w:left="0"/>
+            </w:pPr>
+            <w:r>
+              <w:rPr>
+                <w:b w:val="0"/>
+                <w:sz w:val="18"/>
+              </w:rPr>
+              <w:t>88</w:t>
+            </w:r>
+          </w:p>
+        </w:tc>
+        <w:tc>
+          <w:tcPr>
+            <w:tcW w:type="dxa" w:w="1928"/>
+            <w:vAlign w:val="center"/>
+          </w:tcPr>
+          <w:p>
+            <w:pPr>
+              <w:pStyle w:val="Мойтекст"/>
+              <w:keepNext w:val="0"/>
+              <w:spacing w:before="80" w:after="80" w:line="240" w:lineRule="auto"/>
+              <w:ind w:firstLine="0" w:left="0"/>
+            </w:pPr>
+            <w:r>
+              <w:rPr>
+                <w:b w:val="0"/>
+                <w:sz w:val="18"/>
+              </w:rPr>
+              <w:t>3</w:t>
+            </w:r>
+          </w:p>
+        </w:tc>
+        <w:tc>
+          <w:tcPr>
+            <w:tcW w:type="dxa" w:w="1701"/>
+            <w:vAlign w:val="center"/>
+          </w:tcPr>
+          <w:p>
+            <w:pPr>
+              <w:pStyle w:val="Мойтекст"/>
+              <w:keepNext w:val="0"/>
+              <w:spacing w:before="80" w:after="80" w:line="240" w:lineRule="auto"/>
+              <w:ind w:firstLine="0" w:left="0"/>
+            </w:pPr>
+            <w:r>
+              <w:rPr>
+                <w:b w:val="0"/>
+                <w:sz w:val="18"/>
+              </w:rPr>
+              <w:t>2959</w:t>
+            </w:r>
+          </w:p>
+        </w:tc>
+        <w:tc>
+          <w:tcPr>
+            <w:tcW w:type="dxa" w:w="1757"/>
+            <w:vAlign w:val="center"/>
+          </w:tcPr>
+          <w:p>
+            <w:pPr>
+              <w:pStyle w:val="Мойтекст"/>
+              <w:keepNext w:val="0"/>
+              <w:spacing w:before="80" w:after="80" w:line="240" w:lineRule="auto"/>
+              <w:ind w:firstLine="0" w:left="0"/>
+            </w:pPr>
+            <w:r>
+              <w:rPr>
+                <w:b w:val="0"/>
+                <w:sz w:val="18"/>
+              </w:rPr>
+              <w:t>0,028219</w:t>
+            </w:r>
+          </w:p>
+        </w:tc>
+      </w:tr>
+      <w:tr>
+        <w:trPr>
+          <w:cantSplit/>
+        </w:trPr>
+        <w:tc>
+          <w:tcPr>
+            <w:tcW w:type="dxa" w:w="1474"/>
+            <w:vAlign w:val="center"/>
+          </w:tcPr>
+          <w:p>
+            <w:pPr>
+              <w:pStyle w:val="Мойтекст"/>
+              <w:keepNext w:val="0"/>
+              <w:spacing w:before="80" w:after="80" w:line="240" w:lineRule="auto"/>
+              <w:ind w:firstLine="0" w:left="0"/>
+            </w:pPr>
+            <w:r>
+              <w:rPr>
+                <w:b w:val="0"/>
+                <w:sz w:val="18"/>
+              </w:rPr>
+              <w:t>16 МБ</w:t>
+            </w:r>
+          </w:p>
+        </w:tc>
+        <w:tc>
+          <w:tcPr>
+            <w:tcW w:type="dxa" w:w="1928"/>
+            <w:vAlign w:val="center"/>
+          </w:tcPr>
+          <w:p>
+            <w:pPr>
+              <w:pStyle w:val="Мойтекст"/>
+              <w:keepNext w:val="0"/>
+              <w:spacing w:before="80" w:after="80" w:line="240" w:lineRule="auto"/>
+              <w:ind w:firstLine="0" w:left="0"/>
+            </w:pPr>
+            <w:r>
+              <w:rPr>
+                <w:b w:val="0"/>
+                <w:sz w:val="18"/>
+              </w:rPr>
+              <w:t>2496</w:t>
+            </w:r>
+          </w:p>
+        </w:tc>
+        <w:tc>
+          <w:tcPr>
+            <w:tcW w:type="dxa" w:w="1928"/>
+            <w:vAlign w:val="center"/>
+          </w:tcPr>
+          <w:p>
+            <w:pPr>
+              <w:pStyle w:val="Мойтекст"/>
+              <w:keepNext w:val="0"/>
+              <w:spacing w:before="80" w:after="80" w:line="240" w:lineRule="auto"/>
+              <w:ind w:firstLine="0" w:left="0"/>
+            </w:pPr>
+            <w:r>
+              <w:rPr>
+                <w:b w:val="0"/>
+                <w:sz w:val="18"/>
+              </w:rPr>
+              <w:t>18</w:t>
+            </w:r>
+          </w:p>
+        </w:tc>
+        <w:tc>
+          <w:tcPr>
+            <w:tcW w:type="dxa" w:w="1701"/>
+            <w:vAlign w:val="center"/>
+          </w:tcPr>
+          <w:p>
+            <w:pPr>
+              <w:pStyle w:val="Мойтекст"/>
+              <w:keepNext w:val="0"/>
+              <w:spacing w:before="80" w:after="80" w:line="240" w:lineRule="auto"/>
+              <w:ind w:firstLine="0" w:left="0"/>
+            </w:pPr>
+            <w:r>
+              <w:rPr>
+                <w:b w:val="0"/>
+                <w:sz w:val="18"/>
+              </w:rPr>
+              <w:t>1980</w:t>
+            </w:r>
+          </w:p>
+        </w:tc>
+        <w:tc>
+          <w:tcPr>
+            <w:tcW w:type="dxa" w:w="1757"/>
+            <w:vAlign w:val="center"/>
+          </w:tcPr>
+          <w:p>
+            <w:pPr>
+              <w:pStyle w:val="Мойтекст"/>
+              <w:keepNext w:val="0"/>
+              <w:spacing w:before="80" w:after="80" w:line="240" w:lineRule="auto"/>
+              <w:ind w:firstLine="0" w:left="0"/>
+            </w:pPr>
+            <w:r>
+              <w:rPr>
+                <w:b w:val="0"/>
+                <w:sz w:val="18"/>
+              </w:rPr>
+              <w:t>0,018883</w:t>
+            </w:r>
+          </w:p>
+        </w:tc>
+      </w:tr>
+      <w:tr>
+        <w:trPr>
+          <w:cantSplit/>
+        </w:trPr>
+        <w:tc>
+          <w:tcPr>
+            <w:tcW w:type="dxa" w:w="1474"/>
+            <w:vAlign w:val="center"/>
+          </w:tcPr>
+          <w:p>
+            <w:pPr>
+              <w:pStyle w:val="Мойтекст"/>
+              <w:keepNext w:val="0"/>
+              <w:spacing w:before="80" w:after="80" w:line="240" w:lineRule="auto"/>
+              <w:ind w:firstLine="0" w:left="0"/>
+            </w:pPr>
+            <w:r>
+              <w:rPr>
+                <w:b w:val="0"/>
+                <w:sz w:val="18"/>
+              </w:rPr>
+              <w:t>128 МБ</w:t>
+            </w:r>
+          </w:p>
+        </w:tc>
+        <w:tc>
+          <w:tcPr>
+            <w:tcW w:type="dxa" w:w="1928"/>
+            <w:vAlign w:val="center"/>
+          </w:tcPr>
+          <w:p>
+            <w:pPr>
+              <w:pStyle w:val="Мойтекст"/>
+              <w:keepNext w:val="0"/>
+              <w:spacing w:before="80" w:after="80" w:line="240" w:lineRule="auto"/>
+              <w:ind w:firstLine="0" w:left="0"/>
+            </w:pPr>
+            <w:r>
+              <w:rPr>
+                <w:b w:val="0"/>
+                <w:sz w:val="18"/>
+              </w:rPr>
+              <w:t>13888</w:t>
+            </w:r>
+          </w:p>
+        </w:tc>
+        <w:tc>
+          <w:tcPr>
+            <w:tcW w:type="dxa" w:w="1928"/>
+            <w:vAlign w:val="center"/>
+          </w:tcPr>
+          <w:p>
+            <w:pPr>
+              <w:pStyle w:val="Мойтекст"/>
+              <w:keepNext w:val="0"/>
+              <w:spacing w:before="80" w:after="80" w:line="240" w:lineRule="auto"/>
+              <w:ind w:firstLine="0" w:left="0"/>
+            </w:pPr>
+            <w:r>
+              <w:rPr>
+                <w:b w:val="0"/>
+                <w:sz w:val="18"/>
+              </w:rPr>
+              <w:t>130</w:t>
+            </w:r>
+          </w:p>
+        </w:tc>
+        <w:tc>
+          <w:tcPr>
+            <w:tcW w:type="dxa" w:w="1701"/>
+            <w:vAlign w:val="center"/>
+          </w:tcPr>
+          <w:p>
+            <w:pPr>
+              <w:pStyle w:val="Мойтекст"/>
+              <w:keepNext w:val="0"/>
+              <w:spacing w:before="80" w:after="80" w:line="240" w:lineRule="auto"/>
+              <w:ind w:firstLine="0" w:left="0"/>
+            </w:pPr>
+            <w:r>
+              <w:rPr>
+                <w:b w:val="0"/>
+                <w:sz w:val="18"/>
+              </w:rPr>
+              <w:t>1980</w:t>
+            </w:r>
+          </w:p>
+        </w:tc>
+        <w:tc>
+          <w:tcPr>
+            <w:tcW w:type="dxa" w:w="1757"/>
+            <w:vAlign w:val="center"/>
+          </w:tcPr>
+          <w:p>
+            <w:pPr>
+              <w:pStyle w:val="Мойтекст"/>
+              <w:keepNext w:val="0"/>
+              <w:spacing w:before="80" w:after="80" w:line="240" w:lineRule="auto"/>
+              <w:ind w:firstLine="0" w:left="0"/>
+            </w:pPr>
+            <w:r>
+              <w:rPr>
+                <w:b w:val="0"/>
+                <w:sz w:val="18"/>
+              </w:rPr>
+              <w:t>0,018883</w:t>
+            </w:r>
+          </w:p>
+        </w:tc>
+      </w:tr>
+      <w:tr>
+        <w:trPr>
+          <w:cantSplit/>
+        </w:trPr>
+        <w:tc>
+          <w:tcPr>
+            <w:tcW w:type="dxa" w:w="1474"/>
+            <w:vAlign w:val="center"/>
+          </w:tcPr>
+          <w:p>
+            <w:pPr>
+              <w:pStyle w:val="Мойтекст"/>
+              <w:keepNext w:val="0"/>
+              <w:spacing w:before="80" w:after="80" w:line="240" w:lineRule="auto"/>
+              <w:ind w:firstLine="0" w:left="0"/>
+            </w:pPr>
+            <w:r>
+              <w:rPr>
+                <w:b w:val="0"/>
+                <w:sz w:val="18"/>
+              </w:rPr>
+              <w:t>3840 МБ (max)</w:t>
+            </w:r>
+          </w:p>
+        </w:tc>
+        <w:tc>
+          <w:tcPr>
+            <w:tcW w:type="dxa" w:w="1928"/>
+            <w:vAlign w:val="center"/>
+          </w:tcPr>
+          <w:p>
+            <w:pPr>
+              <w:pStyle w:val="Мойтекст"/>
+              <w:keepNext w:val="0"/>
+              <w:spacing w:before="80" w:after="80" w:line="240" w:lineRule="auto"/>
+              <w:ind w:firstLine="0" w:left="0"/>
+            </w:pPr>
+            <w:r>
+              <w:rPr>
+                <w:b w:val="0"/>
+                <w:sz w:val="18"/>
+              </w:rPr>
+              <w:t>38920</w:t>
+            </w:r>
+          </w:p>
+        </w:tc>
+        <w:tc>
+          <w:tcPr>
+            <w:tcW w:type="dxa" w:w="1928"/>
+            <w:vAlign w:val="center"/>
+          </w:tcPr>
+          <w:p>
+            <w:pPr>
+              <w:pStyle w:val="Мойтекст"/>
+              <w:keepNext w:val="0"/>
+              <w:spacing w:before="80" w:after="80" w:line="240" w:lineRule="auto"/>
+              <w:ind w:firstLine="0" w:left="0"/>
+            </w:pPr>
+            <w:r>
+              <w:rPr>
+                <w:b w:val="0"/>
+                <w:sz w:val="18"/>
+              </w:rPr>
+              <w:t>3842</w:t>
+            </w:r>
+          </w:p>
+        </w:tc>
+        <w:tc>
+          <w:tcPr>
+            <w:tcW w:type="dxa" w:w="1701"/>
+            <w:vAlign w:val="center"/>
+          </w:tcPr>
+          <w:p>
+            <w:pPr>
+              <w:pStyle w:val="Мойтекст"/>
+              <w:keepNext w:val="0"/>
+              <w:spacing w:before="80" w:after="80" w:line="240" w:lineRule="auto"/>
+              <w:ind w:firstLine="0" w:left="0"/>
+            </w:pPr>
+            <w:r>
+              <w:rPr>
+                <w:b w:val="0"/>
+                <w:sz w:val="18"/>
+              </w:rPr>
+              <w:t>—</w:t>
+            </w:r>
+          </w:p>
+        </w:tc>
+        <w:tc>
+          <w:tcPr>
+            <w:tcW w:type="dxa" w:w="1757"/>
+            <w:vAlign w:val="center"/>
+          </w:tcPr>
+          <w:p>
+            <w:pPr>
+              <w:pStyle w:val="Мойтекст"/>
+              <w:keepNext w:val="0"/>
+              <w:spacing w:before="80" w:after="80" w:line="240" w:lineRule="auto"/>
+              <w:ind w:firstLine="0" w:left="0"/>
+            </w:pPr>
+            <w:r>
+              <w:rPr>
+                <w:b w:val="0"/>
+                <w:sz w:val="18"/>
+              </w:rPr>
+              <w:t>—</w:t>
+            </w:r>
+          </w:p>
+        </w:tc>
+      </w:tr>
+    </w:tbl>
+    <w:p>
+      <w:pPr>
+        <w:pStyle w:val="Мойтекст"/>
+        <w:spacing w:after="100"/>
+      </w:pPr>
+      <w:r>
+        <w:t>Память в таблице — оценка 7-Zip, а не измеренный расход. При словаре 3840 МБ программа заблокировала операцию: требовалось 38 920 МБ, установленная RAM — 32 690 МБ, установленный лимит — 26 152 МБ. Архив для максимального словаря не создан; прочерки не означают нулевой размер.</w:t>
+      </w:r>
+    </w:p>
+    <w:p>
+      <w:pPr>
+        <w:pStyle w:val="Мойтекст"/>
+        <w:spacing w:after="100"/>
+      </w:pPr>
+      <w:r>
+        <w:t>Увеличение словаря с 64 КБ до 16 МБ сократило архив с 2959 до 1980 байт. Дальнейшее увеличение до 128 МБ не изменило размер, но повысило оценку памяти сжатия с 2496 до 13 888 МБ и распаковки с 18 до 130 МБ. Большой словарь бесполезен, если меньший уже охватывает полезные повторения исходных данных. Для данного набора из успешно испытанных вариантов рациональнее словарь 16 МБ.</w:t>
+      </w:r>
+    </w:p>
+    <w:tbl>
+      <w:tblPr>
+        <w:tblStyle w:val="TableGrid"/>
+        <w:tblW w:type="auto" w:w="0"/>
+        <w:jc w:val="center"/>
+        <w:tblLook w:firstColumn="1" w:firstRow="1" w:lastColumn="0" w:lastRow="0" w:noHBand="0" w:noVBand="1" w:val="04A0"/>
+      </w:tblPr>
+      <w:tblGrid>
+        <w:gridCol w:w="9355"/>
+      </w:tblGrid>
+      <w:tr>
+        <w:trPr>
+          <w:trHeight w:val="1984"/>
+        </w:trPr>
+        <w:tc>
+          <w:tcPr>
+            <w:tcW w:type="dxa" w:w="9355"/>
+            <w:vAlign w:val="center"/>
+          </w:tcPr>
+          <w:p>
+            <w:pPr>
+              <w:pStyle w:val="Мойтекст"/>
+              <w:keepNext/>
+              <w:ind w:firstLine="0"/>
+              <w:jc w:val="center"/>
+            </w:pPr>
+            <w:r>
+              <w:rPr>
+                <w:i/>
+              </w:rPr>
+              <w:t>[Место для скриншота: Архивы 450389TXT64, 450389TXT16 и 450389TXT128 в FAR, режим «Детальный»]</w:t>
+            </w:r>
+          </w:p>
+        </w:tc>
+      </w:tr>
+    </w:tbl>
+    <w:p>
+      <w:pPr>
+        <w:pStyle w:val="Мояподпись"/>
+        <w:spacing w:after="140"/>
+      </w:pPr>
+      <w:r>
+        <w:t>Скриншот 7 — Архивы 450389TXT64, 450389TXT16 и 450389TXT128 в FAR, режим «Детальный»</w:t>
+      </w:r>
+    </w:p>
+    <w:tbl>
+      <w:tblPr>
+        <w:tblStyle w:val="TableGrid"/>
+        <w:tblW w:type="auto" w:w="0"/>
+        <w:jc w:val="center"/>
+        <w:tblLook w:firstColumn="1" w:firstRow="1" w:lastColumn="0" w:lastRow="0" w:noHBand="0" w:noVBand="1" w:val="04A0"/>
+      </w:tblPr>
+      <w:tblGrid>
+        <w:gridCol w:w="9355"/>
+      </w:tblGrid>
+      <w:tr>
+        <w:trPr>
+          <w:trHeight w:val="1984"/>
+        </w:trPr>
+        <w:tc>
+          <w:tcPr>
+            <w:tcW w:type="dxa" w:w="9355"/>
+            <w:vAlign w:val="center"/>
+          </w:tcPr>
+          <w:p>
+            <w:pPr>
+              <w:pStyle w:val="Мойтекст"/>
+              <w:keepNext/>
+              <w:ind w:firstLine="0"/>
+              <w:jc w:val="center"/>
+            </w:pPr>
+            <w:r>
+              <w:rPr>
+                <w:i/>
+              </w:rPr>
+              <w:t>[Место для скриншота: Отказ 7-Zip при словаре 3840 МБ: недостаточно памяти]</w:t>
+            </w:r>
+          </w:p>
+        </w:tc>
+      </w:tr>
+    </w:tbl>
+    <w:p>
+      <w:pPr>
+        <w:pStyle w:val="Мояподпись"/>
+        <w:spacing w:after="140"/>
+      </w:pPr>
+      <w:r>
+        <w:t>Скриншот 8 — Отказ 7-Zip при словаре 3840 МБ: недостаточно памяти</w:t>
+      </w:r>
+    </w:p>
+    <w:p>
+      <w:bookmarkStart w:id="810" w:name="lab3_10"/>
+      <w:pPr>
+        <w:pStyle w:val="Heading1"/>
+        <w:pageBreakBefore/>
+      </w:pPr>
+      <w:r>
+        <w:t>Задание 4. Максимальное сжатие из командной строки</w:t>
+      </w:r>
+      <w:bookmarkEnd w:id="810"/>
+    </w:p>
+    <w:p>
+      <w:pPr>
+        <w:pStyle w:val="Мойтекст"/>
+        <w:spacing w:after="100"/>
+      </w:pPr>
+      <w:r>
+        <w:t>Каталоги 450389PIC и 450389VID упакованы по отдельности консольной версией 7-Zip с максимальным уровнем сжатия. Команды выполняются из родительского каталога, чтобы готовые архивы находились вне исходных папок. Параметр -mx=9 задаёт максимальный уровень, -m0=LZMA2 выбирает алгоритм.</w:t>
+      </w:r>
+    </w:p>
+    <w:p>
+      <w:pPr>
+        <w:pStyle w:val="Мойтекст"/>
+        <w:spacing w:before="80" w:after="100"/>
+        <w:ind w:firstLine="0" w:left="0"/>
+      </w:pPr>
+      <w:r>
+        <w:rPr>
+          <w:rFonts w:ascii="Courier New" w:hAnsi="Courier New"/>
+          <w:sz w:val="16"/>
+        </w:rPr>
+        <w:t>"C:\Program Files\7-Zip\7z.exe" a -t7z -m0=LZMA2 -mx=9 "450389PIC_max.7z" ".\450389PIC\"</w:t>
+      </w:r>
+    </w:p>
+    <w:p>
+      <w:pPr>
+        <w:pStyle w:val="Мойтекст"/>
+        <w:spacing w:before="80" w:after="100"/>
+        <w:ind w:firstLine="0" w:left="0"/>
+      </w:pPr>
+      <w:r>
+        <w:rPr>
+          <w:rFonts w:ascii="Courier New" w:hAnsi="Courier New"/>
+          <w:sz w:val="16"/>
+        </w:rPr>
+        <w:t>"C:\Program Files\7-Zip\7z.exe" a -t7z -m0=LZMA2 -mx=9 "450389VID_max.7z" ".\450389VID\"</w:t>
+      </w:r>
+    </w:p>
+    <w:tbl>
+      <w:tblPr>
+        <w:tblStyle w:val="TableGrid"/>
+        <w:tblW w:type="auto" w:w="0"/>
+        <w:jc w:val="center"/>
+        <w:tblLayout w:type="fixed"/>
+        <w:tblLook w:firstColumn="1" w:firstRow="1" w:lastColumn="0" w:lastRow="0" w:noHBand="0" w:noVBand="1" w:val="04A0"/>
+      </w:tblPr>
+      <w:tblGrid>
+        <w:gridCol w:w="1531"/>
+        <w:gridCol w:w="1871"/>
+        <w:gridCol w:w="1871"/>
+        <w:gridCol w:w="1814"/>
+        <w:gridCol w:w="1701"/>
+      </w:tblGrid>
+      <w:tr>
+        <w:trPr>
+          <w:cantSplit/>
+          <w:tblHeader/>
+        </w:trPr>
+        <w:tc>
+          <w:tcPr>
+            <w:tcW w:type="dxa" w:w="1531"/>
+            <w:vAlign w:val="center"/>
+            <w:shd w:fill="E8EEF5"/>
+          </w:tcPr>
+          <w:p>
+            <w:pPr>
+              <w:pStyle w:val="Мойтекст"/>
+              <w:keepNext/>
+              <w:spacing w:before="80" w:after="80" w:line="240" w:lineRule="auto"/>
+              <w:ind w:firstLine="0" w:left="0"/>
+            </w:pPr>
+            <w:r>
+              <w:rPr>
+                <w:b/>
+                <w:sz w:val="18"/>
+              </w:rPr>
+              <w:t>Каталог</w:t>
+            </w:r>
+          </w:p>
+        </w:tc>
+        <w:tc>
+          <w:tcPr>
+            <w:tcW w:type="dxa" w:w="1871"/>
+            <w:vAlign w:val="center"/>
+            <w:shd w:fill="E8EEF5"/>
+          </w:tcPr>
+          <w:p>
+            <w:pPr>
+              <w:pStyle w:val="Мойтекст"/>
+              <w:keepNext/>
+              <w:spacing w:before="80" w:after="80" w:line="240" w:lineRule="auto"/>
+              <w:ind w:firstLine="0" w:left="0"/>
+            </w:pPr>
+            <w:r>
+              <w:rPr>
+                <w:b/>
+                <w:sz w:val="18"/>
+              </w:rPr>
+              <w:t>Оригинал, байт</w:t>
+            </w:r>
+          </w:p>
+        </w:tc>
+        <w:tc>
+          <w:tcPr>
+            <w:tcW w:type="dxa" w:w="1871"/>
+            <w:vAlign w:val="center"/>
+            <w:shd w:fill="E8EEF5"/>
+          </w:tcPr>
+          <w:p>
+            <w:pPr>
+              <w:pStyle w:val="Мойтекст"/>
+              <w:keepNext/>
+              <w:spacing w:before="80" w:after="80" w:line="240" w:lineRule="auto"/>
+              <w:ind w:firstLine="0" w:left="0"/>
+            </w:pPr>
+            <w:r>
+              <w:rPr>
+                <w:b/>
+                <w:sz w:val="18"/>
+              </w:rPr>
+              <w:t>Архив, байт</w:t>
+            </w:r>
+          </w:p>
+        </w:tc>
+        <w:tc>
+          <w:tcPr>
+            <w:tcW w:type="dxa" w:w="1814"/>
+            <w:vAlign w:val="center"/>
+            <w:shd w:fill="E8EEF5"/>
+          </w:tcPr>
+          <w:p>
+            <w:pPr>
+              <w:pStyle w:val="Мойтекст"/>
+              <w:keepNext/>
+              <w:spacing w:before="80" w:after="80" w:line="240" w:lineRule="auto"/>
+              <w:ind w:firstLine="0" w:left="0"/>
+            </w:pPr>
+            <w:r>
+              <w:rPr>
+                <w:b/>
+                <w:sz w:val="18"/>
+              </w:rPr>
+              <w:t>Архив / оригинал, %</w:t>
+            </w:r>
+          </w:p>
+        </w:tc>
+        <w:tc>
+          <w:tcPr>
+            <w:tcW w:type="dxa" w:w="1701"/>
+            <w:vAlign w:val="center"/>
+            <w:shd w:fill="E8EEF5"/>
+          </w:tcPr>
+          <w:p>
+            <w:pPr>
+              <w:pStyle w:val="Мойтекст"/>
+              <w:keepNext/>
+              <w:spacing w:before="80" w:after="80" w:line="240" w:lineRule="auto"/>
+              <w:ind w:firstLine="0" w:left="0"/>
+            </w:pPr>
+            <w:r>
+              <w:rPr>
+                <w:b/>
+                <w:sz w:val="18"/>
+              </w:rPr>
+              <w:t>Уменьшение, %</w:t>
+            </w:r>
+          </w:p>
+        </w:tc>
+      </w:tr>
+      <w:tr>
+        <w:trPr>
+          <w:cantSplit/>
+        </w:trPr>
+        <w:tc>
+          <w:tcPr>
+            <w:tcW w:type="dxa" w:w="1531"/>
+            <w:vAlign w:val="center"/>
+          </w:tcPr>
+          <w:p>
+            <w:pPr>
+              <w:pStyle w:val="Мойтекст"/>
+              <w:keepNext w:val="0"/>
+              <w:spacing w:before="80" w:after="80" w:line="240" w:lineRule="auto"/>
+              <w:ind w:firstLine="0" w:left="0"/>
+            </w:pPr>
+            <w:r>
+              <w:rPr>
+                <w:b w:val="0"/>
+                <w:sz w:val="18"/>
+              </w:rPr>
+              <w:t>450389PIC</w:t>
+            </w:r>
+          </w:p>
+        </w:tc>
+        <w:tc>
+          <w:tcPr>
+            <w:tcW w:type="dxa" w:w="1871"/>
+            <w:vAlign w:val="center"/>
+          </w:tcPr>
+          <w:p>
+            <w:pPr>
+              <w:pStyle w:val="Мойтекст"/>
+              <w:keepNext w:val="0"/>
+              <w:spacing w:before="80" w:after="80" w:line="240" w:lineRule="auto"/>
+              <w:ind w:firstLine="0" w:left="0"/>
+            </w:pPr>
+            <w:r>
+              <w:rPr>
+                <w:b w:val="0"/>
+                <w:sz w:val="18"/>
+              </w:rPr>
+              <w:t>24 649 578</w:t>
+            </w:r>
+          </w:p>
+        </w:tc>
+        <w:tc>
+          <w:tcPr>
+            <w:tcW w:type="dxa" w:w="1871"/>
+            <w:vAlign w:val="center"/>
+          </w:tcPr>
+          <w:p>
+            <w:pPr>
+              <w:pStyle w:val="Мойтекст"/>
+              <w:keepNext w:val="0"/>
+              <w:spacing w:before="80" w:after="80" w:line="240" w:lineRule="auto"/>
+              <w:ind w:firstLine="0" w:left="0"/>
+            </w:pPr>
+            <w:r>
+              <w:rPr>
+                <w:b w:val="0"/>
+                <w:sz w:val="18"/>
+              </w:rPr>
+              <w:t>23 217 366</w:t>
+            </w:r>
+          </w:p>
+        </w:tc>
+        <w:tc>
+          <w:tcPr>
+            <w:tcW w:type="dxa" w:w="1814"/>
+            <w:vAlign w:val="center"/>
+          </w:tcPr>
+          <w:p>
+            <w:pPr>
+              <w:pStyle w:val="Мойтекст"/>
+              <w:keepNext w:val="0"/>
+              <w:spacing w:before="80" w:after="80" w:line="240" w:lineRule="auto"/>
+              <w:ind w:firstLine="0" w:left="0"/>
+            </w:pPr>
+            <w:r>
+              <w:rPr>
+                <w:b w:val="0"/>
+                <w:sz w:val="18"/>
+              </w:rPr>
+              <w:t>94,19</w:t>
+            </w:r>
+          </w:p>
+        </w:tc>
+        <w:tc>
+          <w:tcPr>
+            <w:tcW w:type="dxa" w:w="1701"/>
+            <w:vAlign w:val="center"/>
+          </w:tcPr>
+          <w:p>
+            <w:pPr>
+              <w:pStyle w:val="Мойтекст"/>
+              <w:keepNext w:val="0"/>
+              <w:spacing w:before="80" w:after="80" w:line="240" w:lineRule="auto"/>
+              <w:ind w:firstLine="0" w:left="0"/>
+            </w:pPr>
+            <w:r>
+              <w:rPr>
+                <w:b w:val="0"/>
+                <w:sz w:val="18"/>
+              </w:rPr>
+              <w:t>5,81</w:t>
+            </w:r>
+          </w:p>
+        </w:tc>
+      </w:tr>
+      <w:tr>
+        <w:trPr>
+          <w:cantSplit/>
+        </w:trPr>
+        <w:tc>
+          <w:tcPr>
+            <w:tcW w:type="dxa" w:w="1531"/>
+            <w:vAlign w:val="center"/>
+          </w:tcPr>
+          <w:p>
+            <w:pPr>
+              <w:pStyle w:val="Мойтекст"/>
+              <w:keepNext w:val="0"/>
+              <w:spacing w:before="80" w:after="80" w:line="240" w:lineRule="auto"/>
+              <w:ind w:firstLine="0" w:left="0"/>
+            </w:pPr>
+            <w:r>
+              <w:rPr>
+                <w:b w:val="0"/>
+                <w:sz w:val="18"/>
+              </w:rPr>
+              <w:t>450389VID</w:t>
+            </w:r>
+          </w:p>
+        </w:tc>
+        <w:tc>
+          <w:tcPr>
+            <w:tcW w:type="dxa" w:w="1871"/>
+            <w:vAlign w:val="center"/>
+          </w:tcPr>
+          <w:p>
+            <w:pPr>
+              <w:pStyle w:val="Мойтекст"/>
+              <w:keepNext w:val="0"/>
+              <w:spacing w:before="80" w:after="80" w:line="240" w:lineRule="auto"/>
+              <w:ind w:firstLine="0" w:left="0"/>
+            </w:pPr>
+            <w:r>
+              <w:rPr>
+                <w:b w:val="0"/>
+                <w:sz w:val="18"/>
+              </w:rPr>
+              <w:t>21 529 482</w:t>
+            </w:r>
+          </w:p>
+        </w:tc>
+        <w:tc>
+          <w:tcPr>
+            <w:tcW w:type="dxa" w:w="1871"/>
+            <w:vAlign w:val="center"/>
+          </w:tcPr>
+          <w:p>
+            <w:pPr>
+              <w:pStyle w:val="Мойтекст"/>
+              <w:keepNext w:val="0"/>
+              <w:spacing w:before="80" w:after="80" w:line="240" w:lineRule="auto"/>
+              <w:ind w:firstLine="0" w:left="0"/>
+            </w:pPr>
+            <w:r>
+              <w:rPr>
+                <w:b w:val="0"/>
+                <w:sz w:val="18"/>
+              </w:rPr>
+              <w:t>21 466 448</w:t>
+            </w:r>
+          </w:p>
+        </w:tc>
+        <w:tc>
+          <w:tcPr>
+            <w:tcW w:type="dxa" w:w="1814"/>
+            <w:vAlign w:val="center"/>
+          </w:tcPr>
+          <w:p>
+            <w:pPr>
+              <w:pStyle w:val="Мойтекст"/>
+              <w:keepNext w:val="0"/>
+              <w:spacing w:before="80" w:after="80" w:line="240" w:lineRule="auto"/>
+              <w:ind w:firstLine="0" w:left="0"/>
+            </w:pPr>
+            <w:r>
+              <w:rPr>
+                <w:b w:val="0"/>
+                <w:sz w:val="18"/>
+              </w:rPr>
+              <w:t>99,71</w:t>
+            </w:r>
+          </w:p>
+        </w:tc>
+        <w:tc>
+          <w:tcPr>
+            <w:tcW w:type="dxa" w:w="1701"/>
+            <w:vAlign w:val="center"/>
+          </w:tcPr>
+          <w:p>
+            <w:pPr>
+              <w:pStyle w:val="Мойтекст"/>
+              <w:keepNext w:val="0"/>
+              <w:spacing w:before="80" w:after="80" w:line="240" w:lineRule="auto"/>
+              <w:ind w:firstLine="0" w:left="0"/>
+            </w:pPr>
+            <w:r>
+              <w:rPr>
+                <w:b w:val="0"/>
+                <w:sz w:val="18"/>
+              </w:rPr>
+              <w:t>0,29</w:t>
+            </w:r>
+          </w:p>
+        </w:tc>
+      </w:tr>
+    </w:tbl>
+    <w:p>
+      <w:pPr>
+        <w:pStyle w:val="Мойтекст"/>
+        <w:spacing w:after="100"/>
+      </w:pPr>
+      <w:r>
+        <w:t>По сравнению с нормальным уровнем LZMA2 из задания 2 архив PIC стал на 6 байт больше, а VID — на 183 байта меньше. Для этих наборов максимальный уровень почти не улучшил результат. JPEG и MP4 уже используют сжатие; повторная упаковка даёт небольшой выигрыш.</w:t>
+      </w:r>
+    </w:p>
+    <w:tbl>
+      <w:tblPr>
+        <w:tblStyle w:val="TableGrid"/>
+        <w:tblW w:type="auto" w:w="0"/>
+        <w:jc w:val="center"/>
+        <w:tblLook w:firstColumn="1" w:firstRow="1" w:lastColumn="0" w:lastRow="0" w:noHBand="0" w:noVBand="1" w:val="04A0"/>
+      </w:tblPr>
+      <w:tblGrid>
+        <w:gridCol w:w="9355"/>
+      </w:tblGrid>
+      <w:tr>
+        <w:trPr>
+          <w:trHeight w:val="1984"/>
+        </w:trPr>
+        <w:tc>
+          <w:tcPr>
+            <w:tcW w:type="dxa" w:w="9355"/>
+            <w:vAlign w:val="center"/>
+          </w:tcPr>
+          <w:p>
+            <w:pPr>
+              <w:pStyle w:val="Мойтекст"/>
+              <w:keepNext/>
+              <w:ind w:firstLine="0"/>
+              <w:jc w:val="center"/>
+            </w:pPr>
+            <w:r>
+              <w:rPr>
+                <w:i/>
+              </w:rPr>
+              <w:t>[Место для скриншота: Команда и результат максимального сжатия 450389PIC в CMD]</w:t>
+            </w:r>
+          </w:p>
+        </w:tc>
+      </w:tr>
+    </w:tbl>
+    <w:p>
+      <w:pPr>
+        <w:pStyle w:val="Мояподпись"/>
+        <w:spacing w:after="140"/>
+      </w:pPr>
+      <w:r>
+        <w:t>Скриншот 9 — Команда и результат максимального сжатия 450389PIC в CMD</w:t>
+      </w:r>
+    </w:p>
+    <w:tbl>
+      <w:tblPr>
+        <w:tblStyle w:val="TableGrid"/>
+        <w:tblW w:type="auto" w:w="0"/>
+        <w:jc w:val="center"/>
+        <w:tblLook w:firstColumn="1" w:firstRow="1" w:lastColumn="0" w:lastRow="0" w:noHBand="0" w:noVBand="1" w:val="04A0"/>
+      </w:tblPr>
+      <w:tblGrid>
+        <w:gridCol w:w="9355"/>
+      </w:tblGrid>
+      <w:tr>
+        <w:trPr>
+          <w:trHeight w:val="1984"/>
+        </w:trPr>
+        <w:tc>
+          <w:tcPr>
+            <w:tcW w:type="dxa" w:w="9355"/>
+            <w:vAlign w:val="center"/>
+          </w:tcPr>
+          <w:p>
+            <w:pPr>
+              <w:pStyle w:val="Мойтекст"/>
+              <w:keepNext/>
+              <w:ind w:firstLine="0"/>
+              <w:jc w:val="center"/>
+            </w:pPr>
+            <w:r>
+              <w:rPr>
+                <w:i/>
+              </w:rPr>
+              <w:t>[Место для скриншота: Команда и результат максимального сжатия 450389VID в CMD]</w:t>
+            </w:r>
+          </w:p>
+        </w:tc>
+      </w:tr>
+    </w:tbl>
+    <w:p>
+      <w:pPr>
+        <w:pStyle w:val="Мояподпись"/>
+        <w:spacing w:after="140"/>
+      </w:pPr>
+      <w:r>
+        <w:t>Скриншот 10 — Команда и результат максимального сжатия 450389VID в CMD</w:t>
+      </w:r>
+    </w:p>
+    <w:tbl>
+      <w:tblPr>
+        <w:tblStyle w:val="TableGrid"/>
+        <w:tblW w:type="auto" w:w="0"/>
+        <w:jc w:val="center"/>
+        <w:tblLook w:firstColumn="1" w:firstRow="1" w:lastColumn="0" w:lastRow="0" w:noHBand="0" w:noVBand="1" w:val="04A0"/>
+      </w:tblPr>
+      <w:tblGrid>
+        <w:gridCol w:w="9355"/>
+      </w:tblGrid>
+      <w:tr>
+        <w:trPr>
+          <w:trHeight w:val="1984"/>
+        </w:trPr>
+        <w:tc>
+          <w:tcPr>
+            <w:tcW w:type="dxa" w:w="9355"/>
+            <w:vAlign w:val="center"/>
+          </w:tcPr>
+          <w:p>
+            <w:pPr>
+              <w:pStyle w:val="Мойтекст"/>
+              <w:keepNext/>
+              <w:ind w:firstLine="0"/>
+              <w:jc w:val="center"/>
+            </w:pPr>
+            <w:r>
+              <w:rPr>
+                <w:i/>
+              </w:rPr>
+              <w:t>[Место для скриншота: Архивы 450389PIC_max.7z и 450389VID_max.7z в FAR, режим «Детальный»]</w:t>
+            </w:r>
+          </w:p>
+        </w:tc>
+      </w:tr>
+    </w:tbl>
+    <w:p>
+      <w:pPr>
+        <w:pStyle w:val="Мояподпись"/>
+        <w:spacing w:after="140"/>
+      </w:pPr>
+      <w:r>
+        <w:t>Скриншот 11 — Архивы 450389PIC_max.7z и 450389VID_max.7z в FAR, режим «Детальный»</w:t>
+      </w:r>
+    </w:p>
+    <w:p>
+      <w:bookmarkStart w:id="811" w:name="lab3_11"/>
+      <w:pPr>
+        <w:pStyle w:val="Heading1"/>
+        <w:pageBreakBefore/>
+      </w:pPr>
+      <w:r>
+        <w:t>Задание 5. Solid- и SFX-архивы</w:t>
+      </w:r>
+      <w:bookmarkEnd w:id="811"/>
+    </w:p>
+    <w:p>
+      <w:pPr>
+        <w:pStyle w:val="Мойтекст"/>
+        <w:spacing w:after="100"/>
+      </w:pPr>
+      <w:r>
+        <w:t>Для каталога 450389SMALL созданы три архива с LZMA2 на нормальном уровне: непрерывный Solid, обычный без Solid и самораспаковывающийся SFX без Solid. Для сопоставимости SFX и обычного архива в обоих случаях непрерывное сжатие отключено. Использованы следующие команды из родительского каталога.</w:t>
+      </w:r>
+    </w:p>
+    <w:p>
+      <w:pPr>
+        <w:pStyle w:val="Мойтекст"/>
+        <w:spacing w:before="80" w:after="100"/>
+        <w:ind w:firstLine="0" w:left="0"/>
+      </w:pPr>
+      <w:r>
+        <w:rPr>
+          <w:rFonts w:ascii="Courier New" w:hAnsi="Courier New"/>
+          <w:sz w:val="16"/>
+        </w:rPr>
+        <w:t>"C:\Program Files\7-Zip\7z.exe" a -t7z -m0=LZMA2 -mx=5 -ms=on "450389SMALL_solid.7z" ".\450389SMALL\"</w:t>
+      </w:r>
+    </w:p>
+    <w:p>
+      <w:pPr>
+        <w:pStyle w:val="Мойтекст"/>
+        <w:spacing w:before="80" w:after="100"/>
+        <w:ind w:firstLine="0" w:left="0"/>
+      </w:pPr>
+      <w:r>
+        <w:rPr>
+          <w:rFonts w:ascii="Courier New" w:hAnsi="Courier New"/>
+          <w:sz w:val="16"/>
+        </w:rPr>
+        <w:t>"C:\Program Files\7-Zip\7z.exe" a -t7z -m0=LZMA2 -mx=5 -ms=off "450389SMALL обычный.7z" ".\450389SMALL\"</w:t>
+      </w:r>
+    </w:p>
+    <w:p>
+      <w:pPr>
+        <w:pStyle w:val="Мойтекст"/>
+        <w:spacing w:before="80" w:after="100"/>
+        <w:ind w:firstLine="0" w:left="0"/>
+      </w:pPr>
+      <w:r>
+        <w:rPr>
+          <w:rFonts w:ascii="Courier New" w:hAnsi="Courier New"/>
+          <w:sz w:val="16"/>
+        </w:rPr>
+        <w:t>"C:\Program Files\7-Zip\7z.exe" a -t7z -m0=LZMA2 -mx=5 -ms=off -sfx "450389SMALL_sfx.exe" ".\450389SMALL\"</w:t>
+      </w:r>
+    </w:p>
+    <w:tbl>
+      <w:tblPr>
+        <w:tblStyle w:val="TableGrid"/>
+        <w:tblW w:type="auto" w:w="0"/>
+        <w:jc w:val="center"/>
+        <w:tblLayout w:type="fixed"/>
+        <w:tblLook w:firstColumn="1" w:firstRow="1" w:lastColumn="0" w:lastRow="0" w:noHBand="0" w:noVBand="1" w:val="04A0"/>
+      </w:tblPr>
+      <w:tblGrid>
+        <w:gridCol w:w="2608"/>
+        <w:gridCol w:w="2211"/>
+        <w:gridCol w:w="1984"/>
+        <w:gridCol w:w="1984"/>
+      </w:tblGrid>
+      <w:tr>
+        <w:trPr>
+          <w:cantSplit/>
+          <w:tblHeader/>
+        </w:trPr>
+        <w:tc>
+          <w:tcPr>
+            <w:tcW w:type="dxa" w:w="2608"/>
+            <w:vAlign w:val="center"/>
+            <w:shd w:fill="E8EEF5"/>
+          </w:tcPr>
+          <w:p>
+            <w:pPr>
+              <w:pStyle w:val="Мойтекст"/>
+              <w:keepNext/>
+              <w:spacing w:before="80" w:after="80" w:line="240" w:lineRule="auto"/>
+              <w:ind w:firstLine="0" w:left="0"/>
+            </w:pPr>
+            <w:r>
+              <w:rPr>
+                <w:b/>
+                <w:sz w:val="18"/>
+              </w:rPr>
+              <w:t>Тип архива</w:t>
+            </w:r>
+          </w:p>
+        </w:tc>
+        <w:tc>
+          <w:tcPr>
+            <w:tcW w:type="dxa" w:w="2211"/>
+            <w:vAlign w:val="center"/>
+            <w:shd w:fill="E8EEF5"/>
+          </w:tcPr>
+          <w:p>
+            <w:pPr>
+              <w:pStyle w:val="Мойтекст"/>
+              <w:keepNext/>
+              <w:spacing w:before="80" w:after="80" w:line="240" w:lineRule="auto"/>
+              <w:ind w:firstLine="0" w:left="0"/>
+            </w:pPr>
+            <w:r>
+              <w:rPr>
+                <w:b/>
+                <w:sz w:val="18"/>
+              </w:rPr>
+              <w:t>Размер, байт</w:t>
+            </w:r>
+          </w:p>
+        </w:tc>
+        <w:tc>
+          <w:tcPr>
+            <w:tcW w:type="dxa" w:w="1984"/>
+            <w:vAlign w:val="center"/>
+            <w:shd w:fill="E8EEF5"/>
+          </w:tcPr>
+          <w:p>
+            <w:pPr>
+              <w:pStyle w:val="Мойтекст"/>
+              <w:keepNext/>
+              <w:spacing w:before="80" w:after="80" w:line="240" w:lineRule="auto"/>
+              <w:ind w:firstLine="0" w:left="0"/>
+            </w:pPr>
+            <w:r>
+              <w:rPr>
+                <w:b/>
+                <w:sz w:val="18"/>
+              </w:rPr>
+              <w:t>Размер, КБ</w:t>
+            </w:r>
+          </w:p>
+        </w:tc>
+        <w:tc>
+          <w:tcPr>
+            <w:tcW w:type="dxa" w:w="1984"/>
+            <w:vAlign w:val="center"/>
+            <w:shd w:fill="E8EEF5"/>
+          </w:tcPr>
+          <w:p>
+            <w:pPr>
+              <w:pStyle w:val="Мойтекст"/>
+              <w:keepNext/>
+              <w:spacing w:before="80" w:after="80" w:line="240" w:lineRule="auto"/>
+              <w:ind w:firstLine="0" w:left="0"/>
+            </w:pPr>
+            <w:r>
+              <w:rPr>
+                <w:b/>
+                <w:sz w:val="18"/>
+              </w:rPr>
+              <w:t>Архив / оригинал, %</w:t>
+            </w:r>
+          </w:p>
+        </w:tc>
+      </w:tr>
+      <w:tr>
+        <w:trPr>
+          <w:cantSplit/>
+        </w:trPr>
+        <w:tc>
+          <w:tcPr>
+            <w:tcW w:type="dxa" w:w="2608"/>
+            <w:vAlign w:val="center"/>
+          </w:tcPr>
+          <w:p>
+            <w:pPr>
+              <w:pStyle w:val="Мойтекст"/>
+              <w:keepNext w:val="0"/>
+              <w:spacing w:before="80" w:after="80" w:line="240" w:lineRule="auto"/>
+              <w:ind w:firstLine="0" w:left="0"/>
+            </w:pPr>
+            <w:r>
+              <w:rPr>
+                <w:b w:val="0"/>
+                <w:sz w:val="18"/>
+              </w:rPr>
+              <w:t>Обычный, без Solid</w:t>
+            </w:r>
+          </w:p>
+        </w:tc>
+        <w:tc>
+          <w:tcPr>
+            <w:tcW w:type="dxa" w:w="2211"/>
+            <w:vAlign w:val="center"/>
+          </w:tcPr>
+          <w:p>
+            <w:pPr>
+              <w:pStyle w:val="Мойтекст"/>
+              <w:keepNext w:val="0"/>
+              <w:spacing w:before="80" w:after="80" w:line="240" w:lineRule="auto"/>
+              <w:ind w:firstLine="0" w:left="0"/>
+            </w:pPr>
+            <w:r>
+              <w:rPr>
+                <w:b w:val="0"/>
+                <w:sz w:val="18"/>
+              </w:rPr>
+              <w:t>8 600 582</w:t>
+            </w:r>
+          </w:p>
+        </w:tc>
+        <w:tc>
+          <w:tcPr>
+            <w:tcW w:type="dxa" w:w="1984"/>
+            <w:vAlign w:val="center"/>
+          </w:tcPr>
+          <w:p>
+            <w:pPr>
+              <w:pStyle w:val="Мойтекст"/>
+              <w:keepNext w:val="0"/>
+              <w:spacing w:before="80" w:after="80" w:line="240" w:lineRule="auto"/>
+              <w:ind w:firstLine="0" w:left="0"/>
+            </w:pPr>
+            <w:r>
+              <w:rPr>
+                <w:b w:val="0"/>
+                <w:sz w:val="18"/>
+              </w:rPr>
+              <w:t>8 399,01</w:t>
+            </w:r>
+          </w:p>
+        </w:tc>
+        <w:tc>
+          <w:tcPr>
+            <w:tcW w:type="dxa" w:w="1984"/>
+            <w:vAlign w:val="center"/>
+          </w:tcPr>
+          <w:p>
+            <w:pPr>
+              <w:pStyle w:val="Мойтекст"/>
+              <w:keepNext w:val="0"/>
+              <w:spacing w:before="80" w:after="80" w:line="240" w:lineRule="auto"/>
+              <w:ind w:firstLine="0" w:left="0"/>
+            </w:pPr>
+            <w:r>
+              <w:rPr>
+                <w:b w:val="0"/>
+                <w:sz w:val="18"/>
+              </w:rPr>
+              <w:t>61,07</w:t>
+            </w:r>
+          </w:p>
+        </w:tc>
+      </w:tr>
+      <w:tr>
+        <w:trPr>
+          <w:cantSplit/>
+        </w:trPr>
+        <w:tc>
+          <w:tcPr>
+            <w:tcW w:type="dxa" w:w="2608"/>
+            <w:vAlign w:val="center"/>
+          </w:tcPr>
+          <w:p>
+            <w:pPr>
+              <w:pStyle w:val="Мойтекст"/>
+              <w:keepNext w:val="0"/>
+              <w:spacing w:before="80" w:after="80" w:line="240" w:lineRule="auto"/>
+              <w:ind w:firstLine="0" w:left="0"/>
+            </w:pPr>
+            <w:r>
+              <w:rPr>
+                <w:b w:val="0"/>
+                <w:sz w:val="18"/>
+              </w:rPr>
+              <w:t>SFX, без Solid</w:t>
+            </w:r>
+          </w:p>
+        </w:tc>
+        <w:tc>
+          <w:tcPr>
+            <w:tcW w:type="dxa" w:w="2211"/>
+            <w:vAlign w:val="center"/>
+          </w:tcPr>
+          <w:p>
+            <w:pPr>
+              <w:pStyle w:val="Мойтекст"/>
+              <w:keepNext w:val="0"/>
+              <w:spacing w:before="80" w:after="80" w:line="240" w:lineRule="auto"/>
+              <w:ind w:firstLine="0" w:left="0"/>
+            </w:pPr>
+            <w:r>
+              <w:rPr>
+                <w:b w:val="0"/>
+                <w:sz w:val="18"/>
+              </w:rPr>
+              <w:t>8 795 142</w:t>
+            </w:r>
+          </w:p>
+        </w:tc>
+        <w:tc>
+          <w:tcPr>
+            <w:tcW w:type="dxa" w:w="1984"/>
+            <w:vAlign w:val="center"/>
+          </w:tcPr>
+          <w:p>
+            <w:pPr>
+              <w:pStyle w:val="Мойтекст"/>
+              <w:keepNext w:val="0"/>
+              <w:spacing w:before="80" w:after="80" w:line="240" w:lineRule="auto"/>
+              <w:ind w:firstLine="0" w:left="0"/>
+            </w:pPr>
+            <w:r>
+              <w:rPr>
+                <w:b w:val="0"/>
+                <w:sz w:val="18"/>
+              </w:rPr>
+              <w:t>8 589,01</w:t>
+            </w:r>
+          </w:p>
+        </w:tc>
+        <w:tc>
+          <w:tcPr>
+            <w:tcW w:type="dxa" w:w="1984"/>
+            <w:vAlign w:val="center"/>
+          </w:tcPr>
+          <w:p>
+            <w:pPr>
+              <w:pStyle w:val="Мойтекст"/>
+              <w:keepNext w:val="0"/>
+              <w:spacing w:before="80" w:after="80" w:line="240" w:lineRule="auto"/>
+              <w:ind w:firstLine="0" w:left="0"/>
+            </w:pPr>
+            <w:r>
+              <w:rPr>
+                <w:b w:val="0"/>
+                <w:sz w:val="18"/>
+              </w:rPr>
+              <w:t>62,45</w:t>
+            </w:r>
+          </w:p>
+        </w:tc>
+      </w:tr>
+      <w:tr>
+        <w:trPr>
+          <w:cantSplit/>
+        </w:trPr>
+        <w:tc>
+          <w:tcPr>
+            <w:tcW w:type="dxa" w:w="2608"/>
+            <w:vAlign w:val="center"/>
+          </w:tcPr>
+          <w:p>
+            <w:pPr>
+              <w:pStyle w:val="Мойтекст"/>
+              <w:keepNext w:val="0"/>
+              <w:spacing w:before="80" w:after="80" w:line="240" w:lineRule="auto"/>
+              <w:ind w:firstLine="0" w:left="0"/>
+            </w:pPr>
+            <w:r>
+              <w:rPr>
+                <w:b w:val="0"/>
+                <w:sz w:val="18"/>
+              </w:rPr>
+              <w:t>Solid</w:t>
+            </w:r>
+          </w:p>
+        </w:tc>
+        <w:tc>
+          <w:tcPr>
+            <w:tcW w:type="dxa" w:w="2211"/>
+            <w:vAlign w:val="center"/>
+          </w:tcPr>
+          <w:p>
+            <w:pPr>
+              <w:pStyle w:val="Мойтекст"/>
+              <w:keepNext w:val="0"/>
+              <w:spacing w:before="80" w:after="80" w:line="240" w:lineRule="auto"/>
+              <w:ind w:firstLine="0" w:left="0"/>
+            </w:pPr>
+            <w:r>
+              <w:rPr>
+                <w:b w:val="0"/>
+                <w:sz w:val="18"/>
+              </w:rPr>
+              <w:t>1 508 589</w:t>
+            </w:r>
+          </w:p>
+        </w:tc>
+        <w:tc>
+          <w:tcPr>
+            <w:tcW w:type="dxa" w:w="1984"/>
+            <w:vAlign w:val="center"/>
+          </w:tcPr>
+          <w:p>
+            <w:pPr>
+              <w:pStyle w:val="Мойтекст"/>
+              <w:keepNext w:val="0"/>
+              <w:spacing w:before="80" w:after="80" w:line="240" w:lineRule="auto"/>
+              <w:ind w:firstLine="0" w:left="0"/>
+            </w:pPr>
+            <w:r>
+              <w:rPr>
+                <w:b w:val="0"/>
+                <w:sz w:val="18"/>
+              </w:rPr>
+              <w:t>1 473,23</w:t>
+            </w:r>
+          </w:p>
+        </w:tc>
+        <w:tc>
+          <w:tcPr>
+            <w:tcW w:type="dxa" w:w="1984"/>
+            <w:vAlign w:val="center"/>
+          </w:tcPr>
+          <w:p>
+            <w:pPr>
+              <w:pStyle w:val="Мойтекст"/>
+              <w:keepNext w:val="0"/>
+              <w:spacing w:before="80" w:after="80" w:line="240" w:lineRule="auto"/>
+              <w:ind w:firstLine="0" w:left="0"/>
+            </w:pPr>
+            <w:r>
+              <w:rPr>
+                <w:b w:val="0"/>
+                <w:sz w:val="18"/>
+              </w:rPr>
+              <w:t>10,71</w:t>
+            </w:r>
+          </w:p>
+        </w:tc>
+      </w:tr>
+    </w:tbl>
+    <w:p>
+      <w:pPr>
+        <w:pStyle w:val="Мойтекст"/>
+        <w:spacing w:after="100"/>
+      </w:pPr>
+      <w:r>
+        <w:t>Solid-архив — самый маленький: 1 508 589 байт. При непрерывном сжатии общие фрагменты разных файлов могут использоваться совместно. Обычный архив сжимает файлы независимо, поэтому для этого набора его размер значительно больше.</w:t>
+      </w:r>
+    </w:p>
+    <w:p>
+      <w:pPr>
+        <w:pStyle w:val="Мойтекст"/>
+        <w:spacing w:after="100"/>
+      </w:pPr>
+      <w:r>
+        <w:t>SFX больше обычного архива на 194 560 байт, или 190 КБ. Разница соответствует добавленному модулю самораспаковки. Преимущество SFX — извлечение файлов без установленного архиватора. Недостатки — дополнительный размер и зависимость исполняемого модуля от платформы: созданный .exe предназначен для Windows.</w:t>
+      </w:r>
+    </w:p>
+    <w:p>
+      <w:pPr>
+        <w:pStyle w:val="Мойтекст"/>
+        <w:spacing w:after="100"/>
+      </w:pPr>
+      <w:r>
+        <w:t>Преимущество Solid — лучшее сжатие набора похожих файлов. Главный недостаток — для извлечения отдельного файла может потребоваться обработать предшествующие данные внутри блока; изменение содержимого также может потребовать повторного сжатия блока. Обычный архив удобнее для независимого доступа к отдельным файлам.</w:t>
+      </w:r>
+    </w:p>
+    <w:tbl>
+      <w:tblPr>
+        <w:tblStyle w:val="TableGrid"/>
+        <w:tblW w:type="auto" w:w="0"/>
+        <w:jc w:val="center"/>
+        <w:tblLook w:firstColumn="1" w:firstRow="1" w:lastColumn="0" w:lastRow="0" w:noHBand="0" w:noVBand="1" w:val="04A0"/>
+      </w:tblPr>
+      <w:tblGrid>
+        <w:gridCol w:w="9355"/>
+      </w:tblGrid>
+      <w:tr>
+        <w:trPr>
+          <w:trHeight w:val="1417"/>
+        </w:trPr>
+        <w:tc>
+          <w:tcPr>
+            <w:tcW w:type="dxa" w:w="9355"/>
+            <w:vAlign w:val="center"/>
+          </w:tcPr>
+          <w:p>
+            <w:pPr>
+              <w:pStyle w:val="Мойтекст"/>
+              <w:keepNext/>
+              <w:ind w:firstLine="0"/>
+              <w:jc w:val="center"/>
+            </w:pPr>
+            <w:r>
+              <w:rPr>
+                <w:i/>
+              </w:rPr>
+              <w:t>[Место для скриншота: Создание Solid-архива: команда и результат в CMD]</w:t>
+            </w:r>
+          </w:p>
+        </w:tc>
+      </w:tr>
+    </w:tbl>
+    <w:p>
+      <w:pPr>
+        <w:pStyle w:val="Мояподпись"/>
+        <w:spacing w:after="140"/>
+      </w:pPr>
+      <w:r>
+        <w:t>Скриншот 12 — Создание Solid-архива: команда и результат в CMD</w:t>
+      </w:r>
+    </w:p>
+    <w:tbl>
+      <w:tblPr>
+        <w:tblStyle w:val="TableGrid"/>
+        <w:tblW w:type="auto" w:w="0"/>
+        <w:jc w:val="center"/>
+        <w:tblLook w:firstColumn="1" w:firstRow="1" w:lastColumn="0" w:lastRow="0" w:noHBand="0" w:noVBand="1" w:val="04A0"/>
+      </w:tblPr>
+      <w:tblGrid>
+        <w:gridCol w:w="9355"/>
+      </w:tblGrid>
+      <w:tr>
+        <w:trPr>
+          <w:trHeight w:val="1417"/>
+        </w:trPr>
+        <w:tc>
+          <w:tcPr>
+            <w:tcW w:type="dxa" w:w="9355"/>
+            <w:vAlign w:val="center"/>
+          </w:tcPr>
+          <w:p>
+            <w:pPr>
+              <w:pStyle w:val="Мойтекст"/>
+              <w:keepNext/>
+              <w:ind w:firstLine="0"/>
+              <w:jc w:val="center"/>
+            </w:pPr>
+            <w:r>
+              <w:rPr>
+                <w:i/>
+              </w:rPr>
+              <w:t>[Место для скриншота: Создание обычного архива: команда и результат в CMD]</w:t>
+            </w:r>
+          </w:p>
+        </w:tc>
+      </w:tr>
+    </w:tbl>
+    <w:p>
+      <w:pPr>
+        <w:pStyle w:val="Мояподпись"/>
+        <w:spacing w:after="140"/>
+      </w:pPr>
+      <w:r>
+        <w:t>Скриншот 13 — Создание обычного архива: команда и результат в CMD</w:t>
+      </w:r>
+    </w:p>
+    <w:tbl>
+      <w:tblPr>
+        <w:tblStyle w:val="TableGrid"/>
+        <w:tblW w:type="auto" w:w="0"/>
+        <w:jc w:val="center"/>
+        <w:tblLook w:firstColumn="1" w:firstRow="1" w:lastColumn="0" w:lastRow="0" w:noHBand="0" w:noVBand="1" w:val="04A0"/>
+      </w:tblPr>
+      <w:tblGrid>
+        <w:gridCol w:w="9355"/>
+      </w:tblGrid>
+      <w:tr>
+        <w:trPr>
+          <w:trHeight w:val="1417"/>
+        </w:trPr>
+        <w:tc>
+          <w:tcPr>
+            <w:tcW w:type="dxa" w:w="9355"/>
+            <w:vAlign w:val="center"/>
+          </w:tcPr>
+          <w:p>
+            <w:pPr>
+              <w:pStyle w:val="Мойтекст"/>
+              <w:keepNext/>
+              <w:ind w:firstLine="0"/>
+              <w:jc w:val="center"/>
+            </w:pPr>
+            <w:r>
+              <w:rPr>
+                <w:i/>
+              </w:rPr>
+              <w:t>[Место для скриншота: Создание SFX-архива: команда и результат в CMD]</w:t>
+            </w:r>
+          </w:p>
+        </w:tc>
+      </w:tr>
+    </w:tbl>
+    <w:p>
+      <w:pPr>
+        <w:pStyle w:val="Мояподпись"/>
+        <w:spacing w:after="140"/>
+      </w:pPr>
+      <w:r>
+        <w:t>Скриншот 14 — Создание SFX-архива: команда и результат в CMD</w:t>
+      </w:r>
+    </w:p>
+    <w:tbl>
+      <w:tblPr>
+        <w:tblStyle w:val="TableGrid"/>
+        <w:tblW w:type="auto" w:w="0"/>
+        <w:jc w:val="center"/>
+        <w:tblLook w:firstColumn="1" w:firstRow="1" w:lastColumn="0" w:lastRow="0" w:noHBand="0" w:noVBand="1" w:val="04A0"/>
+      </w:tblPr>
+      <w:tblGrid>
+        <w:gridCol w:w="9355"/>
+      </w:tblGrid>
+      <w:tr>
+        <w:trPr>
+          <w:trHeight w:val="1417"/>
+        </w:trPr>
+        <w:tc>
+          <w:tcPr>
+            <w:tcW w:type="dxa" w:w="9355"/>
+            <w:vAlign w:val="center"/>
+          </w:tcPr>
+          <w:p>
+            <w:pPr>
+              <w:pStyle w:val="Мойтекст"/>
+              <w:keepNext/>
+              <w:ind w:firstLine="0"/>
+              <w:jc w:val="center"/>
+            </w:pPr>
+            <w:r>
+              <w:rPr>
+                <w:i/>
+              </w:rPr>
+              <w:t>[Место для скриншота: Все три архива SMALL в FAR, режим «Детальный»]</w:t>
+            </w:r>
+          </w:p>
+        </w:tc>
+      </w:tr>
+    </w:tbl>
+    <w:p>
+      <w:pPr>
+        <w:pStyle w:val="Мояподпись"/>
+        <w:spacing w:after="140"/>
+      </w:pPr>
+      <w:r>
+        <w:t>Скриншот 15 — Все три архива SMALL в FAR, режим «Детальный»</w:t>
+      </w:r>
+    </w:p>
+    <w:p>
+      <w:bookmarkStart w:id="812" w:name="lab3_12"/>
+      <w:pPr>
+        <w:pStyle w:val="Heading1"/>
+        <w:pageBreakBefore/>
+      </w:pPr>
+      <w:r>
+        <w:t>Задание 6. Ручное сжатие RLE и Хаффмана</w:t>
+      </w:r>
+      <w:bookmarkEnd w:id="812"/>
+    </w:p>
+    <w:p>
+      <w:pPr>
+        <w:pStyle w:val="Мойтекст"/>
+        <w:spacing w:after="100"/>
+      </w:pPr>
+      <w:r>
+        <w:t>Исходная строка: «Садовщикова София Ивановна». В ней 26 символов, включая два пробела. Регистр учитывается: И и и, С и с являются разными символами. Для учебного расчёта принят однобайтовый исходный текст в Windows-1251 без служебных заголовков: 26 × 8 = 208 бит, или 26 байт.</w:t>
+      </w:r>
+    </w:p>
+    <w:p>
+      <w:bookmarkStart w:id="813" w:name="lab3_13"/>
+      <w:pPr>
+        <w:pStyle w:val="Heading2"/>
+      </w:pPr>
+      <w:r>
+        <w:t>6.1. Кодирование RLE</w:t>
+      </w:r>
+      <w:bookmarkEnd w:id="813"/>
+    </w:p>
+    <w:p>
+      <w:pPr>
+        <w:pStyle w:val="Мойтекст"/>
+        <w:spacing w:after="100"/>
+      </w:pPr>
+      <w:r>
+        <w:t>RLE заменяет последовательность одинаковых подряд символов парой «символ — число повторений». В данном ФИО соседних одинаковых символов нет, поэтому получаются 26 серий длины 1. Обозначение ␠ ниже соответствует одному обычному пробелу, а не дополнительному символу исходной строки.</w:t>
+      </w:r>
+    </w:p>
+    <w:p>
+      <w:pPr>
+        <w:pStyle w:val="Мойтекст"/>
+        <w:spacing w:before="80" w:after="100"/>
+        <w:ind w:firstLine="0" w:left="0"/>
+      </w:pPr>
+      <w:r>
+        <w:rPr>
+          <w:rFonts w:ascii="Courier New" w:hAnsi="Courier New"/>
+          <w:sz w:val="16"/>
+        </w:rPr>
+        <w:t>С1а1д1о1в1щ1и1к1о1в1а1␠1С1о1ф1и1я1␠1И1в1а1н1о1в1н1а1</w:t>
+      </w:r>
+    </w:p>
+    <w:p>
+      <w:pPr>
+        <w:pStyle w:val="Мойтекст"/>
+        <w:spacing w:after="100"/>
+      </w:pPr>
+      <w:r>
+        <w:t>В выбранном представлении символ и счётчик занимают по одному байту. Объём результата: 26 × (1 + 1) = 52 байта, или 416 бит. Коэффициент: 52 / 26 × 100 % = 200 %. Вместо сжатия произошло увеличение объёма вдвое. Это вывод для указанного формата RLE; другие реализации могут отдельно обрабатывать одиночные символы.</w:t>
+      </w:r>
+    </w:p>
+    <w:p>
+      <w:bookmarkStart w:id="814" w:name="lab3_14"/>
+      <w:pPr>
+        <w:pStyle w:val="Heading2"/>
+      </w:pPr>
+      <w:r>
+        <w:t>6.2. Кодирование Хаффмана</w:t>
+      </w:r>
+      <w:bookmarkEnd w:id="814"/>
+    </w:p>
+    <w:p>
+      <w:pPr>
+        <w:pStyle w:val="Мойтекст"/>
+        <w:spacing w:after="100"/>
+      </w:pPr>
+      <w:r>
+        <w:t>Сначала подсчитаны частоты всех символов. Для построения дерева на каждом шаге объединяются два узла с наименьшими частотами. При равных частотах возможны разные, одинаково эффективные деревья. Ниже приведён один допустимый порядок объединений:</w:t>
+      </w:r>
+    </w:p>
+    <w:p>
+      <w:pPr>
+        <w:pStyle w:val="Мойтекст"/>
+        <w:spacing w:before="80" w:after="100"/>
+        <w:ind w:firstLine="0" w:left="0"/>
+      </w:pPr>
+      <w:r>
+        <w:rPr>
+          <w:rFonts w:ascii="Courier New" w:hAnsi="Courier New"/>
+          <w:sz w:val="16"/>
+        </w:rPr>
+        <w:t>А = И(1) + д(1) = 2</w:t>
+        <w:br/>
+        <w:t>Б = к(1) + ф(1) = 2</w:t>
+        <w:br/>
+        <w:t>В = щ(1) + я(1) = 2</w:t>
+        <w:br/>
+        <w:t>Г = пробел(2) + С(2) = 4</w:t>
+        <w:br/>
+        <w:t>Д = и(2) + н(2) = 4</w:t>
+        <w:br/>
+        <w:t>Е = А(2) + Б(2) = 4</w:t>
+        <w:br/>
+        <w:t>Ж = В(2) + а(4) = 6</w:t>
+        <w:br/>
+        <w:t>З = в(4) + о(4) = 8</w:t>
+        <w:br/>
+        <w:t>К = Г(4) + Д(4) = 8</w:t>
+        <w:br/>
+        <w:t>Л = Е(4) + Ж(6) = 10</w:t>
+        <w:br/>
+        <w:t>М = З(8) + К(8) = 16</w:t>
+        <w:br/>
+        <w:t>Корень = Л(10) + М(16) = 26</w:t>
+      </w:r>
+    </w:p>
+    <w:p>
+      <w:pPr>
+        <w:pStyle w:val="Мойтекст"/>
+        <w:spacing w:after="100"/>
+      </w:pPr>
+      <w:r>
+        <w:t>Левой ветви назначен 0, правой — 1. Путь от корня до символа задаёт его код. Более частые символы а, в и о получили трёхбитовые коды, остальные — четырёхбитовые.</w:t>
+      </w:r>
+    </w:p>
+    <w:tbl>
+      <w:tblPr>
+        <w:tblStyle w:val="TableGrid"/>
+        <w:tblW w:type="auto" w:w="0"/>
+        <w:jc w:val="center"/>
+        <w:tblLayout w:type="fixed"/>
+        <w:tblLook w:firstColumn="1" w:firstRow="1" w:lastColumn="0" w:lastRow="0" w:noHBand="0" w:noVBand="1" w:val="04A0"/>
+      </w:tblPr>
+      <w:tblGrid>
+        <w:gridCol w:w="1531"/>
+        <w:gridCol w:w="1531"/>
+        <w:gridCol w:w="1984"/>
+        <w:gridCol w:w="1871"/>
+        <w:gridCol w:w="1871"/>
+      </w:tblGrid>
+      <w:tr>
+        <w:trPr>
+          <w:cantSplit/>
+          <w:tblHeader/>
+        </w:trPr>
+        <w:tc>
+          <w:tcPr>
+            <w:tcW w:type="dxa" w:w="1531"/>
+            <w:vAlign w:val="center"/>
+            <w:shd w:fill="E8EEF5"/>
+          </w:tcPr>
+          <w:p>
+            <w:pPr>
+              <w:pStyle w:val="Мойтекст"/>
+              <w:keepNext/>
+              <w:spacing w:before="80" w:after="80" w:line="240" w:lineRule="auto"/>
+              <w:ind w:firstLine="0" w:left="0"/>
+            </w:pPr>
+            <w:r>
+              <w:rPr>
+                <w:b/>
+                <w:sz w:val="18"/>
+              </w:rPr>
+              <w:t>Символ</w:t>
+            </w:r>
+          </w:p>
+        </w:tc>
+        <w:tc>
+          <w:tcPr>
+            <w:tcW w:type="dxa" w:w="1531"/>
+            <w:vAlign w:val="center"/>
+            <w:shd w:fill="E8EEF5"/>
+          </w:tcPr>
+          <w:p>
+            <w:pPr>
+              <w:pStyle w:val="Мойтекст"/>
+              <w:keepNext/>
+              <w:spacing w:before="80" w:after="80" w:line="240" w:lineRule="auto"/>
+              <w:ind w:firstLine="0" w:left="0"/>
+            </w:pPr>
+            <w:r>
+              <w:rPr>
+                <w:b/>
+                <w:sz w:val="18"/>
+              </w:rPr>
+              <w:t>Частота</w:t>
+            </w:r>
+          </w:p>
+        </w:tc>
+        <w:tc>
+          <w:tcPr>
+            <w:tcW w:type="dxa" w:w="1984"/>
+            <w:vAlign w:val="center"/>
+            <w:shd w:fill="E8EEF5"/>
+          </w:tcPr>
+          <w:p>
+            <w:pPr>
+              <w:pStyle w:val="Мойтекст"/>
+              <w:keepNext/>
+              <w:spacing w:before="80" w:after="80" w:line="240" w:lineRule="auto"/>
+              <w:ind w:firstLine="0" w:left="0"/>
+            </w:pPr>
+            <w:r>
+              <w:rPr>
+                <w:b/>
+                <w:sz w:val="18"/>
+              </w:rPr>
+              <w:t>Код</w:t>
+            </w:r>
+          </w:p>
+        </w:tc>
+        <w:tc>
+          <w:tcPr>
+            <w:tcW w:type="dxa" w:w="1871"/>
+            <w:vAlign w:val="center"/>
+            <w:shd w:fill="E8EEF5"/>
+          </w:tcPr>
+          <w:p>
+            <w:pPr>
+              <w:pStyle w:val="Мойтекст"/>
+              <w:keepNext/>
+              <w:spacing w:before="80" w:after="80" w:line="240" w:lineRule="auto"/>
+              <w:ind w:firstLine="0" w:left="0"/>
+            </w:pPr>
+            <w:r>
+              <w:rPr>
+                <w:b/>
+                <w:sz w:val="18"/>
+              </w:rPr>
+              <w:t>Длина кода, бит</w:t>
+            </w:r>
+          </w:p>
+        </w:tc>
+        <w:tc>
+          <w:tcPr>
+            <w:tcW w:type="dxa" w:w="1871"/>
+            <w:vAlign w:val="center"/>
+            <w:shd w:fill="E8EEF5"/>
+          </w:tcPr>
+          <w:p>
+            <w:pPr>
+              <w:pStyle w:val="Мойтекст"/>
+              <w:keepNext/>
+              <w:spacing w:before="80" w:after="80" w:line="240" w:lineRule="auto"/>
+              <w:ind w:firstLine="0" w:left="0"/>
+            </w:pPr>
+            <w:r>
+              <w:rPr>
+                <w:b/>
+                <w:sz w:val="18"/>
+              </w:rPr>
+              <w:t>Всего бит</w:t>
+            </w:r>
+          </w:p>
+        </w:tc>
+      </w:tr>
+      <w:tr>
+        <w:trPr>
+          <w:cantSplit/>
+        </w:trPr>
+        <w:tc>
+          <w:tcPr>
+            <w:tcW w:type="dxa" w:w="1531"/>
+            <w:vAlign w:val="center"/>
+          </w:tcPr>
+          <w:p>
+            <w:pPr>
+              <w:pStyle w:val="Мойтекст"/>
+              <w:keepNext w:val="0"/>
+              <w:spacing w:before="80" w:after="80" w:line="240" w:lineRule="auto"/>
+              <w:ind w:firstLine="0" w:left="0"/>
+            </w:pPr>
+            <w:r>
+              <w:rPr>
+                <w:b w:val="0"/>
+                <w:sz w:val="18"/>
+              </w:rPr>
+              <w:t>Пробел</w:t>
+            </w:r>
+          </w:p>
+        </w:tc>
+        <w:tc>
+          <w:tcPr>
+            <w:tcW w:type="dxa" w:w="1531"/>
+            <w:vAlign w:val="center"/>
+          </w:tcPr>
+          <w:p>
+            <w:pPr>
+              <w:pStyle w:val="Мойтекст"/>
+              <w:keepNext w:val="0"/>
+              <w:spacing w:before="80" w:after="80" w:line="240" w:lineRule="auto"/>
+              <w:ind w:firstLine="0" w:left="0"/>
+            </w:pPr>
+            <w:r>
+              <w:rPr>
+                <w:b w:val="0"/>
+                <w:sz w:val="18"/>
+              </w:rPr>
+              <w:t>2</w:t>
+            </w:r>
+          </w:p>
+        </w:tc>
+        <w:tc>
+          <w:tcPr>
+            <w:tcW w:type="dxa" w:w="1984"/>
+            <w:vAlign w:val="center"/>
+          </w:tcPr>
+          <w:p>
+            <w:pPr>
+              <w:pStyle w:val="Мойтекст"/>
+              <w:keepNext w:val="0"/>
+              <w:spacing w:before="80" w:after="80" w:line="240" w:lineRule="auto"/>
+              <w:ind w:firstLine="0" w:left="0"/>
+            </w:pPr>
+            <w:r>
+              <w:rPr>
+                <w:b w:val="0"/>
+                <w:sz w:val="18"/>
+              </w:rPr>
+              <w:t>1100</w:t>
+            </w:r>
+          </w:p>
+        </w:tc>
+        <w:tc>
+          <w:tcPr>
+            <w:tcW w:type="dxa" w:w="1871"/>
+            <w:vAlign w:val="center"/>
+          </w:tcPr>
+          <w:p>
+            <w:pPr>
+              <w:pStyle w:val="Мойтекст"/>
+              <w:keepNext w:val="0"/>
+              <w:spacing w:before="80" w:after="80" w:line="240" w:lineRule="auto"/>
+              <w:ind w:firstLine="0" w:left="0"/>
+            </w:pPr>
+            <w:r>
+              <w:rPr>
+                <w:b w:val="0"/>
+                <w:sz w:val="18"/>
+              </w:rPr>
+              <w:t>4</w:t>
+            </w:r>
+          </w:p>
+        </w:tc>
+        <w:tc>
+          <w:tcPr>
+            <w:tcW w:type="dxa" w:w="1871"/>
+            <w:vAlign w:val="center"/>
+          </w:tcPr>
+          <w:p>
+            <w:pPr>
+              <w:pStyle w:val="Мойтекст"/>
+              <w:keepNext w:val="0"/>
+              <w:spacing w:before="80" w:after="80" w:line="240" w:lineRule="auto"/>
+              <w:ind w:firstLine="0" w:left="0"/>
+            </w:pPr>
+            <w:r>
+              <w:rPr>
+                <w:b w:val="0"/>
+                <w:sz w:val="18"/>
+              </w:rPr>
+              <w:t>8</w:t>
+            </w:r>
+          </w:p>
+        </w:tc>
+      </w:tr>
+      <w:tr>
+        <w:trPr>
+          <w:cantSplit/>
+        </w:trPr>
+        <w:tc>
+          <w:tcPr>
+            <w:tcW w:type="dxa" w:w="1531"/>
+            <w:vAlign w:val="center"/>
+          </w:tcPr>
+          <w:p>
+            <w:pPr>
+              <w:pStyle w:val="Мойтекст"/>
+              <w:keepNext w:val="0"/>
+              <w:spacing w:before="80" w:after="80" w:line="240" w:lineRule="auto"/>
+              <w:ind w:firstLine="0" w:left="0"/>
+            </w:pPr>
+            <w:r>
+              <w:rPr>
+                <w:b w:val="0"/>
+                <w:sz w:val="18"/>
+              </w:rPr>
+              <w:t>И</w:t>
+            </w:r>
+          </w:p>
+        </w:tc>
+        <w:tc>
+          <w:tcPr>
+            <w:tcW w:type="dxa" w:w="1531"/>
+            <w:vAlign w:val="center"/>
+          </w:tcPr>
+          <w:p>
+            <w:pPr>
+              <w:pStyle w:val="Мойтекст"/>
+              <w:keepNext w:val="0"/>
+              <w:spacing w:before="80" w:after="80" w:line="240" w:lineRule="auto"/>
+              <w:ind w:firstLine="0" w:left="0"/>
+            </w:pPr>
+            <w:r>
+              <w:rPr>
+                <w:b w:val="0"/>
+                <w:sz w:val="18"/>
+              </w:rPr>
+              <w:t>1</w:t>
+            </w:r>
+          </w:p>
+        </w:tc>
+        <w:tc>
+          <w:tcPr>
+            <w:tcW w:type="dxa" w:w="1984"/>
+            <w:vAlign w:val="center"/>
+          </w:tcPr>
+          <w:p>
+            <w:pPr>
+              <w:pStyle w:val="Мойтекст"/>
+              <w:keepNext w:val="0"/>
+              <w:spacing w:before="80" w:after="80" w:line="240" w:lineRule="auto"/>
+              <w:ind w:firstLine="0" w:left="0"/>
+            </w:pPr>
+            <w:r>
+              <w:rPr>
+                <w:b w:val="0"/>
+                <w:sz w:val="18"/>
+              </w:rPr>
+              <w:t>0000</w:t>
+            </w:r>
+          </w:p>
+        </w:tc>
+        <w:tc>
+          <w:tcPr>
+            <w:tcW w:type="dxa" w:w="1871"/>
+            <w:vAlign w:val="center"/>
+          </w:tcPr>
+          <w:p>
+            <w:pPr>
+              <w:pStyle w:val="Мойтекст"/>
+              <w:keepNext w:val="0"/>
+              <w:spacing w:before="80" w:after="80" w:line="240" w:lineRule="auto"/>
+              <w:ind w:firstLine="0" w:left="0"/>
+            </w:pPr>
+            <w:r>
+              <w:rPr>
+                <w:b w:val="0"/>
+                <w:sz w:val="18"/>
+              </w:rPr>
+              <w:t>4</w:t>
+            </w:r>
+          </w:p>
+        </w:tc>
+        <w:tc>
+          <w:tcPr>
+            <w:tcW w:type="dxa" w:w="1871"/>
+            <w:vAlign w:val="center"/>
+          </w:tcPr>
+          <w:p>
+            <w:pPr>
+              <w:pStyle w:val="Мойтекст"/>
+              <w:keepNext w:val="0"/>
+              <w:spacing w:before="80" w:after="80" w:line="240" w:lineRule="auto"/>
+              <w:ind w:firstLine="0" w:left="0"/>
+            </w:pPr>
+            <w:r>
+              <w:rPr>
+                <w:b w:val="0"/>
+                <w:sz w:val="18"/>
+              </w:rPr>
+              <w:t>4</w:t>
+            </w:r>
+          </w:p>
+        </w:tc>
+      </w:tr>
+      <w:tr>
+        <w:trPr>
+          <w:cantSplit/>
+        </w:trPr>
+        <w:tc>
+          <w:tcPr>
+            <w:tcW w:type="dxa" w:w="1531"/>
+            <w:vAlign w:val="center"/>
+          </w:tcPr>
+          <w:p>
+            <w:pPr>
+              <w:pStyle w:val="Мойтекст"/>
+              <w:keepNext w:val="0"/>
+              <w:spacing w:before="80" w:after="80" w:line="240" w:lineRule="auto"/>
+              <w:ind w:firstLine="0" w:left="0"/>
+            </w:pPr>
+            <w:r>
+              <w:rPr>
+                <w:b w:val="0"/>
+                <w:sz w:val="18"/>
+              </w:rPr>
+              <w:t>С</w:t>
+            </w:r>
+          </w:p>
+        </w:tc>
+        <w:tc>
+          <w:tcPr>
+            <w:tcW w:type="dxa" w:w="1531"/>
+            <w:vAlign w:val="center"/>
+          </w:tcPr>
+          <w:p>
+            <w:pPr>
+              <w:pStyle w:val="Мойтекст"/>
+              <w:keepNext w:val="0"/>
+              <w:spacing w:before="80" w:after="80" w:line="240" w:lineRule="auto"/>
+              <w:ind w:firstLine="0" w:left="0"/>
+            </w:pPr>
+            <w:r>
+              <w:rPr>
+                <w:b w:val="0"/>
+                <w:sz w:val="18"/>
+              </w:rPr>
+              <w:t>2</w:t>
+            </w:r>
+          </w:p>
+        </w:tc>
+        <w:tc>
+          <w:tcPr>
+            <w:tcW w:type="dxa" w:w="1984"/>
+            <w:vAlign w:val="center"/>
+          </w:tcPr>
+          <w:p>
+            <w:pPr>
+              <w:pStyle w:val="Мойтекст"/>
+              <w:keepNext w:val="0"/>
+              <w:spacing w:before="80" w:after="80" w:line="240" w:lineRule="auto"/>
+              <w:ind w:firstLine="0" w:left="0"/>
+            </w:pPr>
+            <w:r>
+              <w:rPr>
+                <w:b w:val="0"/>
+                <w:sz w:val="18"/>
+              </w:rPr>
+              <w:t>1101</w:t>
+            </w:r>
+          </w:p>
+        </w:tc>
+        <w:tc>
+          <w:tcPr>
+            <w:tcW w:type="dxa" w:w="1871"/>
+            <w:vAlign w:val="center"/>
+          </w:tcPr>
+          <w:p>
+            <w:pPr>
+              <w:pStyle w:val="Мойтекст"/>
+              <w:keepNext w:val="0"/>
+              <w:spacing w:before="80" w:after="80" w:line="240" w:lineRule="auto"/>
+              <w:ind w:firstLine="0" w:left="0"/>
+            </w:pPr>
+            <w:r>
+              <w:rPr>
+                <w:b w:val="0"/>
+                <w:sz w:val="18"/>
+              </w:rPr>
+              <w:t>4</w:t>
+            </w:r>
+          </w:p>
+        </w:tc>
+        <w:tc>
+          <w:tcPr>
+            <w:tcW w:type="dxa" w:w="1871"/>
+            <w:vAlign w:val="center"/>
+          </w:tcPr>
+          <w:p>
+            <w:pPr>
+              <w:pStyle w:val="Мойтекст"/>
+              <w:keepNext w:val="0"/>
+              <w:spacing w:before="80" w:after="80" w:line="240" w:lineRule="auto"/>
+              <w:ind w:firstLine="0" w:left="0"/>
+            </w:pPr>
+            <w:r>
+              <w:rPr>
+                <w:b w:val="0"/>
+                <w:sz w:val="18"/>
+              </w:rPr>
+              <w:t>8</w:t>
+            </w:r>
+          </w:p>
+        </w:tc>
+      </w:tr>
+      <w:tr>
+        <w:trPr>
+          <w:cantSplit/>
+        </w:trPr>
+        <w:tc>
+          <w:tcPr>
+            <w:tcW w:type="dxa" w:w="1531"/>
+            <w:vAlign w:val="center"/>
+          </w:tcPr>
+          <w:p>
+            <w:pPr>
+              <w:pStyle w:val="Мойтекст"/>
+              <w:keepNext w:val="0"/>
+              <w:spacing w:before="80" w:after="80" w:line="240" w:lineRule="auto"/>
+              <w:ind w:firstLine="0" w:left="0"/>
+            </w:pPr>
+            <w:r>
+              <w:rPr>
+                <w:b w:val="0"/>
+                <w:sz w:val="18"/>
+              </w:rPr>
+              <w:t>а</w:t>
+            </w:r>
+          </w:p>
+        </w:tc>
+        <w:tc>
+          <w:tcPr>
+            <w:tcW w:type="dxa" w:w="1531"/>
+            <w:vAlign w:val="center"/>
+          </w:tcPr>
+          <w:p>
+            <w:pPr>
+              <w:pStyle w:val="Мойтекст"/>
+              <w:keepNext w:val="0"/>
+              <w:spacing w:before="80" w:after="80" w:line="240" w:lineRule="auto"/>
+              <w:ind w:firstLine="0" w:left="0"/>
+            </w:pPr>
+            <w:r>
+              <w:rPr>
+                <w:b w:val="0"/>
+                <w:sz w:val="18"/>
+              </w:rPr>
+              <w:t>4</w:t>
+            </w:r>
+          </w:p>
+        </w:tc>
+        <w:tc>
+          <w:tcPr>
+            <w:tcW w:type="dxa" w:w="1984"/>
+            <w:vAlign w:val="center"/>
+          </w:tcPr>
+          <w:p>
+            <w:pPr>
+              <w:pStyle w:val="Мойтекст"/>
+              <w:keepNext w:val="0"/>
+              <w:spacing w:before="80" w:after="80" w:line="240" w:lineRule="auto"/>
+              <w:ind w:firstLine="0" w:left="0"/>
+            </w:pPr>
+            <w:r>
+              <w:rPr>
+                <w:b w:val="0"/>
+                <w:sz w:val="18"/>
+              </w:rPr>
+              <w:t>011</w:t>
+            </w:r>
+          </w:p>
+        </w:tc>
+        <w:tc>
+          <w:tcPr>
+            <w:tcW w:type="dxa" w:w="1871"/>
+            <w:vAlign w:val="center"/>
+          </w:tcPr>
+          <w:p>
+            <w:pPr>
+              <w:pStyle w:val="Мойтекст"/>
+              <w:keepNext w:val="0"/>
+              <w:spacing w:before="80" w:after="80" w:line="240" w:lineRule="auto"/>
+              <w:ind w:firstLine="0" w:left="0"/>
+            </w:pPr>
+            <w:r>
+              <w:rPr>
+                <w:b w:val="0"/>
+                <w:sz w:val="18"/>
+              </w:rPr>
+              <w:t>3</w:t>
+            </w:r>
+          </w:p>
+        </w:tc>
+        <w:tc>
+          <w:tcPr>
+            <w:tcW w:type="dxa" w:w="1871"/>
+            <w:vAlign w:val="center"/>
+          </w:tcPr>
+          <w:p>
+            <w:pPr>
+              <w:pStyle w:val="Мойтекст"/>
+              <w:keepNext w:val="0"/>
+              <w:spacing w:before="80" w:after="80" w:line="240" w:lineRule="auto"/>
+              <w:ind w:firstLine="0" w:left="0"/>
+            </w:pPr>
+            <w:r>
+              <w:rPr>
+                <w:b w:val="0"/>
+                <w:sz w:val="18"/>
+              </w:rPr>
+              <w:t>12</w:t>
+            </w:r>
+          </w:p>
+        </w:tc>
+      </w:tr>
+      <w:tr>
+        <w:trPr>
+          <w:cantSplit/>
+        </w:trPr>
+        <w:tc>
+          <w:tcPr>
+            <w:tcW w:type="dxa" w:w="1531"/>
+            <w:vAlign w:val="center"/>
+          </w:tcPr>
+          <w:p>
+            <w:pPr>
+              <w:pStyle w:val="Мойтекст"/>
+              <w:keepNext w:val="0"/>
+              <w:spacing w:before="80" w:after="80" w:line="240" w:lineRule="auto"/>
+              <w:ind w:firstLine="0" w:left="0"/>
+            </w:pPr>
+            <w:r>
+              <w:rPr>
+                <w:b w:val="0"/>
+                <w:sz w:val="18"/>
+              </w:rPr>
+              <w:t>в</w:t>
+            </w:r>
+          </w:p>
+        </w:tc>
+        <w:tc>
+          <w:tcPr>
+            <w:tcW w:type="dxa" w:w="1531"/>
+            <w:vAlign w:val="center"/>
+          </w:tcPr>
+          <w:p>
+            <w:pPr>
+              <w:pStyle w:val="Мойтекст"/>
+              <w:keepNext w:val="0"/>
+              <w:spacing w:before="80" w:after="80" w:line="240" w:lineRule="auto"/>
+              <w:ind w:firstLine="0" w:left="0"/>
+            </w:pPr>
+            <w:r>
+              <w:rPr>
+                <w:b w:val="0"/>
+                <w:sz w:val="18"/>
+              </w:rPr>
+              <w:t>4</w:t>
+            </w:r>
+          </w:p>
+        </w:tc>
+        <w:tc>
+          <w:tcPr>
+            <w:tcW w:type="dxa" w:w="1984"/>
+            <w:vAlign w:val="center"/>
+          </w:tcPr>
+          <w:p>
+            <w:pPr>
+              <w:pStyle w:val="Мойтекст"/>
+              <w:keepNext w:val="0"/>
+              <w:spacing w:before="80" w:after="80" w:line="240" w:lineRule="auto"/>
+              <w:ind w:firstLine="0" w:left="0"/>
+            </w:pPr>
+            <w:r>
+              <w:rPr>
+                <w:b w:val="0"/>
+                <w:sz w:val="18"/>
+              </w:rPr>
+              <w:t>100</w:t>
+            </w:r>
+          </w:p>
+        </w:tc>
+        <w:tc>
+          <w:tcPr>
+            <w:tcW w:type="dxa" w:w="1871"/>
+            <w:vAlign w:val="center"/>
+          </w:tcPr>
+          <w:p>
+            <w:pPr>
+              <w:pStyle w:val="Мойтекст"/>
+              <w:keepNext w:val="0"/>
+              <w:spacing w:before="80" w:after="80" w:line="240" w:lineRule="auto"/>
+              <w:ind w:firstLine="0" w:left="0"/>
+            </w:pPr>
+            <w:r>
+              <w:rPr>
+                <w:b w:val="0"/>
+                <w:sz w:val="18"/>
+              </w:rPr>
+              <w:t>3</w:t>
+            </w:r>
+          </w:p>
+        </w:tc>
+        <w:tc>
+          <w:tcPr>
+            <w:tcW w:type="dxa" w:w="1871"/>
+            <w:vAlign w:val="center"/>
+          </w:tcPr>
+          <w:p>
+            <w:pPr>
+              <w:pStyle w:val="Мойтекст"/>
+              <w:keepNext w:val="0"/>
+              <w:spacing w:before="80" w:after="80" w:line="240" w:lineRule="auto"/>
+              <w:ind w:firstLine="0" w:left="0"/>
+            </w:pPr>
+            <w:r>
+              <w:rPr>
+                <w:b w:val="0"/>
+                <w:sz w:val="18"/>
+              </w:rPr>
+              <w:t>12</w:t>
+            </w:r>
+          </w:p>
+        </w:tc>
+      </w:tr>
+      <w:tr>
+        <w:trPr>
+          <w:cantSplit/>
+        </w:trPr>
+        <w:tc>
+          <w:tcPr>
+            <w:tcW w:type="dxa" w:w="1531"/>
+            <w:vAlign w:val="center"/>
+          </w:tcPr>
+          <w:p>
+            <w:pPr>
+              <w:pStyle w:val="Мойтекст"/>
+              <w:keepNext w:val="0"/>
+              <w:spacing w:before="80" w:after="80" w:line="240" w:lineRule="auto"/>
+              <w:ind w:firstLine="0" w:left="0"/>
+            </w:pPr>
+            <w:r>
+              <w:rPr>
+                <w:b w:val="0"/>
+                <w:sz w:val="18"/>
+              </w:rPr>
+              <w:t>д</w:t>
+            </w:r>
+          </w:p>
+        </w:tc>
+        <w:tc>
+          <w:tcPr>
+            <w:tcW w:type="dxa" w:w="1531"/>
+            <w:vAlign w:val="center"/>
+          </w:tcPr>
+          <w:p>
+            <w:pPr>
+              <w:pStyle w:val="Мойтекст"/>
+              <w:keepNext w:val="0"/>
+              <w:spacing w:before="80" w:after="80" w:line="240" w:lineRule="auto"/>
+              <w:ind w:firstLine="0" w:left="0"/>
+            </w:pPr>
+            <w:r>
+              <w:rPr>
+                <w:b w:val="0"/>
+                <w:sz w:val="18"/>
+              </w:rPr>
+              <w:t>1</w:t>
+            </w:r>
+          </w:p>
+        </w:tc>
+        <w:tc>
+          <w:tcPr>
+            <w:tcW w:type="dxa" w:w="1984"/>
+            <w:vAlign w:val="center"/>
+          </w:tcPr>
+          <w:p>
+            <w:pPr>
+              <w:pStyle w:val="Мойтекст"/>
+              <w:keepNext w:val="0"/>
+              <w:spacing w:before="80" w:after="80" w:line="240" w:lineRule="auto"/>
+              <w:ind w:firstLine="0" w:left="0"/>
+            </w:pPr>
+            <w:r>
+              <w:rPr>
+                <w:b w:val="0"/>
+                <w:sz w:val="18"/>
+              </w:rPr>
+              <w:t>0001</w:t>
+            </w:r>
+          </w:p>
+        </w:tc>
+        <w:tc>
+          <w:tcPr>
+            <w:tcW w:type="dxa" w:w="1871"/>
+            <w:vAlign w:val="center"/>
+          </w:tcPr>
+          <w:p>
+            <w:pPr>
+              <w:pStyle w:val="Мойтекст"/>
+              <w:keepNext w:val="0"/>
+              <w:spacing w:before="80" w:after="80" w:line="240" w:lineRule="auto"/>
+              <w:ind w:firstLine="0" w:left="0"/>
+            </w:pPr>
+            <w:r>
+              <w:rPr>
+                <w:b w:val="0"/>
+                <w:sz w:val="18"/>
+              </w:rPr>
+              <w:t>4</w:t>
+            </w:r>
+          </w:p>
+        </w:tc>
+        <w:tc>
+          <w:tcPr>
+            <w:tcW w:type="dxa" w:w="1871"/>
+            <w:vAlign w:val="center"/>
+          </w:tcPr>
+          <w:p>
+            <w:pPr>
+              <w:pStyle w:val="Мойтекст"/>
+              <w:keepNext w:val="0"/>
+              <w:spacing w:before="80" w:after="80" w:line="240" w:lineRule="auto"/>
+              <w:ind w:firstLine="0" w:left="0"/>
+            </w:pPr>
+            <w:r>
+              <w:rPr>
+                <w:b w:val="0"/>
+                <w:sz w:val="18"/>
+              </w:rPr>
+              <w:t>4</w:t>
+            </w:r>
+          </w:p>
+        </w:tc>
+      </w:tr>
+      <w:tr>
+        <w:trPr>
+          <w:cantSplit/>
+        </w:trPr>
+        <w:tc>
+          <w:tcPr>
+            <w:tcW w:type="dxa" w:w="1531"/>
+            <w:vAlign w:val="center"/>
+          </w:tcPr>
+          <w:p>
+            <w:pPr>
+              <w:pStyle w:val="Мойтекст"/>
+              <w:keepNext w:val="0"/>
+              <w:spacing w:before="80" w:after="80" w:line="240" w:lineRule="auto"/>
+              <w:ind w:firstLine="0" w:left="0"/>
+            </w:pPr>
+            <w:r>
+              <w:rPr>
+                <w:b w:val="0"/>
+                <w:sz w:val="18"/>
+              </w:rPr>
+              <w:t>и</w:t>
+            </w:r>
+          </w:p>
+        </w:tc>
+        <w:tc>
+          <w:tcPr>
+            <w:tcW w:type="dxa" w:w="1531"/>
+            <w:vAlign w:val="center"/>
+          </w:tcPr>
+          <w:p>
+            <w:pPr>
+              <w:pStyle w:val="Мойтекст"/>
+              <w:keepNext w:val="0"/>
+              <w:spacing w:before="80" w:after="80" w:line="240" w:lineRule="auto"/>
+              <w:ind w:firstLine="0" w:left="0"/>
+            </w:pPr>
+            <w:r>
+              <w:rPr>
+                <w:b w:val="0"/>
+                <w:sz w:val="18"/>
+              </w:rPr>
+              <w:t>2</w:t>
+            </w:r>
+          </w:p>
+        </w:tc>
+        <w:tc>
+          <w:tcPr>
+            <w:tcW w:type="dxa" w:w="1984"/>
+            <w:vAlign w:val="center"/>
+          </w:tcPr>
+          <w:p>
+            <w:pPr>
+              <w:pStyle w:val="Мойтекст"/>
+              <w:keepNext w:val="0"/>
+              <w:spacing w:before="80" w:after="80" w:line="240" w:lineRule="auto"/>
+              <w:ind w:firstLine="0" w:left="0"/>
+            </w:pPr>
+            <w:r>
+              <w:rPr>
+                <w:b w:val="0"/>
+                <w:sz w:val="18"/>
+              </w:rPr>
+              <w:t>1110</w:t>
+            </w:r>
+          </w:p>
+        </w:tc>
+        <w:tc>
+          <w:tcPr>
+            <w:tcW w:type="dxa" w:w="1871"/>
+            <w:vAlign w:val="center"/>
+          </w:tcPr>
+          <w:p>
+            <w:pPr>
+              <w:pStyle w:val="Мойтекст"/>
+              <w:keepNext w:val="0"/>
+              <w:spacing w:before="80" w:after="80" w:line="240" w:lineRule="auto"/>
+              <w:ind w:firstLine="0" w:left="0"/>
+            </w:pPr>
+            <w:r>
+              <w:rPr>
+                <w:b w:val="0"/>
+                <w:sz w:val="18"/>
+              </w:rPr>
+              <w:t>4</w:t>
+            </w:r>
+          </w:p>
+        </w:tc>
+        <w:tc>
+          <w:tcPr>
+            <w:tcW w:type="dxa" w:w="1871"/>
+            <w:vAlign w:val="center"/>
+          </w:tcPr>
+          <w:p>
+            <w:pPr>
+              <w:pStyle w:val="Мойтекст"/>
+              <w:keepNext w:val="0"/>
+              <w:spacing w:before="80" w:after="80" w:line="240" w:lineRule="auto"/>
+              <w:ind w:firstLine="0" w:left="0"/>
+            </w:pPr>
+            <w:r>
+              <w:rPr>
+                <w:b w:val="0"/>
+                <w:sz w:val="18"/>
+              </w:rPr>
+              <w:t>8</w:t>
+            </w:r>
+          </w:p>
+        </w:tc>
+      </w:tr>
+      <w:tr>
+        <w:trPr>
+          <w:cantSplit/>
+        </w:trPr>
+        <w:tc>
+          <w:tcPr>
+            <w:tcW w:type="dxa" w:w="1531"/>
+            <w:vAlign w:val="center"/>
+          </w:tcPr>
+          <w:p>
+            <w:pPr>
+              <w:pStyle w:val="Мойтекст"/>
+              <w:keepNext w:val="0"/>
+              <w:spacing w:before="80" w:after="80" w:line="240" w:lineRule="auto"/>
+              <w:ind w:firstLine="0" w:left="0"/>
+            </w:pPr>
+            <w:r>
+              <w:rPr>
+                <w:b w:val="0"/>
+                <w:sz w:val="18"/>
+              </w:rPr>
+              <w:t>к</w:t>
+            </w:r>
+          </w:p>
+        </w:tc>
+        <w:tc>
+          <w:tcPr>
+            <w:tcW w:type="dxa" w:w="1531"/>
+            <w:vAlign w:val="center"/>
+          </w:tcPr>
+          <w:p>
+            <w:pPr>
+              <w:pStyle w:val="Мойтекст"/>
+              <w:keepNext w:val="0"/>
+              <w:spacing w:before="80" w:after="80" w:line="240" w:lineRule="auto"/>
+              <w:ind w:firstLine="0" w:left="0"/>
+            </w:pPr>
+            <w:r>
+              <w:rPr>
+                <w:b w:val="0"/>
+                <w:sz w:val="18"/>
+              </w:rPr>
+              <w:t>1</w:t>
+            </w:r>
+          </w:p>
+        </w:tc>
+        <w:tc>
+          <w:tcPr>
+            <w:tcW w:type="dxa" w:w="1984"/>
+            <w:vAlign w:val="center"/>
+          </w:tcPr>
+          <w:p>
+            <w:pPr>
+              <w:pStyle w:val="Мойтекст"/>
+              <w:keepNext w:val="0"/>
+              <w:spacing w:before="80" w:after="80" w:line="240" w:lineRule="auto"/>
+              <w:ind w:firstLine="0" w:left="0"/>
+            </w:pPr>
+            <w:r>
+              <w:rPr>
+                <w:b w:val="0"/>
+                <w:sz w:val="18"/>
+              </w:rPr>
+              <w:t>0010</w:t>
+            </w:r>
+          </w:p>
+        </w:tc>
+        <w:tc>
+          <w:tcPr>
+            <w:tcW w:type="dxa" w:w="1871"/>
+            <w:vAlign w:val="center"/>
+          </w:tcPr>
+          <w:p>
+            <w:pPr>
+              <w:pStyle w:val="Мойтекст"/>
+              <w:keepNext w:val="0"/>
+              <w:spacing w:before="80" w:after="80" w:line="240" w:lineRule="auto"/>
+              <w:ind w:firstLine="0" w:left="0"/>
+            </w:pPr>
+            <w:r>
+              <w:rPr>
+                <w:b w:val="0"/>
+                <w:sz w:val="18"/>
+              </w:rPr>
+              <w:t>4</w:t>
+            </w:r>
+          </w:p>
+        </w:tc>
+        <w:tc>
+          <w:tcPr>
+            <w:tcW w:type="dxa" w:w="1871"/>
+            <w:vAlign w:val="center"/>
+          </w:tcPr>
+          <w:p>
+            <w:pPr>
+              <w:pStyle w:val="Мойтекст"/>
+              <w:keepNext w:val="0"/>
+              <w:spacing w:before="80" w:after="80" w:line="240" w:lineRule="auto"/>
+              <w:ind w:firstLine="0" w:left="0"/>
+            </w:pPr>
+            <w:r>
+              <w:rPr>
+                <w:b w:val="0"/>
+                <w:sz w:val="18"/>
+              </w:rPr>
+              <w:t>4</w:t>
+            </w:r>
+          </w:p>
+        </w:tc>
+      </w:tr>
+      <w:tr>
+        <w:trPr>
+          <w:cantSplit/>
+        </w:trPr>
+        <w:tc>
+          <w:tcPr>
+            <w:tcW w:type="dxa" w:w="1531"/>
+            <w:vAlign w:val="center"/>
+          </w:tcPr>
+          <w:p>
+            <w:pPr>
+              <w:pStyle w:val="Мойтекст"/>
+              <w:keepNext w:val="0"/>
+              <w:spacing w:before="80" w:after="80" w:line="240" w:lineRule="auto"/>
+              <w:ind w:firstLine="0" w:left="0"/>
+            </w:pPr>
+            <w:r>
+              <w:rPr>
+                <w:b w:val="0"/>
+                <w:sz w:val="18"/>
+              </w:rPr>
+              <w:t>н</w:t>
+            </w:r>
+          </w:p>
+        </w:tc>
+        <w:tc>
+          <w:tcPr>
+            <w:tcW w:type="dxa" w:w="1531"/>
+            <w:vAlign w:val="center"/>
+          </w:tcPr>
+          <w:p>
+            <w:pPr>
+              <w:pStyle w:val="Мойтекст"/>
+              <w:keepNext w:val="0"/>
+              <w:spacing w:before="80" w:after="80" w:line="240" w:lineRule="auto"/>
+              <w:ind w:firstLine="0" w:left="0"/>
+            </w:pPr>
+            <w:r>
+              <w:rPr>
+                <w:b w:val="0"/>
+                <w:sz w:val="18"/>
+              </w:rPr>
+              <w:t>2</w:t>
+            </w:r>
+          </w:p>
+        </w:tc>
+        <w:tc>
+          <w:tcPr>
+            <w:tcW w:type="dxa" w:w="1984"/>
+            <w:vAlign w:val="center"/>
+          </w:tcPr>
+          <w:p>
+            <w:pPr>
+              <w:pStyle w:val="Мойтекст"/>
+              <w:keepNext w:val="0"/>
+              <w:spacing w:before="80" w:after="80" w:line="240" w:lineRule="auto"/>
+              <w:ind w:firstLine="0" w:left="0"/>
+            </w:pPr>
+            <w:r>
+              <w:rPr>
+                <w:b w:val="0"/>
+                <w:sz w:val="18"/>
+              </w:rPr>
+              <w:t>1111</w:t>
+            </w:r>
+          </w:p>
+        </w:tc>
+        <w:tc>
+          <w:tcPr>
+            <w:tcW w:type="dxa" w:w="1871"/>
+            <w:vAlign w:val="center"/>
+          </w:tcPr>
+          <w:p>
+            <w:pPr>
+              <w:pStyle w:val="Мойтекст"/>
+              <w:keepNext w:val="0"/>
+              <w:spacing w:before="80" w:after="80" w:line="240" w:lineRule="auto"/>
+              <w:ind w:firstLine="0" w:left="0"/>
+            </w:pPr>
+            <w:r>
+              <w:rPr>
+                <w:b w:val="0"/>
+                <w:sz w:val="18"/>
+              </w:rPr>
+              <w:t>4</w:t>
+            </w:r>
+          </w:p>
+        </w:tc>
+        <w:tc>
+          <w:tcPr>
+            <w:tcW w:type="dxa" w:w="1871"/>
+            <w:vAlign w:val="center"/>
+          </w:tcPr>
+          <w:p>
+            <w:pPr>
+              <w:pStyle w:val="Мойтекст"/>
+              <w:keepNext w:val="0"/>
+              <w:spacing w:before="80" w:after="80" w:line="240" w:lineRule="auto"/>
+              <w:ind w:firstLine="0" w:left="0"/>
+            </w:pPr>
+            <w:r>
+              <w:rPr>
+                <w:b w:val="0"/>
+                <w:sz w:val="18"/>
+              </w:rPr>
+              <w:t>8</w:t>
+            </w:r>
+          </w:p>
+        </w:tc>
+      </w:tr>
+      <w:tr>
+        <w:trPr>
+          <w:cantSplit/>
+        </w:trPr>
+        <w:tc>
+          <w:tcPr>
+            <w:tcW w:type="dxa" w:w="1531"/>
+            <w:vAlign w:val="center"/>
+          </w:tcPr>
+          <w:p>
+            <w:pPr>
+              <w:pStyle w:val="Мойтекст"/>
+              <w:keepNext w:val="0"/>
+              <w:spacing w:before="80" w:after="80" w:line="240" w:lineRule="auto"/>
+              <w:ind w:firstLine="0" w:left="0"/>
+            </w:pPr>
+            <w:r>
+              <w:rPr>
+                <w:b w:val="0"/>
+                <w:sz w:val="18"/>
+              </w:rPr>
+              <w:t>о</w:t>
+            </w:r>
+          </w:p>
+        </w:tc>
+        <w:tc>
+          <w:tcPr>
+            <w:tcW w:type="dxa" w:w="1531"/>
+            <w:vAlign w:val="center"/>
+          </w:tcPr>
+          <w:p>
+            <w:pPr>
+              <w:pStyle w:val="Мойтекст"/>
+              <w:keepNext w:val="0"/>
+              <w:spacing w:before="80" w:after="80" w:line="240" w:lineRule="auto"/>
+              <w:ind w:firstLine="0" w:left="0"/>
+            </w:pPr>
+            <w:r>
+              <w:rPr>
+                <w:b w:val="0"/>
+                <w:sz w:val="18"/>
+              </w:rPr>
+              <w:t>4</w:t>
+            </w:r>
+          </w:p>
+        </w:tc>
+        <w:tc>
+          <w:tcPr>
+            <w:tcW w:type="dxa" w:w="1984"/>
+            <w:vAlign w:val="center"/>
+          </w:tcPr>
+          <w:p>
+            <w:pPr>
+              <w:pStyle w:val="Мойтекст"/>
+              <w:keepNext w:val="0"/>
+              <w:spacing w:before="80" w:after="80" w:line="240" w:lineRule="auto"/>
+              <w:ind w:firstLine="0" w:left="0"/>
+            </w:pPr>
+            <w:r>
+              <w:rPr>
+                <w:b w:val="0"/>
+                <w:sz w:val="18"/>
+              </w:rPr>
+              <w:t>101</w:t>
+            </w:r>
+          </w:p>
+        </w:tc>
+        <w:tc>
+          <w:tcPr>
+            <w:tcW w:type="dxa" w:w="1871"/>
+            <w:vAlign w:val="center"/>
+          </w:tcPr>
+          <w:p>
+            <w:pPr>
+              <w:pStyle w:val="Мойтекст"/>
+              <w:keepNext w:val="0"/>
+              <w:spacing w:before="80" w:after="80" w:line="240" w:lineRule="auto"/>
+              <w:ind w:firstLine="0" w:left="0"/>
+            </w:pPr>
+            <w:r>
+              <w:rPr>
+                <w:b w:val="0"/>
+                <w:sz w:val="18"/>
+              </w:rPr>
+              <w:t>3</w:t>
+            </w:r>
+          </w:p>
+        </w:tc>
+        <w:tc>
+          <w:tcPr>
+            <w:tcW w:type="dxa" w:w="1871"/>
+            <w:vAlign w:val="center"/>
+          </w:tcPr>
+          <w:p>
+            <w:pPr>
+              <w:pStyle w:val="Мойтекст"/>
+              <w:keepNext w:val="0"/>
+              <w:spacing w:before="80" w:after="80" w:line="240" w:lineRule="auto"/>
+              <w:ind w:firstLine="0" w:left="0"/>
+            </w:pPr>
+            <w:r>
+              <w:rPr>
+                <w:b w:val="0"/>
+                <w:sz w:val="18"/>
+              </w:rPr>
+              <w:t>12</w:t>
+            </w:r>
+          </w:p>
+        </w:tc>
+      </w:tr>
+      <w:tr>
+        <w:trPr>
+          <w:cantSplit/>
+        </w:trPr>
+        <w:tc>
+          <w:tcPr>
+            <w:tcW w:type="dxa" w:w="1531"/>
+            <w:vAlign w:val="center"/>
+          </w:tcPr>
+          <w:p>
+            <w:pPr>
+              <w:pStyle w:val="Мойтекст"/>
+              <w:keepNext w:val="0"/>
+              <w:spacing w:before="80" w:after="80" w:line="240" w:lineRule="auto"/>
+              <w:ind w:firstLine="0" w:left="0"/>
+            </w:pPr>
+            <w:r>
+              <w:rPr>
+                <w:b w:val="0"/>
+                <w:sz w:val="18"/>
+              </w:rPr>
+              <w:t>ф</w:t>
+            </w:r>
+          </w:p>
+        </w:tc>
+        <w:tc>
+          <w:tcPr>
+            <w:tcW w:type="dxa" w:w="1531"/>
+            <w:vAlign w:val="center"/>
+          </w:tcPr>
+          <w:p>
+            <w:pPr>
+              <w:pStyle w:val="Мойтекст"/>
+              <w:keepNext w:val="0"/>
+              <w:spacing w:before="80" w:after="80" w:line="240" w:lineRule="auto"/>
+              <w:ind w:firstLine="0" w:left="0"/>
+            </w:pPr>
+            <w:r>
+              <w:rPr>
+                <w:b w:val="0"/>
+                <w:sz w:val="18"/>
+              </w:rPr>
+              <w:t>1</w:t>
+            </w:r>
+          </w:p>
+        </w:tc>
+        <w:tc>
+          <w:tcPr>
+            <w:tcW w:type="dxa" w:w="1984"/>
+            <w:vAlign w:val="center"/>
+          </w:tcPr>
+          <w:p>
+            <w:pPr>
+              <w:pStyle w:val="Мойтекст"/>
+              <w:keepNext w:val="0"/>
+              <w:spacing w:before="80" w:after="80" w:line="240" w:lineRule="auto"/>
+              <w:ind w:firstLine="0" w:left="0"/>
+            </w:pPr>
+            <w:r>
+              <w:rPr>
+                <w:b w:val="0"/>
+                <w:sz w:val="18"/>
+              </w:rPr>
+              <w:t>0011</w:t>
+            </w:r>
+          </w:p>
+        </w:tc>
+        <w:tc>
+          <w:tcPr>
+            <w:tcW w:type="dxa" w:w="1871"/>
+            <w:vAlign w:val="center"/>
+          </w:tcPr>
+          <w:p>
+            <w:pPr>
+              <w:pStyle w:val="Мойтекст"/>
+              <w:keepNext w:val="0"/>
+              <w:spacing w:before="80" w:after="80" w:line="240" w:lineRule="auto"/>
+              <w:ind w:firstLine="0" w:left="0"/>
+            </w:pPr>
+            <w:r>
+              <w:rPr>
+                <w:b w:val="0"/>
+                <w:sz w:val="18"/>
+              </w:rPr>
+              <w:t>4</w:t>
+            </w:r>
+          </w:p>
+        </w:tc>
+        <w:tc>
+          <w:tcPr>
+            <w:tcW w:type="dxa" w:w="1871"/>
+            <w:vAlign w:val="center"/>
+          </w:tcPr>
+          <w:p>
+            <w:pPr>
+              <w:pStyle w:val="Мойтекст"/>
+              <w:keepNext w:val="0"/>
+              <w:spacing w:before="80" w:after="80" w:line="240" w:lineRule="auto"/>
+              <w:ind w:firstLine="0" w:left="0"/>
+            </w:pPr>
+            <w:r>
+              <w:rPr>
+                <w:b w:val="0"/>
+                <w:sz w:val="18"/>
+              </w:rPr>
+              <w:t>4</w:t>
+            </w:r>
+          </w:p>
+        </w:tc>
+      </w:tr>
+      <w:tr>
+        <w:trPr>
+          <w:cantSplit/>
+        </w:trPr>
+        <w:tc>
+          <w:tcPr>
+            <w:tcW w:type="dxa" w:w="1531"/>
+            <w:vAlign w:val="center"/>
+          </w:tcPr>
+          <w:p>
+            <w:pPr>
+              <w:pStyle w:val="Мойтекст"/>
+              <w:keepNext w:val="0"/>
+              <w:spacing w:before="80" w:after="80" w:line="240" w:lineRule="auto"/>
+              <w:ind w:firstLine="0" w:left="0"/>
+            </w:pPr>
+            <w:r>
+              <w:rPr>
+                <w:b w:val="0"/>
+                <w:sz w:val="18"/>
+              </w:rPr>
+              <w:t>щ</w:t>
+            </w:r>
+          </w:p>
+        </w:tc>
+        <w:tc>
+          <w:tcPr>
+            <w:tcW w:type="dxa" w:w="1531"/>
+            <w:vAlign w:val="center"/>
+          </w:tcPr>
+          <w:p>
+            <w:pPr>
+              <w:pStyle w:val="Мойтекст"/>
+              <w:keepNext w:val="0"/>
+              <w:spacing w:before="80" w:after="80" w:line="240" w:lineRule="auto"/>
+              <w:ind w:firstLine="0" w:left="0"/>
+            </w:pPr>
+            <w:r>
+              <w:rPr>
+                <w:b w:val="0"/>
+                <w:sz w:val="18"/>
+              </w:rPr>
+              <w:t>1</w:t>
+            </w:r>
+          </w:p>
+        </w:tc>
+        <w:tc>
+          <w:tcPr>
+            <w:tcW w:type="dxa" w:w="1984"/>
+            <w:vAlign w:val="center"/>
+          </w:tcPr>
+          <w:p>
+            <w:pPr>
+              <w:pStyle w:val="Мойтекст"/>
+              <w:keepNext w:val="0"/>
+              <w:spacing w:before="80" w:after="80" w:line="240" w:lineRule="auto"/>
+              <w:ind w:firstLine="0" w:left="0"/>
+            </w:pPr>
+            <w:r>
+              <w:rPr>
+                <w:b w:val="0"/>
+                <w:sz w:val="18"/>
+              </w:rPr>
+              <w:t>0100</w:t>
+            </w:r>
+          </w:p>
+        </w:tc>
+        <w:tc>
+          <w:tcPr>
+            <w:tcW w:type="dxa" w:w="1871"/>
+            <w:vAlign w:val="center"/>
+          </w:tcPr>
+          <w:p>
+            <w:pPr>
+              <w:pStyle w:val="Мойтекст"/>
+              <w:keepNext w:val="0"/>
+              <w:spacing w:before="80" w:after="80" w:line="240" w:lineRule="auto"/>
+              <w:ind w:firstLine="0" w:left="0"/>
+            </w:pPr>
+            <w:r>
+              <w:rPr>
+                <w:b w:val="0"/>
+                <w:sz w:val="18"/>
+              </w:rPr>
+              <w:t>4</w:t>
+            </w:r>
+          </w:p>
+        </w:tc>
+        <w:tc>
+          <w:tcPr>
+            <w:tcW w:type="dxa" w:w="1871"/>
+            <w:vAlign w:val="center"/>
+          </w:tcPr>
+          <w:p>
+            <w:pPr>
+              <w:pStyle w:val="Мойтекст"/>
+              <w:keepNext w:val="0"/>
+              <w:spacing w:before="80" w:after="80" w:line="240" w:lineRule="auto"/>
+              <w:ind w:firstLine="0" w:left="0"/>
+            </w:pPr>
+            <w:r>
+              <w:rPr>
+                <w:b w:val="0"/>
+                <w:sz w:val="18"/>
+              </w:rPr>
+              <w:t>4</w:t>
+            </w:r>
+          </w:p>
+        </w:tc>
+      </w:tr>
+      <w:tr>
+        <w:trPr>
+          <w:cantSplit/>
+        </w:trPr>
+        <w:tc>
+          <w:tcPr>
+            <w:tcW w:type="dxa" w:w="1531"/>
+            <w:vAlign w:val="center"/>
+          </w:tcPr>
+          <w:p>
+            <w:pPr>
+              <w:pStyle w:val="Мойтекст"/>
+              <w:keepNext w:val="0"/>
+              <w:spacing w:before="80" w:after="80" w:line="240" w:lineRule="auto"/>
+              <w:ind w:firstLine="0" w:left="0"/>
+            </w:pPr>
+            <w:r>
+              <w:rPr>
+                <w:b w:val="0"/>
+                <w:sz w:val="18"/>
+              </w:rPr>
+              <w:t>я</w:t>
+            </w:r>
+          </w:p>
+        </w:tc>
+        <w:tc>
+          <w:tcPr>
+            <w:tcW w:type="dxa" w:w="1531"/>
+            <w:vAlign w:val="center"/>
+          </w:tcPr>
+          <w:p>
+            <w:pPr>
+              <w:pStyle w:val="Мойтекст"/>
+              <w:keepNext w:val="0"/>
+              <w:spacing w:before="80" w:after="80" w:line="240" w:lineRule="auto"/>
+              <w:ind w:firstLine="0" w:left="0"/>
+            </w:pPr>
+            <w:r>
+              <w:rPr>
+                <w:b w:val="0"/>
+                <w:sz w:val="18"/>
+              </w:rPr>
+              <w:t>1</w:t>
+            </w:r>
+          </w:p>
+        </w:tc>
+        <w:tc>
+          <w:tcPr>
+            <w:tcW w:type="dxa" w:w="1984"/>
+            <w:vAlign w:val="center"/>
+          </w:tcPr>
+          <w:p>
+            <w:pPr>
+              <w:pStyle w:val="Мойтекст"/>
+              <w:keepNext w:val="0"/>
+              <w:spacing w:before="80" w:after="80" w:line="240" w:lineRule="auto"/>
+              <w:ind w:firstLine="0" w:left="0"/>
+            </w:pPr>
+            <w:r>
+              <w:rPr>
+                <w:b w:val="0"/>
+                <w:sz w:val="18"/>
+              </w:rPr>
+              <w:t>0101</w:t>
+            </w:r>
+          </w:p>
+        </w:tc>
+        <w:tc>
+          <w:tcPr>
+            <w:tcW w:type="dxa" w:w="1871"/>
+            <w:vAlign w:val="center"/>
+          </w:tcPr>
+          <w:p>
+            <w:pPr>
+              <w:pStyle w:val="Мойтекст"/>
+              <w:keepNext w:val="0"/>
+              <w:spacing w:before="80" w:after="80" w:line="240" w:lineRule="auto"/>
+              <w:ind w:firstLine="0" w:left="0"/>
+            </w:pPr>
+            <w:r>
+              <w:rPr>
+                <w:b w:val="0"/>
+                <w:sz w:val="18"/>
+              </w:rPr>
+              <w:t>4</w:t>
+            </w:r>
+          </w:p>
+        </w:tc>
+        <w:tc>
+          <w:tcPr>
+            <w:tcW w:type="dxa" w:w="1871"/>
+            <w:vAlign w:val="center"/>
+          </w:tcPr>
+          <w:p>
+            <w:pPr>
+              <w:pStyle w:val="Мойтекст"/>
+              <w:keepNext w:val="0"/>
+              <w:spacing w:before="80" w:after="80" w:line="240" w:lineRule="auto"/>
+              <w:ind w:firstLine="0" w:left="0"/>
+            </w:pPr>
+            <w:r>
+              <w:rPr>
+                <w:b w:val="0"/>
+                <w:sz w:val="18"/>
+              </w:rPr>
+              <w:t>4</w:t>
+            </w:r>
+          </w:p>
+        </w:tc>
+      </w:tr>
+      <w:tr>
+        <w:trPr>
+          <w:cantSplit/>
+        </w:trPr>
+        <w:tc>
+          <w:tcPr>
+            <w:tcW w:type="dxa" w:w="1531"/>
+            <w:vAlign w:val="center"/>
+          </w:tcPr>
+          <w:p>
+            <w:pPr>
+              <w:pStyle w:val="Мойтекст"/>
+              <w:keepNext w:val="0"/>
+              <w:spacing w:before="80" w:after="80" w:line="240" w:lineRule="auto"/>
+              <w:ind w:firstLine="0" w:left="0"/>
+            </w:pPr>
+            <w:r>
+              <w:rPr>
+                <w:b w:val="0"/>
+                <w:sz w:val="18"/>
+              </w:rPr>
+              <w:t>Итого</w:t>
+            </w:r>
+          </w:p>
+        </w:tc>
+        <w:tc>
+          <w:tcPr>
+            <w:tcW w:type="dxa" w:w="1531"/>
+            <w:vAlign w:val="center"/>
+          </w:tcPr>
+          <w:p>
+            <w:pPr>
+              <w:pStyle w:val="Мойтекст"/>
+              <w:keepNext w:val="0"/>
+              <w:spacing w:before="80" w:after="80" w:line="240" w:lineRule="auto"/>
+              <w:ind w:firstLine="0" w:left="0"/>
+            </w:pPr>
+            <w:r>
+              <w:rPr>
+                <w:b w:val="0"/>
+                <w:sz w:val="18"/>
+              </w:rPr>
+              <w:t>26</w:t>
+            </w:r>
+          </w:p>
+        </w:tc>
+        <w:tc>
+          <w:tcPr>
+            <w:tcW w:type="dxa" w:w="1984"/>
+            <w:vAlign w:val="center"/>
+          </w:tcPr>
+          <w:p>
+            <w:pPr>
+              <w:pStyle w:val="Мойтекст"/>
+              <w:keepNext w:val="0"/>
+              <w:spacing w:before="80" w:after="80" w:line="240" w:lineRule="auto"/>
+              <w:ind w:firstLine="0" w:left="0"/>
+            </w:pPr>
+            <w:r>
+              <w:rPr>
+                <w:b w:val="0"/>
+                <w:sz w:val="18"/>
+              </w:rPr>
+              <w:t>—</w:t>
+            </w:r>
+          </w:p>
+        </w:tc>
+        <w:tc>
+          <w:tcPr>
+            <w:tcW w:type="dxa" w:w="1871"/>
+            <w:vAlign w:val="center"/>
+          </w:tcPr>
+          <w:p>
+            <w:pPr>
+              <w:pStyle w:val="Мойтекст"/>
+              <w:keepNext w:val="0"/>
+              <w:spacing w:before="80" w:after="80" w:line="240" w:lineRule="auto"/>
+              <w:ind w:firstLine="0" w:left="0"/>
+            </w:pPr>
+            <w:r>
+              <w:rPr>
+                <w:b w:val="0"/>
+                <w:sz w:val="18"/>
+              </w:rPr>
+              <w:t>—</w:t>
+            </w:r>
+          </w:p>
+        </w:tc>
+        <w:tc>
+          <w:tcPr>
+            <w:tcW w:type="dxa" w:w="1871"/>
+            <w:vAlign w:val="center"/>
+          </w:tcPr>
+          <w:p>
+            <w:pPr>
+              <w:pStyle w:val="Мойтекст"/>
+              <w:keepNext w:val="0"/>
+              <w:spacing w:before="80" w:after="80" w:line="240" w:lineRule="auto"/>
+              <w:ind w:firstLine="0" w:left="0"/>
+            </w:pPr>
+            <w:r>
+              <w:rPr>
+                <w:b w:val="0"/>
+                <w:sz w:val="18"/>
+              </w:rPr>
+              <w:t>92</w:t>
+            </w:r>
+          </w:p>
+        </w:tc>
+      </w:tr>
+    </w:tbl>
+    <w:p>
+      <w:pPr>
+        <w:pStyle w:val="Мойтекст"/>
+        <w:spacing w:after="100"/>
+      </w:pPr>
+      <w:r>
+        <w:t>Подстановка кодов в исходную строку даёт следующую последовательность. Пробелы между кодами и переводы строк добавлены для наглядности и в размер битовой последовательности не входят; 1100 кодирует настоящий пробел между частями ФИО.</w:t>
+      </w:r>
+    </w:p>
+    <w:p>
+      <w:pPr>
+        <w:pStyle w:val="Мойтекст"/>
+        <w:spacing w:before="80" w:after="100"/>
+        <w:ind w:firstLine="0" w:left="0"/>
+      </w:pPr>
+      <w:r>
+        <w:rPr>
+          <w:rFonts w:ascii="Courier New" w:hAnsi="Courier New"/>
+          <w:sz w:val="16"/>
+        </w:rPr>
+        <w:t>1101 011 0001 101 100 0100 1110 0010 101 100 011</w:t>
+        <w:br/>
+        <w:t>1100</w:t>
+        <w:br/>
+        <w:t>1101 101 0011 1110 0101</w:t>
+        <w:br/>
+        <w:t>1100</w:t>
+        <w:br/>
+        <w:t>0000 100 011 1111 101 100 1111 011</w:t>
+      </w:r>
+    </w:p>
+    <w:p>
+      <w:pPr>
+        <w:pStyle w:val="Мойтекст"/>
+        <w:spacing w:after="100"/>
+      </w:pPr>
+      <w:r>
+        <w:t>Объём полезных данных: 3 × 4 × 3 + 4 × 2 × 4 + 6 × 1 × 4 = 36 + 32 + 24 = 92 бита. Коэффициент: 92 / 208 × 100 % = 44,23 %. Уменьшение объёма полезных данных: 55,77 %. При сохранении целыми байтами требуются 12 байт, или 96 бит, включая четыре бита дополнения; коэффициент тогда равен 12 / 26 × 100 % = 46,15 %.</w:t>
+      </w:r>
+    </w:p>
+    <w:p>
+      <w:pPr>
+        <w:pStyle w:val="Мойтекст"/>
+        <w:spacing w:after="100"/>
+      </w:pPr>
+      <w:r>
+        <w:t>Таблица кодов и служебные данные декодирования в эти размеры не включены. Для короткой строки их хранение может сделать итоговый файл больше исходного. Если исходный текст хранится в UTF-8 без BOM, он занимает 50 байт (24 кириллических символа по два байта и два пробела по одному); коэффициенты относительно такого оригинала будут другими. В данном сравнении последовательно используется Windows-1251.</w:t>
+      </w:r>
+    </w:p>
+    <w:tbl>
+      <w:tblPr>
+        <w:tblStyle w:val="TableGrid"/>
+        <w:tblW w:type="auto" w:w="0"/>
+        <w:jc w:val="center"/>
+        <w:tblLayout w:type="fixed"/>
+        <w:tblLook w:firstColumn="1" w:firstRow="1" w:lastColumn="0" w:lastRow="0" w:noHBand="0" w:noVBand="1" w:val="04A0"/>
+      </w:tblPr>
+      <w:tblGrid>
+        <w:gridCol w:w="3118"/>
+        <w:gridCol w:w="1531"/>
+        <w:gridCol w:w="1587"/>
+        <w:gridCol w:w="2551"/>
+      </w:tblGrid>
+      <w:tr>
+        <w:trPr>
+          <w:cantSplit/>
+          <w:tblHeader/>
+        </w:trPr>
+        <w:tc>
+          <w:tcPr>
+            <w:tcW w:type="dxa" w:w="3118"/>
+            <w:vAlign w:val="center"/>
+            <w:shd w:fill="E8EEF5"/>
+          </w:tcPr>
+          <w:p>
+            <w:pPr>
+              <w:pStyle w:val="Мойтекст"/>
+              <w:keepNext/>
+              <w:spacing w:before="80" w:after="80" w:line="240" w:lineRule="auto"/>
+              <w:ind w:firstLine="0" w:left="0"/>
+            </w:pPr>
+            <w:r>
+              <w:rPr>
+                <w:b/>
+                <w:sz w:val="18"/>
+              </w:rPr>
+              <w:t>Представление</w:t>
+            </w:r>
+          </w:p>
+        </w:tc>
+        <w:tc>
+          <w:tcPr>
+            <w:tcW w:type="dxa" w:w="1531"/>
+            <w:vAlign w:val="center"/>
+            <w:shd w:fill="E8EEF5"/>
+          </w:tcPr>
+          <w:p>
+            <w:pPr>
+              <w:pStyle w:val="Мойтекст"/>
+              <w:keepNext/>
+              <w:spacing w:before="80" w:after="80" w:line="240" w:lineRule="auto"/>
+              <w:ind w:firstLine="0" w:left="0"/>
+            </w:pPr>
+            <w:r>
+              <w:rPr>
+                <w:b/>
+                <w:sz w:val="18"/>
+              </w:rPr>
+              <w:t>Объём, бит</w:t>
+            </w:r>
+          </w:p>
+        </w:tc>
+        <w:tc>
+          <w:tcPr>
+            <w:tcW w:type="dxa" w:w="1587"/>
+            <w:vAlign w:val="center"/>
+            <w:shd w:fill="E8EEF5"/>
+          </w:tcPr>
+          <w:p>
+            <w:pPr>
+              <w:pStyle w:val="Мойтекст"/>
+              <w:keepNext/>
+              <w:spacing w:before="80" w:after="80" w:line="240" w:lineRule="auto"/>
+              <w:ind w:firstLine="0" w:left="0"/>
+            </w:pPr>
+            <w:r>
+              <w:rPr>
+                <w:b/>
+                <w:sz w:val="18"/>
+              </w:rPr>
+              <w:t>Объём, байт</w:t>
+            </w:r>
+          </w:p>
+        </w:tc>
+        <w:tc>
+          <w:tcPr>
+            <w:tcW w:type="dxa" w:w="2551"/>
+            <w:vAlign w:val="center"/>
+            <w:shd w:fill="E8EEF5"/>
+          </w:tcPr>
+          <w:p>
+            <w:pPr>
+              <w:pStyle w:val="Мойтекст"/>
+              <w:keepNext/>
+              <w:spacing w:before="80" w:after="80" w:line="240" w:lineRule="auto"/>
+              <w:ind w:firstLine="0" w:left="0"/>
+            </w:pPr>
+            <w:r>
+              <w:rPr>
+                <w:b/>
+                <w:sz w:val="18"/>
+              </w:rPr>
+              <w:t>Результат / оригинал, %</w:t>
+            </w:r>
+          </w:p>
+        </w:tc>
+      </w:tr>
+      <w:tr>
+        <w:trPr>
+          <w:cantSplit/>
+        </w:trPr>
+        <w:tc>
+          <w:tcPr>
+            <w:tcW w:type="dxa" w:w="3118"/>
+            <w:vAlign w:val="center"/>
+          </w:tcPr>
+          <w:p>
+            <w:pPr>
+              <w:pStyle w:val="Мойтекст"/>
+              <w:keepNext w:val="0"/>
+              <w:spacing w:before="80" w:after="80" w:line="240" w:lineRule="auto"/>
+              <w:ind w:firstLine="0" w:left="0"/>
+            </w:pPr>
+            <w:r>
+              <w:rPr>
+                <w:b w:val="0"/>
+                <w:sz w:val="18"/>
+              </w:rPr>
+              <w:t>Оригинал Windows-1251</w:t>
+            </w:r>
+          </w:p>
+        </w:tc>
+        <w:tc>
+          <w:tcPr>
+            <w:tcW w:type="dxa" w:w="1531"/>
+            <w:vAlign w:val="center"/>
+          </w:tcPr>
+          <w:p>
+            <w:pPr>
+              <w:pStyle w:val="Мойтекст"/>
+              <w:keepNext w:val="0"/>
+              <w:spacing w:before="80" w:after="80" w:line="240" w:lineRule="auto"/>
+              <w:ind w:firstLine="0" w:left="0"/>
+            </w:pPr>
+            <w:r>
+              <w:rPr>
+                <w:b w:val="0"/>
+                <w:sz w:val="18"/>
+              </w:rPr>
+              <w:t>208</w:t>
+            </w:r>
+          </w:p>
+        </w:tc>
+        <w:tc>
+          <w:tcPr>
+            <w:tcW w:type="dxa" w:w="1587"/>
+            <w:vAlign w:val="center"/>
+          </w:tcPr>
+          <w:p>
+            <w:pPr>
+              <w:pStyle w:val="Мойтекст"/>
+              <w:keepNext w:val="0"/>
+              <w:spacing w:before="80" w:after="80" w:line="240" w:lineRule="auto"/>
+              <w:ind w:firstLine="0" w:left="0"/>
+            </w:pPr>
+            <w:r>
+              <w:rPr>
+                <w:b w:val="0"/>
+                <w:sz w:val="18"/>
+              </w:rPr>
+              <w:t>26</w:t>
+            </w:r>
+          </w:p>
+        </w:tc>
+        <w:tc>
+          <w:tcPr>
+            <w:tcW w:type="dxa" w:w="2551"/>
+            <w:vAlign w:val="center"/>
+          </w:tcPr>
+          <w:p>
+            <w:pPr>
+              <w:pStyle w:val="Мойтекст"/>
+              <w:keepNext w:val="0"/>
+              <w:spacing w:before="80" w:after="80" w:line="240" w:lineRule="auto"/>
+              <w:ind w:firstLine="0" w:left="0"/>
+            </w:pPr>
+            <w:r>
+              <w:rPr>
+                <w:b w:val="0"/>
+                <w:sz w:val="18"/>
+              </w:rPr>
+              <w:t>100,00</w:t>
+            </w:r>
+          </w:p>
+        </w:tc>
+      </w:tr>
+      <w:tr>
+        <w:trPr>
+          <w:cantSplit/>
+        </w:trPr>
+        <w:tc>
+          <w:tcPr>
+            <w:tcW w:type="dxa" w:w="3118"/>
+            <w:vAlign w:val="center"/>
+          </w:tcPr>
+          <w:p>
+            <w:pPr>
+              <w:pStyle w:val="Мойтекст"/>
+              <w:keepNext w:val="0"/>
+              <w:spacing w:before="80" w:after="80" w:line="240" w:lineRule="auto"/>
+              <w:ind w:firstLine="0" w:left="0"/>
+            </w:pPr>
+            <w:r>
+              <w:rPr>
+                <w:b w:val="0"/>
+                <w:sz w:val="18"/>
+              </w:rPr>
+              <w:t>RLE: символ + счётчик</w:t>
+            </w:r>
+          </w:p>
+        </w:tc>
+        <w:tc>
+          <w:tcPr>
+            <w:tcW w:type="dxa" w:w="1531"/>
+            <w:vAlign w:val="center"/>
+          </w:tcPr>
+          <w:p>
+            <w:pPr>
+              <w:pStyle w:val="Мойтекст"/>
+              <w:keepNext w:val="0"/>
+              <w:spacing w:before="80" w:after="80" w:line="240" w:lineRule="auto"/>
+              <w:ind w:firstLine="0" w:left="0"/>
+            </w:pPr>
+            <w:r>
+              <w:rPr>
+                <w:b w:val="0"/>
+                <w:sz w:val="18"/>
+              </w:rPr>
+              <w:t>416</w:t>
+            </w:r>
+          </w:p>
+        </w:tc>
+        <w:tc>
+          <w:tcPr>
+            <w:tcW w:type="dxa" w:w="1587"/>
+            <w:vAlign w:val="center"/>
+          </w:tcPr>
+          <w:p>
+            <w:pPr>
+              <w:pStyle w:val="Мойтекст"/>
+              <w:keepNext w:val="0"/>
+              <w:spacing w:before="80" w:after="80" w:line="240" w:lineRule="auto"/>
+              <w:ind w:firstLine="0" w:left="0"/>
+            </w:pPr>
+            <w:r>
+              <w:rPr>
+                <w:b w:val="0"/>
+                <w:sz w:val="18"/>
+              </w:rPr>
+              <w:t>52</w:t>
+            </w:r>
+          </w:p>
+        </w:tc>
+        <w:tc>
+          <w:tcPr>
+            <w:tcW w:type="dxa" w:w="2551"/>
+            <w:vAlign w:val="center"/>
+          </w:tcPr>
+          <w:p>
+            <w:pPr>
+              <w:pStyle w:val="Мойтекст"/>
+              <w:keepNext w:val="0"/>
+              <w:spacing w:before="80" w:after="80" w:line="240" w:lineRule="auto"/>
+              <w:ind w:firstLine="0" w:left="0"/>
+            </w:pPr>
+            <w:r>
+              <w:rPr>
+                <w:b w:val="0"/>
+                <w:sz w:val="18"/>
+              </w:rPr>
+              <w:t>200,00</w:t>
+            </w:r>
+          </w:p>
+        </w:tc>
+      </w:tr>
+      <w:tr>
+        <w:trPr>
+          <w:cantSplit/>
+        </w:trPr>
+        <w:tc>
+          <w:tcPr>
+            <w:tcW w:type="dxa" w:w="3118"/>
+            <w:vAlign w:val="center"/>
+          </w:tcPr>
+          <w:p>
+            <w:pPr>
+              <w:pStyle w:val="Мойтекст"/>
+              <w:keepNext w:val="0"/>
+              <w:spacing w:before="80" w:after="80" w:line="240" w:lineRule="auto"/>
+              <w:ind w:firstLine="0" w:left="0"/>
+            </w:pPr>
+            <w:r>
+              <w:rPr>
+                <w:b w:val="0"/>
+                <w:sz w:val="18"/>
+              </w:rPr>
+              <w:t>Хаффман: полезные биты</w:t>
+            </w:r>
+          </w:p>
+        </w:tc>
+        <w:tc>
+          <w:tcPr>
+            <w:tcW w:type="dxa" w:w="1531"/>
+            <w:vAlign w:val="center"/>
+          </w:tcPr>
+          <w:p>
+            <w:pPr>
+              <w:pStyle w:val="Мойтекст"/>
+              <w:keepNext w:val="0"/>
+              <w:spacing w:before="80" w:after="80" w:line="240" w:lineRule="auto"/>
+              <w:ind w:firstLine="0" w:left="0"/>
+            </w:pPr>
+            <w:r>
+              <w:rPr>
+                <w:b w:val="0"/>
+                <w:sz w:val="18"/>
+              </w:rPr>
+              <w:t>92</w:t>
+            </w:r>
+          </w:p>
+        </w:tc>
+        <w:tc>
+          <w:tcPr>
+            <w:tcW w:type="dxa" w:w="1587"/>
+            <w:vAlign w:val="center"/>
+          </w:tcPr>
+          <w:p>
+            <w:pPr>
+              <w:pStyle w:val="Мойтекст"/>
+              <w:keepNext w:val="0"/>
+              <w:spacing w:before="80" w:after="80" w:line="240" w:lineRule="auto"/>
+              <w:ind w:firstLine="0" w:left="0"/>
+            </w:pPr>
+            <w:r>
+              <w:rPr>
+                <w:b w:val="0"/>
+                <w:sz w:val="18"/>
+              </w:rPr>
+              <w:t>11,5</w:t>
+            </w:r>
+          </w:p>
+        </w:tc>
+        <w:tc>
+          <w:tcPr>
+            <w:tcW w:type="dxa" w:w="2551"/>
+            <w:vAlign w:val="center"/>
+          </w:tcPr>
+          <w:p>
+            <w:pPr>
+              <w:pStyle w:val="Мойтекст"/>
+              <w:keepNext w:val="0"/>
+              <w:spacing w:before="80" w:after="80" w:line="240" w:lineRule="auto"/>
+              <w:ind w:firstLine="0" w:left="0"/>
+            </w:pPr>
+            <w:r>
+              <w:rPr>
+                <w:b w:val="0"/>
+                <w:sz w:val="18"/>
+              </w:rPr>
+              <w:t>44,23</w:t>
+            </w:r>
+          </w:p>
+        </w:tc>
+      </w:tr>
+      <w:tr>
+        <w:trPr>
+          <w:cantSplit/>
+        </w:trPr>
+        <w:tc>
+          <w:tcPr>
+            <w:tcW w:type="dxa" w:w="3118"/>
+            <w:vAlign w:val="center"/>
+          </w:tcPr>
+          <w:p>
+            <w:pPr>
+              <w:pStyle w:val="Мойтекст"/>
+              <w:keepNext w:val="0"/>
+              <w:spacing w:before="80" w:after="80" w:line="240" w:lineRule="auto"/>
+              <w:ind w:firstLine="0" w:left="0"/>
+            </w:pPr>
+            <w:r>
+              <w:rPr>
+                <w:b w:val="0"/>
+                <w:sz w:val="18"/>
+              </w:rPr>
+              <w:t>Хаффман: с дополнением</w:t>
+            </w:r>
+          </w:p>
+        </w:tc>
+        <w:tc>
+          <w:tcPr>
+            <w:tcW w:type="dxa" w:w="1531"/>
+            <w:vAlign w:val="center"/>
+          </w:tcPr>
+          <w:p>
+            <w:pPr>
+              <w:pStyle w:val="Мойтекст"/>
+              <w:keepNext w:val="0"/>
+              <w:spacing w:before="80" w:after="80" w:line="240" w:lineRule="auto"/>
+              <w:ind w:firstLine="0" w:left="0"/>
+            </w:pPr>
+            <w:r>
+              <w:rPr>
+                <w:b w:val="0"/>
+                <w:sz w:val="18"/>
+              </w:rPr>
+              <w:t>96</w:t>
+            </w:r>
+          </w:p>
+        </w:tc>
+        <w:tc>
+          <w:tcPr>
+            <w:tcW w:type="dxa" w:w="1587"/>
+            <w:vAlign w:val="center"/>
+          </w:tcPr>
+          <w:p>
+            <w:pPr>
+              <w:pStyle w:val="Мойтекст"/>
+              <w:keepNext w:val="0"/>
+              <w:spacing w:before="80" w:after="80" w:line="240" w:lineRule="auto"/>
+              <w:ind w:firstLine="0" w:left="0"/>
+            </w:pPr>
+            <w:r>
+              <w:rPr>
+                <w:b w:val="0"/>
+                <w:sz w:val="18"/>
+              </w:rPr>
+              <w:t>12</w:t>
+            </w:r>
+          </w:p>
+        </w:tc>
+        <w:tc>
+          <w:tcPr>
+            <w:tcW w:type="dxa" w:w="2551"/>
+            <w:vAlign w:val="center"/>
+          </w:tcPr>
+          <w:p>
+            <w:pPr>
+              <w:pStyle w:val="Мойтекст"/>
+              <w:keepNext w:val="0"/>
+              <w:spacing w:before="80" w:after="80" w:line="240" w:lineRule="auto"/>
+              <w:ind w:firstLine="0" w:left="0"/>
+            </w:pPr>
+            <w:r>
+              <w:rPr>
+                <w:b w:val="0"/>
+                <w:sz w:val="18"/>
+              </w:rPr>
+              <w:t>46,15</w:t>
+            </w:r>
+          </w:p>
+        </w:tc>
+      </w:tr>
+    </w:tbl>
+    <w:p>
+      <w:pPr>
+        <w:pStyle w:val="Мойтекст"/>
+        <w:spacing w:after="100"/>
+      </w:pPr>
+      <w:r>
+        <w:t>Вывод: выбранный RLE не подходит для данного ФИО из-за отсутствия серий одинаковых соседних символов. Хаффман уменьшает объём полезной последовательности за счёт более коротких кодов для частых символов; выигрыш готового файла зависит от способа хранения таблицы кодов и заголовков.</w:t>
+      </w:r>
+    </w:p>
+    <w:p>
+      <w:bookmarkStart w:id="815" w:name="lab3_15"/>
+      <w:pPr>
+        <w:pStyle w:val="Heading1"/>
+        <w:pageBreakBefore/>
       </w:pPr>
       <w:r>
         <w:t>Выводы</w:t>
       </w:r>
-      <w:bookmarkEnd w:id="809"/>
+      <w:bookmarkEnd w:id="815"/>
     </w:p>
     <w:p>
       <w:pPr>
@@ -4967,15 +9268,23 @@
       </w:r>
     </w:p>
     <w:p>
-      <w:bookmarkStart w:id="810" w:name="lab3_10"/>
+      <w:pPr>
+        <w:pStyle w:val="Мойтекст"/>
+        <w:spacing w:after="100"/>
+      </w:pPr>
+      <w:r>
+        <w:t>Увеличение словаря с 16 до 128 МБ не улучшило сжатие TXT; максимальный словарь оказался недоступен по памяти. Максимальный уровень сжатия почти не изменил размеры PIC и VID. Для SMALL наименьший размер дал Solid, а SFX увеличил размер обычного архива на 190 КБ. Для ФИО выбранный RLE увеличил объём, тогда как Хаффман сократил полезную последовательность до 92 бит без учёта таблицы кодов.</w:t>
+      </w:r>
+    </w:p>
+    <w:p>
+      <w:bookmarkStart w:id="816" w:name="lab3_16"/>
       <w:pPr>
         <w:pStyle w:val="Heading1"/>
-        <w:pageBreakBefore/>
       </w:pPr>
       <w:r>
         <w:t>Архивы для проверки</w:t>
       </w:r>
-      <w:bookmarkEnd w:id="810"/>
+      <w:bookmarkEnd w:id="816"/>
     </w:p>
     <w:p>
       <w:pPr>

</xml_diff>

<commit_message>
Insert all lab 3 screenshots and update evidence descriptions
</commit_message>
<xml_diff>
--- a/lab3_450389.docx
+++ b/lab3_450389.docx
@@ -398,6 +398,7 @@
       <w:bookmarkStart w:id="801" w:name="lab3_1"/>
       <w:pPr>
         <w:pStyle w:val="Heading1"/>
+        <w:pageBreakBefore w:val="0"/>
       </w:pPr>
       <w:r>
         <w:t>Задание 1. Подготовка материалов для работы</w:t>
@@ -741,7 +742,12 @@
                 <w:b w:val="0"/>
                 <w:sz w:val="18"/>
               </w:rPr>
-              <w:t>Фотографии .jpg</w:t>
+            </w:r>
+            <w:r>
+              <w:rPr>
+                <w:sz w:val="18"/>
+              </w:rPr>
+              <w:t>Изображения, включая PNG</w:t>
             </w:r>
           </w:p>
         </w:tc>
@@ -1062,7 +1068,7 @@
         <w:spacing w:after="100"/>
       </w:pPr>
       <w:r>
-        <w:t>Размер TXT принят равным 10 485 760 байт: пять файлов по 2 × 1024² байт, созданных командой из подготовки к работе. Его фактический размер необходимо сверить со свойствами каталога. Остальные исходные размеры указаны по предоставленным данным.</w:t>
+        <w:t>Для расчётов размер TXT принят равным 10 485 760 байт — объёму пяти созданных файлов по 2 × 1024² байт. На скриншоте FAR показано шесть файлов и округлённый объём 10,0 МБ; точный размер дополнительного файла на нём не указан. Остальные исходные размеры приведены по данным выполнения работы. На скриншотах показаны: DOC — 3 файла, PIC — 12, VID — 4, PRG — 3, SMALL — 10 548 файлов.</w:t>
       </w:r>
     </w:p>
     <w:p>
@@ -1080,7 +1086,7 @@
         <w:spacing w:after="100"/>
       </w:pPr>
       <w:r>
-        <w:t>Подтверждающие скриншоты: слева в FAR — список файлов в режиме «Краткий», справа — «Быстрый просмотр» со статистикой каталога. Ниже оставлены места для шести снимков; сами изображения для этой лабораторной пока не предоставлены.</w:t>
+        <w:t>Ниже приведены скриншоты каталогов в FAR: слева список файлов в режиме «Краткий», справа «Быстрый просмотр» с размером и количеством файлов. В PIC присутствуют в том числе PNG-изображения; результаты сжатия относятся к фактически подготовленному набору.</w:t>
       </w:r>
     </w:p>
     <w:p>
@@ -1096,42 +1102,49 @@
         <w:t>450389TXT</w:t>
       </w:r>
     </w:p>
-    <w:tbl>
-      <w:tblPr>
-        <w:tblStyle w:val="TableGrid"/>
-        <w:tblW w:type="auto" w:w="0"/>
+    <w:p>
+      <w:pPr>
+        <w:pStyle w:val="Мойтекст"/>
+        <w:keepNext/>
+        <w:spacing w:before="80" w:after="40"/>
+        <w:ind w:firstLine="0" w:left="0"/>
         <w:jc w:val="center"/>
-        <w:tblLook w:firstColumn="1" w:firstRow="1" w:lastColumn="0" w:lastRow="0" w:noHBand="0" w:noVBand="1" w:val="04A0"/>
-      </w:tblPr>
-      <w:tblGrid>
-        <w:gridCol w:w="9355"/>
-      </w:tblGrid>
-      <w:tr>
-        <w:trPr>
-          <w:trHeight w:val="2041"/>
-        </w:trPr>
-        <w:tc>
-          <w:tcPr>
-            <w:tcW w:type="dxa" w:w="9355"/>
-            <w:vAlign w:val="center"/>
-          </w:tcPr>
-          <w:p>
-            <w:pPr>
-              <w:pStyle w:val="Мойтекст"/>
-              <w:keepNext/>
-              <w:ind w:firstLine="0"/>
-              <w:jc w:val="center"/>
-            </w:pPr>
-            <w:r>
-              <w:rPr>
-                <w:i/>
-              </w:rPr>
-              <w:t>[Место для скриншота свойств каталога 450389TXT]</w:t>
-            </w:r>
-          </w:p>
-        </w:tc>
-      </w:tr>
-    </w:tbl>
+      </w:pPr>
+      <w:r>
+        <w:drawing>
+          <wp:inline xmlns:a="http://schemas.openxmlformats.org/drawingml/2006/main" xmlns:pic="http://schemas.openxmlformats.org/drawingml/2006/picture">
+            <wp:extent cx="5940000" cy="3183914"/>
+            <wp:docPr id="1" name="Picture 1"/>
+            <wp:cNvGraphicFramePr>
+              <a:graphicFrameLocks noChangeAspect="1"/>
+            </wp:cNvGraphicFramePr>
+            <a:graphic>
+              <a:graphicData uri="http://schemas.openxmlformats.org/drawingml/2006/picture">
+                <pic:pic>
+                  <pic:nvPicPr>
+                    <pic:cNvPr id="0" name="2.png"/>
+                    <pic:cNvPicPr/>
+                  </pic:nvPicPr>
+                  <pic:blipFill>
+                    <a:blip r:embed="rId10"/>
+                    <a:stretch>
+                      <a:fillRect/>
+                    </a:stretch>
+                  </pic:blipFill>
+                  <pic:spPr>
+                    <a:xfrm>
+                      <a:off x="0" y="0"/>
+                      <a:ext cx="5940000" cy="3183914"/>
+                    </a:xfrm>
+                    <a:prstGeom prst="rect"/>
+                  </pic:spPr>
+                </pic:pic>
+              </a:graphicData>
+            </a:graphic>
+          </wp:inline>
+        </w:drawing>
+      </w:r>
+    </w:p>
     <w:p>
       <w:pPr>
         <w:pStyle w:val="Мояподпись"/>
@@ -1154,42 +1167,49 @@
         <w:t>450389DOC</w:t>
       </w:r>
     </w:p>
-    <w:tbl>
-      <w:tblPr>
-        <w:tblStyle w:val="TableGrid"/>
-        <w:tblW w:type="auto" w:w="0"/>
+    <w:p>
+      <w:pPr>
+        <w:pStyle w:val="Мойтекст"/>
+        <w:keepNext/>
+        <w:spacing w:before="80" w:after="40"/>
+        <w:ind w:firstLine="0" w:left="0"/>
         <w:jc w:val="center"/>
-        <w:tblLook w:firstColumn="1" w:firstRow="1" w:lastColumn="0" w:lastRow="0" w:noHBand="0" w:noVBand="1" w:val="04A0"/>
-      </w:tblPr>
-      <w:tblGrid>
-        <w:gridCol w:w="9355"/>
-      </w:tblGrid>
-      <w:tr>
-        <w:trPr>
-          <w:trHeight w:val="2041"/>
-        </w:trPr>
-        <w:tc>
-          <w:tcPr>
-            <w:tcW w:type="dxa" w:w="9355"/>
-            <w:vAlign w:val="center"/>
-          </w:tcPr>
-          <w:p>
-            <w:pPr>
-              <w:pStyle w:val="Мойтекст"/>
-              <w:keepNext/>
-              <w:ind w:firstLine="0"/>
-              <w:jc w:val="center"/>
-            </w:pPr>
-            <w:r>
-              <w:rPr>
-                <w:i/>
-              </w:rPr>
-              <w:t>[Место для скриншота свойств каталога 450389DOC]</w:t>
-            </w:r>
-          </w:p>
-        </w:tc>
-      </w:tr>
-    </w:tbl>
+      </w:pPr>
+      <w:r>
+        <w:drawing>
+          <wp:inline xmlns:a="http://schemas.openxmlformats.org/drawingml/2006/main" xmlns:pic="http://schemas.openxmlformats.org/drawingml/2006/picture">
+            <wp:extent cx="5940000" cy="3186788"/>
+            <wp:docPr id="2" name="Picture 2"/>
+            <wp:cNvGraphicFramePr>
+              <a:graphicFrameLocks noChangeAspect="1"/>
+            </wp:cNvGraphicFramePr>
+            <a:graphic>
+              <a:graphicData uri="http://schemas.openxmlformats.org/drawingml/2006/picture">
+                <pic:pic>
+                  <pic:nvPicPr>
+                    <pic:cNvPr id="0" name="13.png"/>
+                    <pic:cNvPicPr/>
+                  </pic:nvPicPr>
+                  <pic:blipFill>
+                    <a:blip r:embed="rId11"/>
+                    <a:stretch>
+                      <a:fillRect/>
+                    </a:stretch>
+                  </pic:blipFill>
+                  <pic:spPr>
+                    <a:xfrm>
+                      <a:off x="0" y="0"/>
+                      <a:ext cx="5940000" cy="3186788"/>
+                    </a:xfrm>
+                    <a:prstGeom prst="rect"/>
+                  </pic:spPr>
+                </pic:pic>
+              </a:graphicData>
+            </a:graphic>
+          </wp:inline>
+        </w:drawing>
+      </w:r>
+    </w:p>
     <w:p>
       <w:pPr>
         <w:pStyle w:val="Мояподпись"/>
@@ -1212,42 +1232,49 @@
         <w:t>450389PIC</w:t>
       </w:r>
     </w:p>
-    <w:tbl>
-      <w:tblPr>
-        <w:tblStyle w:val="TableGrid"/>
-        <w:tblW w:type="auto" w:w="0"/>
+    <w:p>
+      <w:pPr>
+        <w:pStyle w:val="Мойтекст"/>
+        <w:keepNext/>
+        <w:spacing w:before="80" w:after="40"/>
+        <w:ind w:firstLine="0" w:left="0"/>
         <w:jc w:val="center"/>
-        <w:tblLook w:firstColumn="1" w:firstRow="1" w:lastColumn="0" w:lastRow="0" w:noHBand="0" w:noVBand="1" w:val="04A0"/>
-      </w:tblPr>
-      <w:tblGrid>
-        <w:gridCol w:w="9355"/>
-      </w:tblGrid>
-      <w:tr>
-        <w:trPr>
-          <w:trHeight w:val="2041"/>
-        </w:trPr>
-        <w:tc>
-          <w:tcPr>
-            <w:tcW w:type="dxa" w:w="9355"/>
-            <w:vAlign w:val="center"/>
-          </w:tcPr>
-          <w:p>
-            <w:pPr>
-              <w:pStyle w:val="Мойтекст"/>
-              <w:keepNext/>
-              <w:ind w:firstLine="0"/>
-              <w:jc w:val="center"/>
-            </w:pPr>
-            <w:r>
-              <w:rPr>
-                <w:i/>
-              </w:rPr>
-              <w:t>[Место для скриншота свойств каталога 450389PIC]</w:t>
-            </w:r>
-          </w:p>
-        </w:tc>
-      </w:tr>
-    </w:tbl>
+      </w:pPr>
+      <w:r>
+        <w:drawing>
+          <wp:inline xmlns:a="http://schemas.openxmlformats.org/drawingml/2006/main" xmlns:pic="http://schemas.openxmlformats.org/drawingml/2006/picture">
+            <wp:extent cx="5940000" cy="3194883"/>
+            <wp:docPr id="3" name="Picture 3"/>
+            <wp:cNvGraphicFramePr>
+              <a:graphicFrameLocks noChangeAspect="1"/>
+            </wp:cNvGraphicFramePr>
+            <a:graphic>
+              <a:graphicData uri="http://schemas.openxmlformats.org/drawingml/2006/picture">
+                <pic:pic>
+                  <pic:nvPicPr>
+                    <pic:cNvPr id="0" name="1.png"/>
+                    <pic:cNvPicPr/>
+                  </pic:nvPicPr>
+                  <pic:blipFill>
+                    <a:blip r:embed="rId12"/>
+                    <a:stretch>
+                      <a:fillRect/>
+                    </a:stretch>
+                  </pic:blipFill>
+                  <pic:spPr>
+                    <a:xfrm>
+                      <a:off x="0" y="0"/>
+                      <a:ext cx="5940000" cy="3194883"/>
+                    </a:xfrm>
+                    <a:prstGeom prst="rect"/>
+                  </pic:spPr>
+                </pic:pic>
+              </a:graphicData>
+            </a:graphic>
+          </wp:inline>
+        </w:drawing>
+      </w:r>
+    </w:p>
     <w:p>
       <w:pPr>
         <w:pStyle w:val="Мояподпись"/>
@@ -1270,42 +1297,49 @@
         <w:t>450389VID</w:t>
       </w:r>
     </w:p>
-    <w:tbl>
-      <w:tblPr>
-        <w:tblStyle w:val="TableGrid"/>
-        <w:tblW w:type="auto" w:w="0"/>
+    <w:p>
+      <w:pPr>
+        <w:pStyle w:val="Мойтекст"/>
+        <w:keepNext/>
+        <w:spacing w:before="80" w:after="40"/>
+        <w:ind w:firstLine="0" w:left="0"/>
         <w:jc w:val="center"/>
-        <w:tblLook w:firstColumn="1" w:firstRow="1" w:lastColumn="0" w:lastRow="0" w:noHBand="0" w:noVBand="1" w:val="04A0"/>
-      </w:tblPr>
-      <w:tblGrid>
-        <w:gridCol w:w="9355"/>
-      </w:tblGrid>
-      <w:tr>
-        <w:trPr>
-          <w:trHeight w:val="2041"/>
-        </w:trPr>
-        <w:tc>
-          <w:tcPr>
-            <w:tcW w:type="dxa" w:w="9355"/>
-            <w:vAlign w:val="center"/>
-          </w:tcPr>
-          <w:p>
-            <w:pPr>
-              <w:pStyle w:val="Мойтекст"/>
-              <w:keepNext/>
-              <w:ind w:firstLine="0"/>
-              <w:jc w:val="center"/>
-            </w:pPr>
-            <w:r>
-              <w:rPr>
-                <w:i/>
-              </w:rPr>
-              <w:t>[Место для скриншота свойств каталога 450389VID]</w:t>
-            </w:r>
-          </w:p>
-        </w:tc>
-      </w:tr>
-    </w:tbl>
+      </w:pPr>
+      <w:r>
+        <w:drawing>
+          <wp:inline xmlns:a="http://schemas.openxmlformats.org/drawingml/2006/main" xmlns:pic="http://schemas.openxmlformats.org/drawingml/2006/picture">
+            <wp:extent cx="5940000" cy="3188451"/>
+            <wp:docPr id="4" name="Picture 4"/>
+            <wp:cNvGraphicFramePr>
+              <a:graphicFrameLocks noChangeAspect="1"/>
+            </wp:cNvGraphicFramePr>
+            <a:graphic>
+              <a:graphicData uri="http://schemas.openxmlformats.org/drawingml/2006/picture">
+                <pic:pic>
+                  <pic:nvPicPr>
+                    <pic:cNvPr id="0" name="3.png"/>
+                    <pic:cNvPicPr/>
+                  </pic:nvPicPr>
+                  <pic:blipFill>
+                    <a:blip r:embed="rId13"/>
+                    <a:stretch>
+                      <a:fillRect/>
+                    </a:stretch>
+                  </pic:blipFill>
+                  <pic:spPr>
+                    <a:xfrm>
+                      <a:off x="0" y="0"/>
+                      <a:ext cx="5940000" cy="3188451"/>
+                    </a:xfrm>
+                    <a:prstGeom prst="rect"/>
+                  </pic:spPr>
+                </pic:pic>
+              </a:graphicData>
+            </a:graphic>
+          </wp:inline>
+        </w:drawing>
+      </w:r>
+    </w:p>
     <w:p>
       <w:pPr>
         <w:pStyle w:val="Мояподпись"/>
@@ -1328,42 +1362,49 @@
         <w:t>450389PRG</w:t>
       </w:r>
     </w:p>
-    <w:tbl>
-      <w:tblPr>
-        <w:tblStyle w:val="TableGrid"/>
-        <w:tblW w:type="auto" w:w="0"/>
+    <w:p>
+      <w:pPr>
+        <w:pStyle w:val="Мойтекст"/>
+        <w:keepNext/>
+        <w:spacing w:before="80" w:after="40"/>
+        <w:ind w:firstLine="0" w:left="0"/>
         <w:jc w:val="center"/>
-        <w:tblLook w:firstColumn="1" w:firstRow="1" w:lastColumn="0" w:lastRow="0" w:noHBand="0" w:noVBand="1" w:val="04A0"/>
-      </w:tblPr>
-      <w:tblGrid>
-        <w:gridCol w:w="9355"/>
-      </w:tblGrid>
-      <w:tr>
-        <w:trPr>
-          <w:trHeight w:val="2041"/>
-        </w:trPr>
-        <w:tc>
-          <w:tcPr>
-            <w:tcW w:type="dxa" w:w="9355"/>
-            <w:vAlign w:val="center"/>
-          </w:tcPr>
-          <w:p>
-            <w:pPr>
-              <w:pStyle w:val="Мойтекст"/>
-              <w:keepNext/>
-              <w:ind w:firstLine="0"/>
-              <w:jc w:val="center"/>
-            </w:pPr>
-            <w:r>
-              <w:rPr>
-                <w:i/>
-              </w:rPr>
-              <w:t>[Место для скриншота свойств каталога 450389PRG]</w:t>
-            </w:r>
-          </w:p>
-        </w:tc>
-      </w:tr>
-    </w:tbl>
+      </w:pPr>
+      <w:r>
+        <w:drawing>
+          <wp:inline xmlns:a="http://schemas.openxmlformats.org/drawingml/2006/main" xmlns:pic="http://schemas.openxmlformats.org/drawingml/2006/picture">
+            <wp:extent cx="5940000" cy="3200136"/>
+            <wp:docPr id="5" name="Picture 5"/>
+            <wp:cNvGraphicFramePr>
+              <a:graphicFrameLocks noChangeAspect="1"/>
+            </wp:cNvGraphicFramePr>
+            <a:graphic>
+              <a:graphicData uri="http://schemas.openxmlformats.org/drawingml/2006/picture">
+                <pic:pic>
+                  <pic:nvPicPr>
+                    <pic:cNvPr id="0" name="0.png"/>
+                    <pic:cNvPicPr/>
+                  </pic:nvPicPr>
+                  <pic:blipFill>
+                    <a:blip r:embed="rId14"/>
+                    <a:stretch>
+                      <a:fillRect/>
+                    </a:stretch>
+                  </pic:blipFill>
+                  <pic:spPr>
+                    <a:xfrm>
+                      <a:off x="0" y="0"/>
+                      <a:ext cx="5940000" cy="3200136"/>
+                    </a:xfrm>
+                    <a:prstGeom prst="rect"/>
+                  </pic:spPr>
+                </pic:pic>
+              </a:graphicData>
+            </a:graphic>
+          </wp:inline>
+        </w:drawing>
+      </w:r>
+    </w:p>
     <w:p>
       <w:pPr>
         <w:pStyle w:val="Мояподпись"/>
@@ -1386,42 +1427,49 @@
         <w:t>450389SMALL</w:t>
       </w:r>
     </w:p>
-    <w:tbl>
-      <w:tblPr>
-        <w:tblStyle w:val="TableGrid"/>
-        <w:tblW w:type="auto" w:w="0"/>
+    <w:p>
+      <w:pPr>
+        <w:pStyle w:val="Мойтекст"/>
+        <w:keepNext/>
+        <w:spacing w:before="80" w:after="40"/>
+        <w:ind w:firstLine="0" w:left="0"/>
         <w:jc w:val="center"/>
-        <w:tblLook w:firstColumn="1" w:firstRow="1" w:lastColumn="0" w:lastRow="0" w:noHBand="0" w:noVBand="1" w:val="04A0"/>
-      </w:tblPr>
-      <w:tblGrid>
-        <w:gridCol w:w="9355"/>
-      </w:tblGrid>
-      <w:tr>
-        <w:trPr>
-          <w:trHeight w:val="2041"/>
-        </w:trPr>
-        <w:tc>
-          <w:tcPr>
-            <w:tcW w:type="dxa" w:w="9355"/>
-            <w:vAlign w:val="center"/>
-          </w:tcPr>
-          <w:p>
-            <w:pPr>
-              <w:pStyle w:val="Мойтекст"/>
-              <w:keepNext/>
-              <w:ind w:firstLine="0"/>
-              <w:jc w:val="center"/>
-            </w:pPr>
-            <w:r>
-              <w:rPr>
-                <w:i/>
-              </w:rPr>
-              <w:t>[Место для скриншота свойств каталога 450389SMALL]</w:t>
-            </w:r>
-          </w:p>
-        </w:tc>
-      </w:tr>
-    </w:tbl>
+      </w:pPr>
+      <w:r>
+        <w:drawing>
+          <wp:inline xmlns:a="http://schemas.openxmlformats.org/drawingml/2006/main" xmlns:pic="http://schemas.openxmlformats.org/drawingml/2006/picture">
+            <wp:extent cx="5940000" cy="3198701"/>
+            <wp:docPr id="6" name="Picture 6"/>
+            <wp:cNvGraphicFramePr>
+              <a:graphicFrameLocks noChangeAspect="1"/>
+            </wp:cNvGraphicFramePr>
+            <a:graphic>
+              <a:graphicData uri="http://schemas.openxmlformats.org/drawingml/2006/picture">
+                <pic:pic>
+                  <pic:nvPicPr>
+                    <pic:cNvPr id="0" name="14.png"/>
+                    <pic:cNvPicPr/>
+                  </pic:nvPicPr>
+                  <pic:blipFill>
+                    <a:blip r:embed="rId15"/>
+                    <a:stretch>
+                      <a:fillRect/>
+                    </a:stretch>
+                  </pic:blipFill>
+                  <pic:spPr>
+                    <a:xfrm>
+                      <a:off x="0" y="0"/>
+                      <a:ext cx="5940000" cy="3198701"/>
+                    </a:xfrm>
+                    <a:prstGeom prst="rect"/>
+                  </pic:spPr>
+                </pic:pic>
+              </a:graphicData>
+            </a:graphic>
+          </wp:inline>
+        </w:drawing>
+      </w:r>
+    </w:p>
     <w:p>
       <w:pPr>
         <w:pStyle w:val="Мояподпись"/>
@@ -1432,14 +1480,10 @@
       </w:r>
     </w:p>
     <w:p>
-      <w:r>
-        <w:br w:type="page"/>
-      </w:r>
-    </w:p>
-    <w:p>
       <w:bookmarkStart w:id="802" w:name="lab3_2"/>
       <w:pPr>
         <w:pStyle w:val="Heading1"/>
+        <w:pageBreakBefore w:val="0"/>
       </w:pPr>
       <w:r>
         <w:t>Задание 2. Сравнительный анализ алгоритмов</w:t>
@@ -3252,7 +3296,7 @@
         <w:spacing w:after="100"/>
       </w:pPr>
       <w:r>
-        <w:t>По размеру лучшим оказался PPMd: 22 676 873 байта (92,00 %). При этом он потребовал 6 с, а Deflate — 0,1 с по предоставленным наблюдениям. Фотографии JPEG уже сжаты, поэтому дополнительное уменьшение размера ограничено. Преимущество PPMd относится к данному набору изображений.</w:t>
+        <w:t>По размеру лучшим оказался PPMd: 22 676 873 байта (92,00 %). При этом он потребовал 6 с, а Deflate — 0,1 с по предоставленным наблюдениям. Изображения в сжатых форматах JPEG и PNG допускают ограниченное дополнительное сжатие. Преимущество PPMd относится к данному набору изображений.</w:t>
       </w:r>
     </w:p>
     <w:p>
@@ -5032,7 +5076,7 @@
       <w:bookmarkStart w:id="809" w:name="lab3_9"/>
       <w:pPr>
         <w:pStyle w:val="Heading1"/>
-        <w:pageBreakBefore/>
+        <w:pageBreakBefore w:val="0"/>
       </w:pPr>
       <w:r>
         <w:t>Задание 3. Влияние размера словаря</w:t>
@@ -5638,42 +5682,49 @@
         <w:t>Увеличение словаря с 64 КБ до 16 МБ сократило архив с 2959 до 1980 байт. Дальнейшее увеличение до 128 МБ не изменило размер, но повысило оценку памяти сжатия с 2496 до 13 888 МБ и распаковки с 18 до 130 МБ. Большой словарь бесполезен, если меньший уже охватывает полезные повторения исходных данных. Для данного набора из успешно испытанных вариантов рациональнее словарь 16 МБ.</w:t>
       </w:r>
     </w:p>
-    <w:tbl>
-      <w:tblPr>
-        <w:tblStyle w:val="TableGrid"/>
-        <w:tblW w:type="auto" w:w="0"/>
+    <w:p>
+      <w:pPr>
+        <w:pStyle w:val="Мойтекст"/>
+        <w:keepNext/>
+        <w:spacing w:before="80" w:after="40"/>
+        <w:ind w:firstLine="0" w:left="0"/>
         <w:jc w:val="center"/>
-        <w:tblLook w:firstColumn="1" w:firstRow="1" w:lastColumn="0" w:lastRow="0" w:noHBand="0" w:noVBand="1" w:val="04A0"/>
-      </w:tblPr>
-      <w:tblGrid>
-        <w:gridCol w:w="9355"/>
-      </w:tblGrid>
-      <w:tr>
-        <w:trPr>
-          <w:trHeight w:val="1984"/>
-        </w:trPr>
-        <w:tc>
-          <w:tcPr>
-            <w:tcW w:type="dxa" w:w="9355"/>
-            <w:vAlign w:val="center"/>
-          </w:tcPr>
-          <w:p>
-            <w:pPr>
-              <w:pStyle w:val="Мойтекст"/>
-              <w:keepNext/>
-              <w:ind w:firstLine="0"/>
-              <w:jc w:val="center"/>
-            </w:pPr>
-            <w:r>
-              <w:rPr>
-                <w:i/>
-              </w:rPr>
-              <w:t>[Место для скриншота: Архивы 450389TXT64, 450389TXT16 и 450389TXT128 в FAR, режим «Детальный»]</w:t>
-            </w:r>
-          </w:p>
-        </w:tc>
-      </w:tr>
-    </w:tbl>
+      </w:pPr>
+      <w:r>
+        <w:drawing>
+          <wp:inline xmlns:a="http://schemas.openxmlformats.org/drawingml/2006/main" xmlns:pic="http://schemas.openxmlformats.org/drawingml/2006/picture">
+            <wp:extent cx="5940000" cy="3190806"/>
+            <wp:docPr id="7" name="Picture 7"/>
+            <wp:cNvGraphicFramePr>
+              <a:graphicFrameLocks noChangeAspect="1"/>
+            </wp:cNvGraphicFramePr>
+            <a:graphic>
+              <a:graphicData uri="http://schemas.openxmlformats.org/drawingml/2006/picture">
+                <pic:pic>
+                  <pic:nvPicPr>
+                    <pic:cNvPr id="0" name="4.png"/>
+                    <pic:cNvPicPr/>
+                  </pic:nvPicPr>
+                  <pic:blipFill>
+                    <a:blip r:embed="rId16"/>
+                    <a:stretch>
+                      <a:fillRect/>
+                    </a:stretch>
+                  </pic:blipFill>
+                  <pic:spPr>
+                    <a:xfrm>
+                      <a:off x="0" y="0"/>
+                      <a:ext cx="5940000" cy="3190806"/>
+                    </a:xfrm>
+                    <a:prstGeom prst="rect"/>
+                  </pic:spPr>
+                </pic:pic>
+              </a:graphicData>
+            </a:graphic>
+          </wp:inline>
+        </w:drawing>
+      </w:r>
+    </w:p>
     <w:p>
       <w:pPr>
         <w:pStyle w:val="Мояподпись"/>
@@ -5683,42 +5734,49 @@
         <w:t>Скриншот 7 — Архивы 450389TXT64, 450389TXT16 и 450389TXT128 в FAR, режим «Детальный»</w:t>
       </w:r>
     </w:p>
-    <w:tbl>
-      <w:tblPr>
-        <w:tblStyle w:val="TableGrid"/>
-        <w:tblW w:type="auto" w:w="0"/>
+    <w:p>
+      <w:pPr>
+        <w:pStyle w:val="Мойтекст"/>
+        <w:keepNext/>
+        <w:spacing w:before="80" w:after="40"/>
+        <w:ind w:firstLine="0" w:left="0"/>
         <w:jc w:val="center"/>
-        <w:tblLook w:firstColumn="1" w:firstRow="1" w:lastColumn="0" w:lastRow="0" w:noHBand="0" w:noVBand="1" w:val="04A0"/>
-      </w:tblPr>
-      <w:tblGrid>
-        <w:gridCol w:w="9355"/>
-      </w:tblGrid>
-      <w:tr>
-        <w:trPr>
-          <w:trHeight w:val="1984"/>
-        </w:trPr>
-        <w:tc>
-          <w:tcPr>
-            <w:tcW w:type="dxa" w:w="9355"/>
-            <w:vAlign w:val="center"/>
-          </w:tcPr>
-          <w:p>
-            <w:pPr>
-              <w:pStyle w:val="Мойтекст"/>
-              <w:keepNext/>
-              <w:ind w:firstLine="0"/>
-              <w:jc w:val="center"/>
-            </w:pPr>
-            <w:r>
-              <w:rPr>
-                <w:i/>
-              </w:rPr>
-              <w:t>[Место для скриншота: Отказ 7-Zip при словаре 3840 МБ: недостаточно памяти]</w:t>
-            </w:r>
-          </w:p>
-        </w:tc>
-      </w:tr>
-    </w:tbl>
+      </w:pPr>
+      <w:r>
+        <w:drawing>
+          <wp:inline xmlns:a="http://schemas.openxmlformats.org/drawingml/2006/main" xmlns:pic="http://schemas.openxmlformats.org/drawingml/2006/picture">
+            <wp:extent cx="3025359" cy="2699999"/>
+            <wp:docPr id="8" name="Picture 8"/>
+            <wp:cNvGraphicFramePr>
+              <a:graphicFrameLocks noChangeAspect="1"/>
+            </wp:cNvGraphicFramePr>
+            <a:graphic>
+              <a:graphicData uri="http://schemas.openxmlformats.org/drawingml/2006/picture">
+                <pic:pic>
+                  <pic:nvPicPr>
+                    <pic:cNvPr id="0" name="12.png"/>
+                    <pic:cNvPicPr/>
+                  </pic:nvPicPr>
+                  <pic:blipFill>
+                    <a:blip r:embed="rId17"/>
+                    <a:stretch>
+                      <a:fillRect/>
+                    </a:stretch>
+                  </pic:blipFill>
+                  <pic:spPr>
+                    <a:xfrm>
+                      <a:off x="0" y="0"/>
+                      <a:ext cx="3025359" cy="2699999"/>
+                    </a:xfrm>
+                    <a:prstGeom prst="rect"/>
+                  </pic:spPr>
+                </pic:pic>
+              </a:graphicData>
+            </a:graphic>
+          </wp:inline>
+        </w:drawing>
+      </w:r>
+    </w:p>
     <w:p>
       <w:pPr>
         <w:pStyle w:val="Мояподпись"/>
@@ -5732,7 +5790,7 @@
       <w:bookmarkStart w:id="810" w:name="lab3_10"/>
       <w:pPr>
         <w:pStyle w:val="Heading1"/>
-        <w:pageBreakBefore/>
+        <w:pageBreakBefore w:val="0"/>
       </w:pPr>
       <w:r>
         <w:t>Задание 4. Максимальное сжатие из командной строки</w:t>
@@ -5745,7 +5803,7 @@
         <w:spacing w:after="100"/>
       </w:pPr>
       <w:r>
-        <w:t>Каталоги 450389PIC и 450389VID упакованы по отдельности консольной версией 7-Zip с максимальным уровнем сжатия. Команды выполняются из родительского каталога, чтобы готовые архивы находились вне исходных папок. Параметр -mx=9 задаёт максимальный уровень, -m0=LZMA2 выбирает алгоритм.</w:t>
+        <w:t>Каталоги 450389PIC и 450389VID упакованы по отдельности консольной версией 7-Zip с максимальным уровнем сжатия. Команды выполняются из родительского каталога, чтобы готовые архивы находились вне исходных папок. Параметр -mx=9 задаёт максимальный уровень, -m0=LZMA2 выбирает алгоритм. На консольных скриншотах используется 7-Zip 26.05 (x64); успешное завершение подтверждается сообщением Everything is Ok.</w:t>
       </w:r>
     </w:p>
     <w:p>
@@ -6134,45 +6192,52 @@
         <w:spacing w:after="100"/>
       </w:pPr>
       <w:r>
-        <w:t>По сравнению с нормальным уровнем LZMA2 из задания 2 архив PIC стал на 6 байт больше, а VID — на 183 байта меньше. Для этих наборов максимальный уровень почти не улучшил результат. JPEG и MP4 уже используют сжатие; повторная упаковка даёт небольшой выигрыш.</w:t>
+        <w:t>По сравнению с нормальным уровнем LZMA2 из задания 2 архив PIC стал на 6 байт больше, а VID — на 183 байта меньше. Для этих наборов максимальный уровень почти не улучшил результат. Изображения в форматах JPEG/PNG и видео MP4 уже используют сжатие, поэтому повторная упаковка даёт небольшой выигрыш.</w:t>
       </w:r>
     </w:p>
-    <w:tbl>
-      <w:tblPr>
-        <w:tblStyle w:val="TableGrid"/>
-        <w:tblW w:type="auto" w:w="0"/>
+    <w:p>
+      <w:pPr>
+        <w:pStyle w:val="Мойтекст"/>
+        <w:keepNext/>
+        <w:spacing w:before="80" w:after="40"/>
+        <w:ind w:firstLine="0" w:left="0"/>
         <w:jc w:val="center"/>
-        <w:tblLook w:firstColumn="1" w:firstRow="1" w:lastColumn="0" w:lastRow="0" w:noHBand="0" w:noVBand="1" w:val="04A0"/>
-      </w:tblPr>
-      <w:tblGrid>
-        <w:gridCol w:w="9355"/>
-      </w:tblGrid>
-      <w:tr>
-        <w:trPr>
-          <w:trHeight w:val="1984"/>
-        </w:trPr>
-        <w:tc>
-          <w:tcPr>
-            <w:tcW w:type="dxa" w:w="9355"/>
-            <w:vAlign w:val="center"/>
-          </w:tcPr>
-          <w:p>
-            <w:pPr>
-              <w:pStyle w:val="Мойтекст"/>
-              <w:keepNext/>
-              <w:ind w:firstLine="0"/>
-              <w:jc w:val="center"/>
-            </w:pPr>
-            <w:r>
-              <w:rPr>
-                <w:i/>
-              </w:rPr>
-              <w:t>[Место для скриншота: Команда и результат максимального сжатия 450389PIC в CMD]</w:t>
-            </w:r>
-          </w:p>
-        </w:tc>
-      </w:tr>
-    </w:tbl>
+      </w:pPr>
+      <w:r>
+        <w:drawing>
+          <wp:inline xmlns:a="http://schemas.openxmlformats.org/drawingml/2006/main" xmlns:pic="http://schemas.openxmlformats.org/drawingml/2006/picture">
+            <wp:extent cx="5940000" cy="2635177"/>
+            <wp:docPr id="9" name="Picture 9"/>
+            <wp:cNvGraphicFramePr>
+              <a:graphicFrameLocks noChangeAspect="1"/>
+            </wp:cNvGraphicFramePr>
+            <a:graphic>
+              <a:graphicData uri="http://schemas.openxmlformats.org/drawingml/2006/picture">
+                <pic:pic>
+                  <pic:nvPicPr>
+                    <pic:cNvPr id="0" name="5.png"/>
+                    <pic:cNvPicPr/>
+                  </pic:nvPicPr>
+                  <pic:blipFill>
+                    <a:blip r:embed="rId18"/>
+                    <a:stretch>
+                      <a:fillRect/>
+                    </a:stretch>
+                  </pic:blipFill>
+                  <pic:spPr>
+                    <a:xfrm>
+                      <a:off x="0" y="0"/>
+                      <a:ext cx="5940000" cy="2635177"/>
+                    </a:xfrm>
+                    <a:prstGeom prst="rect"/>
+                  </pic:spPr>
+                </pic:pic>
+              </a:graphicData>
+            </a:graphic>
+          </wp:inline>
+        </w:drawing>
+      </w:r>
+    </w:p>
     <w:p>
       <w:pPr>
         <w:pStyle w:val="Мояподпись"/>
@@ -6182,42 +6247,49 @@
         <w:t>Скриншот 9 — Команда и результат максимального сжатия 450389PIC в CMD</w:t>
       </w:r>
     </w:p>
-    <w:tbl>
-      <w:tblPr>
-        <w:tblStyle w:val="TableGrid"/>
-        <w:tblW w:type="auto" w:w="0"/>
+    <w:p>
+      <w:pPr>
+        <w:pStyle w:val="Мойтекст"/>
+        <w:keepNext/>
+        <w:spacing w:before="80" w:after="40"/>
+        <w:ind w:firstLine="0" w:left="0"/>
         <w:jc w:val="center"/>
-        <w:tblLook w:firstColumn="1" w:firstRow="1" w:lastColumn="0" w:lastRow="0" w:noHBand="0" w:noVBand="1" w:val="04A0"/>
-      </w:tblPr>
-      <w:tblGrid>
-        <w:gridCol w:w="9355"/>
-      </w:tblGrid>
-      <w:tr>
-        <w:trPr>
-          <w:trHeight w:val="1984"/>
-        </w:trPr>
-        <w:tc>
-          <w:tcPr>
-            <w:tcW w:type="dxa" w:w="9355"/>
-            <w:vAlign w:val="center"/>
-          </w:tcPr>
-          <w:p>
-            <w:pPr>
-              <w:pStyle w:val="Мойтекст"/>
-              <w:keepNext/>
-              <w:ind w:firstLine="0"/>
-              <w:jc w:val="center"/>
-            </w:pPr>
-            <w:r>
-              <w:rPr>
-                <w:i/>
-              </w:rPr>
-              <w:t>[Место для скриншота: Команда и результат максимального сжатия 450389VID в CMD]</w:t>
-            </w:r>
-          </w:p>
-        </w:tc>
-      </w:tr>
-    </w:tbl>
+      </w:pPr>
+      <w:r>
+        <w:drawing>
+          <wp:inline xmlns:a="http://schemas.openxmlformats.org/drawingml/2006/main" xmlns:pic="http://schemas.openxmlformats.org/drawingml/2006/picture">
+            <wp:extent cx="5940000" cy="1937354"/>
+            <wp:docPr id="10" name="Picture 10"/>
+            <wp:cNvGraphicFramePr>
+              <a:graphicFrameLocks noChangeAspect="1"/>
+            </wp:cNvGraphicFramePr>
+            <a:graphic>
+              <a:graphicData uri="http://schemas.openxmlformats.org/drawingml/2006/picture">
+                <pic:pic>
+                  <pic:nvPicPr>
+                    <pic:cNvPr id="0" name="6.png"/>
+                    <pic:cNvPicPr/>
+                  </pic:nvPicPr>
+                  <pic:blipFill>
+                    <a:blip r:embed="rId19"/>
+                    <a:stretch>
+                      <a:fillRect/>
+                    </a:stretch>
+                  </pic:blipFill>
+                  <pic:spPr>
+                    <a:xfrm>
+                      <a:off x="0" y="0"/>
+                      <a:ext cx="5940000" cy="1937354"/>
+                    </a:xfrm>
+                    <a:prstGeom prst="rect"/>
+                  </pic:spPr>
+                </pic:pic>
+              </a:graphicData>
+            </a:graphic>
+          </wp:inline>
+        </w:drawing>
+      </w:r>
+    </w:p>
     <w:p>
       <w:pPr>
         <w:pStyle w:val="Мояподпись"/>
@@ -6227,42 +6299,49 @@
         <w:t>Скриншот 10 — Команда и результат максимального сжатия 450389VID в CMD</w:t>
       </w:r>
     </w:p>
-    <w:tbl>
-      <w:tblPr>
-        <w:tblStyle w:val="TableGrid"/>
-        <w:tblW w:type="auto" w:w="0"/>
+    <w:p>
+      <w:pPr>
+        <w:pStyle w:val="Мойтекст"/>
+        <w:keepNext/>
+        <w:spacing w:before="80" w:after="40"/>
+        <w:ind w:firstLine="0" w:left="0"/>
         <w:jc w:val="center"/>
-        <w:tblLook w:firstColumn="1" w:firstRow="1" w:lastColumn="0" w:lastRow="0" w:noHBand="0" w:noVBand="1" w:val="04A0"/>
-      </w:tblPr>
-      <w:tblGrid>
-        <w:gridCol w:w="9355"/>
-      </w:tblGrid>
-      <w:tr>
-        <w:trPr>
-          <w:trHeight w:val="1984"/>
-        </w:trPr>
-        <w:tc>
-          <w:tcPr>
-            <w:tcW w:type="dxa" w:w="9355"/>
-            <w:vAlign w:val="center"/>
-          </w:tcPr>
-          <w:p>
-            <w:pPr>
-              <w:pStyle w:val="Мойтекст"/>
-              <w:keepNext/>
-              <w:ind w:firstLine="0"/>
-              <w:jc w:val="center"/>
-            </w:pPr>
-            <w:r>
-              <w:rPr>
-                <w:i/>
-              </w:rPr>
-              <w:t>[Место для скриншота: Архивы 450389PIC_max.7z и 450389VID_max.7z в FAR, режим «Детальный»]</w:t>
-            </w:r>
-          </w:p>
-        </w:tc>
-      </w:tr>
-    </w:tbl>
+      </w:pPr>
+      <w:r>
+        <w:drawing>
+          <wp:inline xmlns:a="http://schemas.openxmlformats.org/drawingml/2006/main" xmlns:pic="http://schemas.openxmlformats.org/drawingml/2006/picture">
+            <wp:extent cx="5940000" cy="3181476"/>
+            <wp:docPr id="11" name="Picture 11"/>
+            <wp:cNvGraphicFramePr>
+              <a:graphicFrameLocks noChangeAspect="1"/>
+            </wp:cNvGraphicFramePr>
+            <a:graphic>
+              <a:graphicData uri="http://schemas.openxmlformats.org/drawingml/2006/picture">
+                <pic:pic>
+                  <pic:nvPicPr>
+                    <pic:cNvPr id="0" name="7.png"/>
+                    <pic:cNvPicPr/>
+                  </pic:nvPicPr>
+                  <pic:blipFill>
+                    <a:blip r:embed="rId20"/>
+                    <a:stretch>
+                      <a:fillRect/>
+                    </a:stretch>
+                  </pic:blipFill>
+                  <pic:spPr>
+                    <a:xfrm>
+                      <a:off x="0" y="0"/>
+                      <a:ext cx="5940000" cy="3181476"/>
+                    </a:xfrm>
+                    <a:prstGeom prst="rect"/>
+                  </pic:spPr>
+                </pic:pic>
+              </a:graphicData>
+            </a:graphic>
+          </wp:inline>
+        </w:drawing>
+      </w:r>
+    </w:p>
     <w:p>
       <w:pPr>
         <w:pStyle w:val="Мояподпись"/>
@@ -6276,7 +6355,7 @@
       <w:bookmarkStart w:id="811" w:name="lab3_11"/>
       <w:pPr>
         <w:pStyle w:val="Heading1"/>
-        <w:pageBreakBefore/>
+        <w:pageBreakBefore w:val="0"/>
       </w:pPr>
       <w:r>
         <w:t>Задание 5. Solid- и SFX-архивы</w:t>
@@ -6737,42 +6816,49 @@
         <w:t>Преимущество Solid — лучшее сжатие набора похожих файлов. Главный недостаток — для извлечения отдельного файла может потребоваться обработать предшествующие данные внутри блока; изменение содержимого также может потребовать повторного сжатия блока. Обычный архив удобнее для независимого доступа к отдельным файлам.</w:t>
       </w:r>
     </w:p>
-    <w:tbl>
-      <w:tblPr>
-        <w:tblStyle w:val="TableGrid"/>
-        <w:tblW w:type="auto" w:w="0"/>
+    <w:p>
+      <w:pPr>
+        <w:pStyle w:val="Мойтекст"/>
+        <w:keepNext/>
+        <w:spacing w:before="80" w:after="40"/>
+        <w:ind w:firstLine="0" w:left="0"/>
         <w:jc w:val="center"/>
-        <w:tblLook w:firstColumn="1" w:firstRow="1" w:lastColumn="0" w:lastRow="0" w:noHBand="0" w:noVBand="1" w:val="04A0"/>
-      </w:tblPr>
-      <w:tblGrid>
-        <w:gridCol w:w="9355"/>
-      </w:tblGrid>
-      <w:tr>
-        <w:trPr>
-          <w:trHeight w:val="1417"/>
-        </w:trPr>
-        <w:tc>
-          <w:tcPr>
-            <w:tcW w:type="dxa" w:w="9355"/>
-            <w:vAlign w:val="center"/>
-          </w:tcPr>
-          <w:p>
-            <w:pPr>
-              <w:pStyle w:val="Мойтекст"/>
-              <w:keepNext/>
-              <w:ind w:firstLine="0"/>
-              <w:jc w:val="center"/>
-            </w:pPr>
-            <w:r>
-              <w:rPr>
-                <w:i/>
-              </w:rPr>
-              <w:t>[Место для скриншота: Создание Solid-архива: команда и результат в CMD]</w:t>
-            </w:r>
-          </w:p>
-        </w:tc>
-      </w:tr>
-    </w:tbl>
+      </w:pPr>
+      <w:r>
+        <w:drawing>
+          <wp:inline xmlns:a="http://schemas.openxmlformats.org/drawingml/2006/main" xmlns:pic="http://schemas.openxmlformats.org/drawingml/2006/picture">
+            <wp:extent cx="5940000" cy="1657674"/>
+            <wp:docPr id="12" name="Picture 12"/>
+            <wp:cNvGraphicFramePr>
+              <a:graphicFrameLocks noChangeAspect="1"/>
+            </wp:cNvGraphicFramePr>
+            <a:graphic>
+              <a:graphicData uri="http://schemas.openxmlformats.org/drawingml/2006/picture">
+                <pic:pic>
+                  <pic:nvPicPr>
+                    <pic:cNvPr id="0" name="8.png"/>
+                    <pic:cNvPicPr/>
+                  </pic:nvPicPr>
+                  <pic:blipFill>
+                    <a:blip r:embed="rId21"/>
+                    <a:stretch>
+                      <a:fillRect/>
+                    </a:stretch>
+                  </pic:blipFill>
+                  <pic:spPr>
+                    <a:xfrm>
+                      <a:off x="0" y="0"/>
+                      <a:ext cx="5940000" cy="1657674"/>
+                    </a:xfrm>
+                    <a:prstGeom prst="rect"/>
+                  </pic:spPr>
+                </pic:pic>
+              </a:graphicData>
+            </a:graphic>
+          </wp:inline>
+        </w:drawing>
+      </w:r>
+    </w:p>
     <w:p>
       <w:pPr>
         <w:pStyle w:val="Мояподпись"/>
@@ -6782,42 +6868,49 @@
         <w:t>Скриншот 12 — Создание Solid-архива: команда и результат в CMD</w:t>
       </w:r>
     </w:p>
-    <w:tbl>
-      <w:tblPr>
-        <w:tblStyle w:val="TableGrid"/>
-        <w:tblW w:type="auto" w:w="0"/>
+    <w:p>
+      <w:pPr>
+        <w:pStyle w:val="Мойтекст"/>
+        <w:keepNext/>
+        <w:spacing w:before="80" w:after="40"/>
+        <w:ind w:firstLine="0" w:left="0"/>
         <w:jc w:val="center"/>
-        <w:tblLook w:firstColumn="1" w:firstRow="1" w:lastColumn="0" w:lastRow="0" w:noHBand="0" w:noVBand="1" w:val="04A0"/>
-      </w:tblPr>
-      <w:tblGrid>
-        <w:gridCol w:w="9355"/>
-      </w:tblGrid>
-      <w:tr>
-        <w:trPr>
-          <w:trHeight w:val="1417"/>
-        </w:trPr>
-        <w:tc>
-          <w:tcPr>
-            <w:tcW w:type="dxa" w:w="9355"/>
-            <w:vAlign w:val="center"/>
-          </w:tcPr>
-          <w:p>
-            <w:pPr>
-              <w:pStyle w:val="Мойтекст"/>
-              <w:keepNext/>
-              <w:ind w:firstLine="0"/>
-              <w:jc w:val="center"/>
-            </w:pPr>
-            <w:r>
-              <w:rPr>
-                <w:i/>
-              </w:rPr>
-              <w:t>[Место для скриншота: Создание обычного архива: команда и результат в CMD]</w:t>
-            </w:r>
-          </w:p>
-        </w:tc>
-      </w:tr>
-    </w:tbl>
+      </w:pPr>
+      <w:r>
+        <w:drawing>
+          <wp:inline xmlns:a="http://schemas.openxmlformats.org/drawingml/2006/main" xmlns:pic="http://schemas.openxmlformats.org/drawingml/2006/picture">
+            <wp:extent cx="5940000" cy="1715759"/>
+            <wp:docPr id="13" name="Picture 13"/>
+            <wp:cNvGraphicFramePr>
+              <a:graphicFrameLocks noChangeAspect="1"/>
+            </wp:cNvGraphicFramePr>
+            <a:graphic>
+              <a:graphicData uri="http://schemas.openxmlformats.org/drawingml/2006/picture">
+                <pic:pic>
+                  <pic:nvPicPr>
+                    <pic:cNvPr id="0" name="9.png"/>
+                    <pic:cNvPicPr/>
+                  </pic:nvPicPr>
+                  <pic:blipFill>
+                    <a:blip r:embed="rId22"/>
+                    <a:stretch>
+                      <a:fillRect/>
+                    </a:stretch>
+                  </pic:blipFill>
+                  <pic:spPr>
+                    <a:xfrm>
+                      <a:off x="0" y="0"/>
+                      <a:ext cx="5940000" cy="1715759"/>
+                    </a:xfrm>
+                    <a:prstGeom prst="rect"/>
+                  </pic:spPr>
+                </pic:pic>
+              </a:graphicData>
+            </a:graphic>
+          </wp:inline>
+        </w:drawing>
+      </w:r>
+    </w:p>
     <w:p>
       <w:pPr>
         <w:pStyle w:val="Мояподпись"/>
@@ -6827,42 +6920,49 @@
         <w:t>Скриншот 13 — Создание обычного архива: команда и результат в CMD</w:t>
       </w:r>
     </w:p>
-    <w:tbl>
-      <w:tblPr>
-        <w:tblStyle w:val="TableGrid"/>
-        <w:tblW w:type="auto" w:w="0"/>
+    <w:p>
+      <w:pPr>
+        <w:pStyle w:val="Мойтекст"/>
+        <w:keepNext/>
+        <w:spacing w:before="80" w:after="40"/>
+        <w:ind w:firstLine="0" w:left="0"/>
         <w:jc w:val="center"/>
-        <w:tblLook w:firstColumn="1" w:firstRow="1" w:lastColumn="0" w:lastRow="0" w:noHBand="0" w:noVBand="1" w:val="04A0"/>
-      </w:tblPr>
-      <w:tblGrid>
-        <w:gridCol w:w="9355"/>
-      </w:tblGrid>
-      <w:tr>
-        <w:trPr>
-          <w:trHeight w:val="1417"/>
-        </w:trPr>
-        <w:tc>
-          <w:tcPr>
-            <w:tcW w:type="dxa" w:w="9355"/>
-            <w:vAlign w:val="center"/>
-          </w:tcPr>
-          <w:p>
-            <w:pPr>
-              <w:pStyle w:val="Мойтекст"/>
-              <w:keepNext/>
-              <w:ind w:firstLine="0"/>
-              <w:jc w:val="center"/>
-            </w:pPr>
-            <w:r>
-              <w:rPr>
-                <w:i/>
-              </w:rPr>
-              <w:t>[Место для скриншота: Создание SFX-архива: команда и результат в CMD]</w:t>
-            </w:r>
-          </w:p>
-        </w:tc>
-      </w:tr>
-    </w:tbl>
+      </w:pPr>
+      <w:r>
+        <w:drawing>
+          <wp:inline xmlns:a="http://schemas.openxmlformats.org/drawingml/2006/main" xmlns:pic="http://schemas.openxmlformats.org/drawingml/2006/picture">
+            <wp:extent cx="5940000" cy="1871209"/>
+            <wp:docPr id="14" name="Picture 14"/>
+            <wp:cNvGraphicFramePr>
+              <a:graphicFrameLocks noChangeAspect="1"/>
+            </wp:cNvGraphicFramePr>
+            <a:graphic>
+              <a:graphicData uri="http://schemas.openxmlformats.org/drawingml/2006/picture">
+                <pic:pic>
+                  <pic:nvPicPr>
+                    <pic:cNvPr id="0" name="10.png"/>
+                    <pic:cNvPicPr/>
+                  </pic:nvPicPr>
+                  <pic:blipFill>
+                    <a:blip r:embed="rId23"/>
+                    <a:stretch>
+                      <a:fillRect/>
+                    </a:stretch>
+                  </pic:blipFill>
+                  <pic:spPr>
+                    <a:xfrm>
+                      <a:off x="0" y="0"/>
+                      <a:ext cx="5940000" cy="1871209"/>
+                    </a:xfrm>
+                    <a:prstGeom prst="rect"/>
+                  </pic:spPr>
+                </pic:pic>
+              </a:graphicData>
+            </a:graphic>
+          </wp:inline>
+        </w:drawing>
+      </w:r>
+    </w:p>
     <w:p>
       <w:pPr>
         <w:pStyle w:val="Мояподпись"/>
@@ -6872,42 +6972,49 @@
         <w:t>Скриншот 14 — Создание SFX-архива: команда и результат в CMD</w:t>
       </w:r>
     </w:p>
-    <w:tbl>
-      <w:tblPr>
-        <w:tblStyle w:val="TableGrid"/>
-        <w:tblW w:type="auto" w:w="0"/>
+    <w:p>
+      <w:pPr>
+        <w:pStyle w:val="Мойтекст"/>
+        <w:keepNext/>
+        <w:spacing w:before="80" w:after="40"/>
+        <w:ind w:firstLine="0" w:left="0"/>
         <w:jc w:val="center"/>
-        <w:tblLook w:firstColumn="1" w:firstRow="1" w:lastColumn="0" w:lastRow="0" w:noHBand="0" w:noVBand="1" w:val="04A0"/>
-      </w:tblPr>
-      <w:tblGrid>
-        <w:gridCol w:w="9355"/>
-      </w:tblGrid>
-      <w:tr>
-        <w:trPr>
-          <w:trHeight w:val="1417"/>
-        </w:trPr>
-        <w:tc>
-          <w:tcPr>
-            <w:tcW w:type="dxa" w:w="9355"/>
-            <w:vAlign w:val="center"/>
-          </w:tcPr>
-          <w:p>
-            <w:pPr>
-              <w:pStyle w:val="Мойтекст"/>
-              <w:keepNext/>
-              <w:ind w:firstLine="0"/>
-              <w:jc w:val="center"/>
-            </w:pPr>
-            <w:r>
-              <w:rPr>
-                <w:i/>
-              </w:rPr>
-              <w:t>[Место для скриншота: Все три архива SMALL в FAR, режим «Детальный»]</w:t>
-            </w:r>
-          </w:p>
-        </w:tc>
-      </w:tr>
-    </w:tbl>
+      </w:pPr>
+      <w:r>
+        <w:drawing>
+          <wp:inline xmlns:a="http://schemas.openxmlformats.org/drawingml/2006/main" xmlns:pic="http://schemas.openxmlformats.org/drawingml/2006/picture">
+            <wp:extent cx="5940000" cy="3195118"/>
+            <wp:docPr id="15" name="Picture 15"/>
+            <wp:cNvGraphicFramePr>
+              <a:graphicFrameLocks noChangeAspect="1"/>
+            </wp:cNvGraphicFramePr>
+            <a:graphic>
+              <a:graphicData uri="http://schemas.openxmlformats.org/drawingml/2006/picture">
+                <pic:pic>
+                  <pic:nvPicPr>
+                    <pic:cNvPr id="0" name="11.png"/>
+                    <pic:cNvPicPr/>
+                  </pic:nvPicPr>
+                  <pic:blipFill>
+                    <a:blip r:embed="rId24"/>
+                    <a:stretch>
+                      <a:fillRect/>
+                    </a:stretch>
+                  </pic:blipFill>
+                  <pic:spPr>
+                    <a:xfrm>
+                      <a:off x="0" y="0"/>
+                      <a:ext cx="5940000" cy="3195118"/>
+                    </a:xfrm>
+                    <a:prstGeom prst="rect"/>
+                  </pic:spPr>
+                </pic:pic>
+              </a:graphicData>
+            </a:graphic>
+          </wp:inline>
+        </w:drawing>
+      </w:r>
+    </w:p>
     <w:p>
       <w:pPr>
         <w:pStyle w:val="Мояподпись"/>
@@ -6921,7 +7028,7 @@
       <w:bookmarkStart w:id="812" w:name="lab3_12"/>
       <w:pPr>
         <w:pStyle w:val="Heading1"/>
-        <w:pageBreakBefore/>
+        <w:pageBreakBefore w:val="0"/>
       </w:pPr>
       <w:r>
         <w:t>Задание 6. Ручное сжатие RLE и Хаффмана</w:t>
@@ -9242,7 +9349,7 @@
       <w:bookmarkStart w:id="815" w:name="lab3_15"/>
       <w:pPr>
         <w:pStyle w:val="Heading1"/>
-        <w:pageBreakBefore/>
+        <w:pageBreakBefore w:val="0"/>
       </w:pPr>
       <w:r>
         <w:t>Выводы</w:t>
@@ -9280,6 +9387,7 @@
       <w:bookmarkStart w:id="816" w:name="lab3_16"/>
       <w:pPr>
         <w:pStyle w:val="Heading1"/>
+        <w:pageBreakBefore w:val="0"/>
       </w:pPr>
       <w:r>
         <w:t>Архивы для проверки</w:t>

</xml_diff>

<commit_message>
Simplify lab report wording and remove minimum-size column
</commit_message>
<xml_diff>
--- a/lab3_450389.docx
+++ b/lab3_450389.docx
@@ -6,6 +6,7 @@
       <w:pPr>
         <w:pStyle w:val="Мойтекст"/>
         <w:keepNext/>
+        <w:keepLines/>
         <w:spacing w:before="0" w:after="0" w:line="240" w:lineRule="auto"/>
         <w:ind w:firstLine="0" w:left="0" w:right="0"/>
         <w:jc w:val="left"/>
@@ -34,6 +35,7 @@
       <w:pPr>
         <w:pStyle w:val="Мойтекст"/>
         <w:keepNext/>
+        <w:keepLines/>
         <w:spacing w:before="4000" w:after="0" w:line="240" w:lineRule="auto"/>
         <w:ind w:firstLine="0" w:left="0" w:right="0"/>
         <w:jc w:val="center"/>
@@ -53,6 +55,7 @@
       <w:pPr>
         <w:pStyle w:val="Мойтекст"/>
         <w:keepNext/>
+        <w:keepLines/>
         <w:spacing w:before="2900" w:after="100" w:line="240" w:lineRule="auto"/>
         <w:ind w:firstLine="0" w:left="0" w:right="0"/>
         <w:jc w:val="right"/>
@@ -71,6 +74,7 @@
       <w:pPr>
         <w:pStyle w:val="Мойтекст"/>
         <w:keepNext/>
+        <w:keepLines/>
         <w:spacing w:before="0" w:after="100" w:line="240" w:lineRule="auto"/>
         <w:ind w:firstLine="0" w:left="0" w:right="0"/>
         <w:jc w:val="right"/>
@@ -89,6 +93,7 @@
       <w:pPr>
         <w:pStyle w:val="Мойтекст"/>
         <w:keepNext/>
+        <w:keepLines/>
         <w:spacing w:before="0" w:after="0" w:line="240" w:lineRule="auto"/>
         <w:ind w:firstLine="0" w:left="0" w:right="0"/>
         <w:jc w:val="right"/>
@@ -107,6 +112,7 @@
       <w:pPr>
         <w:pStyle w:val="Мойтекст"/>
         <w:keepNext w:val="0"/>
+        <w:keepLines/>
         <w:spacing w:before="1900" w:after="0" w:line="240" w:lineRule="auto"/>
         <w:ind w:firstLine="0" w:left="0" w:right="0"/>
         <w:jc w:val="center"/>
@@ -129,6 +135,7 @@
     <w:p>
       <w:pPr>
         <w:pStyle w:val="Мойтекст"/>
+        <w:keepLines/>
       </w:pPr>
       <w:r>
         <w:rPr>
@@ -140,6 +147,7 @@
     <w:p>
       <w:pPr>
         <w:pStyle w:val="Мойтекст"/>
+        <w:keepLines/>
         <w:spacing w:after="100"/>
         <w:ind w:firstLine="0"/>
       </w:pPr>
@@ -164,6 +172,7 @@
     <w:p>
       <w:pPr>
         <w:pStyle w:val="Мойтекст"/>
+        <w:keepLines/>
         <w:spacing w:after="100"/>
         <w:ind w:firstLine="0"/>
       </w:pPr>
@@ -179,6 +188,7 @@
     <w:p>
       <w:pPr>
         <w:pStyle w:val="Мойтекст"/>
+        <w:keepLines/>
         <w:spacing w:after="100"/>
         <w:ind w:firstLine="0" w:left="340"/>
       </w:pPr>
@@ -194,6 +204,7 @@
     <w:p>
       <w:pPr>
         <w:pStyle w:val="Мойтекст"/>
+        <w:keepLines/>
         <w:spacing w:after="100"/>
         <w:ind w:firstLine="0" w:left="340"/>
       </w:pPr>
@@ -209,6 +220,7 @@
     <w:p>
       <w:pPr>
         <w:pStyle w:val="Мойтекст"/>
+        <w:keepLines/>
         <w:spacing w:after="100"/>
         <w:ind w:firstLine="0" w:left="340"/>
       </w:pPr>
@@ -224,6 +236,7 @@
     <w:p>
       <w:pPr>
         <w:pStyle w:val="Мойтекст"/>
+        <w:keepLines/>
         <w:spacing w:after="100"/>
         <w:ind w:firstLine="0" w:left="340"/>
       </w:pPr>
@@ -239,6 +252,7 @@
     <w:p>
       <w:pPr>
         <w:pStyle w:val="Мойтекст"/>
+        <w:keepLines/>
         <w:spacing w:after="100"/>
         <w:ind w:firstLine="0" w:left="340"/>
       </w:pPr>
@@ -254,6 +268,7 @@
     <w:p>
       <w:pPr>
         <w:pStyle w:val="Мойтекст"/>
+        <w:keepLines/>
         <w:spacing w:after="100"/>
         <w:ind w:firstLine="0" w:left="340"/>
       </w:pPr>
@@ -269,6 +284,7 @@
     <w:p>
       <w:pPr>
         <w:pStyle w:val="Мойтекст"/>
+        <w:keepLines/>
         <w:spacing w:after="100"/>
         <w:ind w:firstLine="0"/>
       </w:pPr>
@@ -284,6 +300,7 @@
     <w:p>
       <w:pPr>
         <w:pStyle w:val="Мойтекст"/>
+        <w:keepLines/>
         <w:spacing w:after="100"/>
         <w:ind w:firstLine="0"/>
       </w:pPr>
@@ -299,6 +316,7 @@
     <w:p>
       <w:pPr>
         <w:pStyle w:val="Мойтекст"/>
+        <w:keepLines/>
         <w:spacing w:after="100"/>
         <w:ind w:firstLine="0"/>
       </w:pPr>
@@ -314,6 +332,7 @@
     <w:p>
       <w:pPr>
         <w:pStyle w:val="Мойтекст"/>
+        <w:keepLines/>
         <w:spacing w:after="100"/>
         <w:ind w:firstLine="0"/>
       </w:pPr>
@@ -329,6 +348,7 @@
     <w:p>
       <w:pPr>
         <w:pStyle w:val="Мойтекст"/>
+        <w:keepLines/>
         <w:spacing w:after="100"/>
         <w:ind w:firstLine="0" w:left="340"/>
       </w:pPr>
@@ -344,6 +364,7 @@
     <w:p>
       <w:pPr>
         <w:pStyle w:val="Мойтекст"/>
+        <w:keepLines/>
         <w:spacing w:after="100"/>
         <w:ind w:firstLine="0" w:left="340"/>
       </w:pPr>
@@ -359,6 +380,7 @@
     <w:p>
       <w:pPr>
         <w:pStyle w:val="Мойтекст"/>
+        <w:keepLines/>
         <w:spacing w:after="100"/>
         <w:ind w:firstLine="0"/>
       </w:pPr>
@@ -374,6 +396,7 @@
     <w:p>
       <w:pPr>
         <w:pStyle w:val="Мойтекст"/>
+        <w:keepLines/>
         <w:spacing w:after="100"/>
         <w:ind w:firstLine="0"/>
       </w:pPr>
@@ -408,10 +431,11 @@
     <w:p>
       <w:pPr>
         <w:pStyle w:val="Мойтекст"/>
+        <w:keepLines/>
         <w:spacing w:after="100"/>
       </w:pPr>
       <w:r>
-        <w:t>Для исследования сжатия в 7-Zip подготовлены шесть наборов файлов. В названиях каталогов используется номер ИСУ 450389. Для каждого набора далее сравниваются методы LZMA2, Deflate, BZip2 и PPMd.</w:t>
+        <w:t>Создала шесть каталогов для разных типов файлов. В названиях указала свой номер ИСУ 450389. Для сжатия выбрала 7-Zip.</w:t>
       </w:r>
     </w:p>
     <w:tbl>
@@ -423,10 +447,9 @@
         <w:tblLook w:firstColumn="1" w:firstRow="1" w:lastColumn="0" w:lastRow="0" w:noHBand="0" w:noVBand="1" w:val="04A0"/>
       </w:tblPr>
       <w:tblGrid>
-        <w:gridCol w:w="1757"/>
-        <w:gridCol w:w="2835"/>
-        <w:gridCol w:w="2381"/>
         <w:gridCol w:w="1814"/>
+        <w:gridCol w:w="3685"/>
+        <w:gridCol w:w="3288"/>
       </w:tblGrid>
       <w:tr>
         <w:trPr>
@@ -435,7 +458,7 @@
         </w:trPr>
         <w:tc>
           <w:tcPr>
-            <w:tcW w:type="dxa" w:w="1757"/>
+            <w:tcW w:type="dxa" w:w="1814"/>
             <w:vAlign w:val="center"/>
             <w:shd w:fill="E8EEF5"/>
           </w:tcPr>
@@ -457,7 +480,7 @@
         </w:tc>
         <w:tc>
           <w:tcPr>
-            <w:tcW w:type="dxa" w:w="2835"/>
+            <w:tcW w:type="dxa" w:w="3685"/>
             <w:vAlign w:val="center"/>
             <w:shd w:fill="E8EEF5"/>
           </w:tcPr>
@@ -479,7 +502,7 @@
         </w:tc>
         <w:tc>
           <w:tcPr>
-            <w:tcW w:type="dxa" w:w="2381"/>
+            <w:tcW w:type="dxa" w:w="3288"/>
             <w:vAlign w:val="center"/>
             <w:shd w:fill="E8EEF5"/>
           </w:tcPr>
@@ -496,28 +519,6 @@
                 <w:sz w:val="18"/>
               </w:rPr>
               <w:t>Исходный размер, байт</w:t>
-            </w:r>
-          </w:p>
-        </w:tc>
-        <w:tc>
-          <w:tcPr>
-            <w:tcW w:type="dxa" w:w="1814"/>
-            <w:vAlign w:val="center"/>
-            <w:shd w:fill="E8EEF5"/>
-          </w:tcPr>
-          <w:p>
-            <w:pPr>
-              <w:pStyle w:val="Мойтекст"/>
-              <w:keepNext/>
-              <w:spacing w:before="80" w:after="80" w:line="240" w:lineRule="auto"/>
-              <w:ind w:firstLine="0" w:left="0"/>
-            </w:pPr>
-            <w:r>
-              <w:rPr>
-                <w:b/>
-                <w:sz w:val="18"/>
-              </w:rPr>
-              <w:t>Минимум по заданию, МБ</w:t>
             </w:r>
           </w:p>
         </w:tc>
@@ -528,7 +529,7 @@
         </w:trPr>
         <w:tc>
           <w:tcPr>
-            <w:tcW w:type="dxa" w:w="1757"/>
+            <w:tcW w:type="dxa" w:w="1814"/>
             <w:vAlign w:val="center"/>
           </w:tcPr>
           <w:p>
@@ -549,7 +550,7 @@
         </w:tc>
         <w:tc>
           <w:tcPr>
-            <w:tcW w:type="dxa" w:w="2835"/>
+            <w:tcW w:type="dxa" w:w="3685"/>
             <w:vAlign w:val="center"/>
           </w:tcPr>
           <w:p>
@@ -570,7 +571,7 @@
         </w:tc>
         <w:tc>
           <w:tcPr>
-            <w:tcW w:type="dxa" w:w="2381"/>
+            <w:tcW w:type="dxa" w:w="3288"/>
             <w:vAlign w:val="center"/>
           </w:tcPr>
           <w:p>
@@ -586,27 +587,6 @@
                 <w:sz w:val="18"/>
               </w:rPr>
               <w:t>10 485 760</w:t>
-            </w:r>
-          </w:p>
-        </w:tc>
-        <w:tc>
-          <w:tcPr>
-            <w:tcW w:type="dxa" w:w="1814"/>
-            <w:vAlign w:val="center"/>
-          </w:tcPr>
-          <w:p>
-            <w:pPr>
-              <w:pStyle w:val="Мойтекст"/>
-              <w:keepNext w:val="0"/>
-              <w:spacing w:before="80" w:after="80" w:line="240" w:lineRule="auto"/>
-              <w:ind w:firstLine="0" w:left="0"/>
-            </w:pPr>
-            <w:r>
-              <w:rPr>
-                <w:b w:val="0"/>
-                <w:sz w:val="18"/>
-              </w:rPr>
-              <w:t>10</w:t>
             </w:r>
           </w:p>
         </w:tc>
@@ -617,7 +597,7 @@
         </w:trPr>
         <w:tc>
           <w:tcPr>
-            <w:tcW w:type="dxa" w:w="1757"/>
+            <w:tcW w:type="dxa" w:w="1814"/>
             <w:vAlign w:val="center"/>
           </w:tcPr>
           <w:p>
@@ -638,7 +618,7 @@
         </w:tc>
         <w:tc>
           <w:tcPr>
-            <w:tcW w:type="dxa" w:w="2835"/>
+            <w:tcW w:type="dxa" w:w="3685"/>
             <w:vAlign w:val="center"/>
           </w:tcPr>
           <w:p>
@@ -659,7 +639,7 @@
         </w:tc>
         <w:tc>
           <w:tcPr>
-            <w:tcW w:type="dxa" w:w="2381"/>
+            <w:tcW w:type="dxa" w:w="3288"/>
             <w:vAlign w:val="center"/>
           </w:tcPr>
           <w:p>
@@ -675,27 +655,6 @@
                 <w:sz w:val="18"/>
               </w:rPr>
               <w:t>15 510 874</w:t>
-            </w:r>
-          </w:p>
-        </w:tc>
-        <w:tc>
-          <w:tcPr>
-            <w:tcW w:type="dxa" w:w="1814"/>
-            <w:vAlign w:val="center"/>
-          </w:tcPr>
-          <w:p>
-            <w:pPr>
-              <w:pStyle w:val="Мойтекст"/>
-              <w:keepNext w:val="0"/>
-              <w:spacing w:before="80" w:after="80" w:line="240" w:lineRule="auto"/>
-              <w:ind w:firstLine="0" w:left="0"/>
-            </w:pPr>
-            <w:r>
-              <w:rPr>
-                <w:b w:val="0"/>
-                <w:sz w:val="18"/>
-              </w:rPr>
-              <w:t>10</w:t>
             </w:r>
           </w:p>
         </w:tc>
@@ -706,7 +665,7 @@
         </w:trPr>
         <w:tc>
           <w:tcPr>
-            <w:tcW w:type="dxa" w:w="1757"/>
+            <w:tcW w:type="dxa" w:w="1814"/>
             <w:vAlign w:val="center"/>
           </w:tcPr>
           <w:p>
@@ -727,7 +686,7 @@
         </w:tc>
         <w:tc>
           <w:tcPr>
-            <w:tcW w:type="dxa" w:w="2835"/>
+            <w:tcW w:type="dxa" w:w="3685"/>
             <w:vAlign w:val="center"/>
           </w:tcPr>
           <w:p>
@@ -753,7 +712,7 @@
         </w:tc>
         <w:tc>
           <w:tcPr>
-            <w:tcW w:type="dxa" w:w="2381"/>
+            <w:tcW w:type="dxa" w:w="3288"/>
             <w:vAlign w:val="center"/>
           </w:tcPr>
           <w:p>
@@ -769,27 +728,6 @@
                 <w:sz w:val="18"/>
               </w:rPr>
               <w:t>24 649 578</w:t>
-            </w:r>
-          </w:p>
-        </w:tc>
-        <w:tc>
-          <w:tcPr>
-            <w:tcW w:type="dxa" w:w="1814"/>
-            <w:vAlign w:val="center"/>
-          </w:tcPr>
-          <w:p>
-            <w:pPr>
-              <w:pStyle w:val="Мойтекст"/>
-              <w:keepNext w:val="0"/>
-              <w:spacing w:before="80" w:after="80" w:line="240" w:lineRule="auto"/>
-              <w:ind w:firstLine="0" w:left="0"/>
-            </w:pPr>
-            <w:r>
-              <w:rPr>
-                <w:b w:val="0"/>
-                <w:sz w:val="18"/>
-              </w:rPr>
-              <w:t>20</w:t>
             </w:r>
           </w:p>
         </w:tc>
@@ -800,7 +738,7 @@
         </w:trPr>
         <w:tc>
           <w:tcPr>
-            <w:tcW w:type="dxa" w:w="1757"/>
+            <w:tcW w:type="dxa" w:w="1814"/>
             <w:vAlign w:val="center"/>
           </w:tcPr>
           <w:p>
@@ -821,7 +759,7 @@
         </w:tc>
         <w:tc>
           <w:tcPr>
-            <w:tcW w:type="dxa" w:w="2835"/>
+            <w:tcW w:type="dxa" w:w="3685"/>
             <w:vAlign w:val="center"/>
           </w:tcPr>
           <w:p>
@@ -842,7 +780,7 @@
         </w:tc>
         <w:tc>
           <w:tcPr>
-            <w:tcW w:type="dxa" w:w="2381"/>
+            <w:tcW w:type="dxa" w:w="3288"/>
             <w:vAlign w:val="center"/>
           </w:tcPr>
           <w:p>
@@ -858,27 +796,6 @@
                 <w:sz w:val="18"/>
               </w:rPr>
               <w:t>21 529 482</w:t>
-            </w:r>
-          </w:p>
-        </w:tc>
-        <w:tc>
-          <w:tcPr>
-            <w:tcW w:type="dxa" w:w="1814"/>
-            <w:vAlign w:val="center"/>
-          </w:tcPr>
-          <w:p>
-            <w:pPr>
-              <w:pStyle w:val="Мойтекст"/>
-              <w:keepNext w:val="0"/>
-              <w:spacing w:before="80" w:after="80" w:line="240" w:lineRule="auto"/>
-              <w:ind w:firstLine="0" w:left="0"/>
-            </w:pPr>
-            <w:r>
-              <w:rPr>
-                <w:b w:val="0"/>
-                <w:sz w:val="18"/>
-              </w:rPr>
-              <w:t>20</w:t>
             </w:r>
           </w:p>
         </w:tc>
@@ -889,7 +806,7 @@
         </w:trPr>
         <w:tc>
           <w:tcPr>
-            <w:tcW w:type="dxa" w:w="1757"/>
+            <w:tcW w:type="dxa" w:w="1814"/>
             <w:vAlign w:val="center"/>
           </w:tcPr>
           <w:p>
@@ -910,7 +827,7 @@
         </w:tc>
         <w:tc>
           <w:tcPr>
-            <w:tcW w:type="dxa" w:w="2835"/>
+            <w:tcW w:type="dxa" w:w="3685"/>
             <w:vAlign w:val="center"/>
           </w:tcPr>
           <w:p>
@@ -931,7 +848,7 @@
         </w:tc>
         <w:tc>
           <w:tcPr>
-            <w:tcW w:type="dxa" w:w="2381"/>
+            <w:tcW w:type="dxa" w:w="3288"/>
             <w:vAlign w:val="center"/>
           </w:tcPr>
           <w:p>
@@ -947,27 +864,6 @@
                 <w:sz w:val="18"/>
               </w:rPr>
               <w:t>16 959 128</w:t>
-            </w:r>
-          </w:p>
-        </w:tc>
-        <w:tc>
-          <w:tcPr>
-            <w:tcW w:type="dxa" w:w="1814"/>
-            <w:vAlign w:val="center"/>
-          </w:tcPr>
-          <w:p>
-            <w:pPr>
-              <w:pStyle w:val="Мойтекст"/>
-              <w:keepNext w:val="0"/>
-              <w:spacing w:before="80" w:after="80" w:line="240" w:lineRule="auto"/>
-              <w:ind w:firstLine="0" w:left="0"/>
-            </w:pPr>
-            <w:r>
-              <w:rPr>
-                <w:b w:val="0"/>
-                <w:sz w:val="18"/>
-              </w:rPr>
-              <w:t>10</w:t>
             </w:r>
           </w:p>
         </w:tc>
@@ -978,7 +874,7 @@
         </w:trPr>
         <w:tc>
           <w:tcPr>
-            <w:tcW w:type="dxa" w:w="1757"/>
+            <w:tcW w:type="dxa" w:w="1814"/>
             <w:vAlign w:val="center"/>
           </w:tcPr>
           <w:p>
@@ -999,7 +895,7 @@
         </w:tc>
         <w:tc>
           <w:tcPr>
-            <w:tcW w:type="dxa" w:w="2835"/>
+            <w:tcW w:type="dxa" w:w="3685"/>
             <w:vAlign w:val="center"/>
           </w:tcPr>
           <w:p>
@@ -1020,7 +916,7 @@
         </w:tc>
         <w:tc>
           <w:tcPr>
-            <w:tcW w:type="dxa" w:w="2381"/>
+            <w:tcW w:type="dxa" w:w="3288"/>
             <w:vAlign w:val="center"/>
           </w:tcPr>
           <w:p>
@@ -1036,27 +932,6 @@
                 <w:sz w:val="18"/>
               </w:rPr>
               <w:t>14 082 482</w:t>
-            </w:r>
-          </w:p>
-        </w:tc>
-        <w:tc>
-          <w:tcPr>
-            <w:tcW w:type="dxa" w:w="1814"/>
-            <w:vAlign w:val="center"/>
-          </w:tcPr>
-          <w:p>
-            <w:pPr>
-              <w:pStyle w:val="Мойтекст"/>
-              <w:keepNext w:val="0"/>
-              <w:spacing w:before="80" w:after="80" w:line="240" w:lineRule="auto"/>
-              <w:ind w:firstLine="0" w:left="0"/>
-            </w:pPr>
-            <w:r>
-              <w:rPr>
-                <w:b w:val="0"/>
-                <w:sz w:val="18"/>
-              </w:rPr>
-              <w:t>10</w:t>
             </w:r>
           </w:p>
         </w:tc>
@@ -1065,34 +940,38 @@
     <w:p>
       <w:pPr>
         <w:pStyle w:val="Мойтекст"/>
+        <w:keepLines/>
         <w:spacing w:after="100"/>
       </w:pPr>
       <w:r>
-        <w:t>Для расчётов размер TXT принят равным 10 485 760 байт — объёму пяти созданных файлов по 2 × 1024² байт. На скриншоте FAR показано шесть файлов и округлённый объём 10,0 МБ; точный размер дополнительного файла на нём не указан. Остальные исходные размеры приведены по данным выполнения работы. На скриншотах показаны: DOC — 3 файла, PIC — 12, VID — 4, PRG — 3, SMALL — 10 548 файлов.</w:t>
+        <w:t>Размер TXT в расчётах приняла равным 10 485 760 байт, то есть объёму пяти файлов по 2 МБ. На скриншоте также есть небольшой дополнительный текстовый файл.</w:t>
       </w:r>
     </w:p>
     <w:p>
       <w:pPr>
         <w:pStyle w:val="Мойтекст"/>
+        <w:keepLines/>
         <w:spacing w:after="100"/>
       </w:pPr>
       <w:r>
-        <w:t>Для SMALL файлы подбираются и копируются с помощью FAR. При подсчёте используется суммарный размер содержимого файлов, а не занятое на диске место. Все указанные наборы достигают минимального объёма, установленного заданием.</w:t>
+        <w:t>Небольшие файлы для SMALL нашла и скопировала через FAR. Всего в этой папке получилось 10 548 файлов.</w:t>
       </w:r>
     </w:p>
     <w:p>
       <w:pPr>
         <w:pStyle w:val="Мойтекст"/>
+        <w:keepLines/>
         <w:spacing w:after="100"/>
       </w:pPr>
       <w:r>
-        <w:t>Ниже приведены скриншоты каталогов в FAR: слева список файлов в режиме «Краткий», справа «Быстрый просмотр» с размером и количеством файлов. В PIC присутствуют в том числе PNG-изображения; результаты сжатия относятся к фактически подготовленному набору.</w:t>
+        <w:t>В FAR открыла список файлов в кратком режиме, а на правой панели включила быстрый просмотр размера и количества файлов.</w:t>
       </w:r>
     </w:p>
     <w:p>
       <w:pPr>
         <w:pStyle w:val="Мойтекст"/>
         <w:keepNext/>
+        <w:keepLines/>
         <w:ind w:firstLine="0"/>
       </w:pPr>
       <w:r>
@@ -1151,13 +1030,14 @@
         <w:spacing w:after="140"/>
       </w:pPr>
       <w:r>
-        <w:t>Скриншот 1 — Файлы, размер и количество файлов каталога 450389TXT</w:t>
+        <w:t>Скриншот 1. Каталог 450389TXT</w:t>
       </w:r>
     </w:p>
     <w:p>
       <w:pPr>
         <w:pStyle w:val="Мойтекст"/>
         <w:keepNext/>
+        <w:keepLines/>
         <w:ind w:firstLine="0"/>
       </w:pPr>
       <w:r>
@@ -1216,13 +1096,14 @@
         <w:spacing w:after="140"/>
       </w:pPr>
       <w:r>
-        <w:t>Скриншот 2 — Файлы, размер и количество файлов каталога 450389DOC</w:t>
+        <w:t>Скриншот 2. Каталог 450389DOC</w:t>
       </w:r>
     </w:p>
     <w:p>
       <w:pPr>
         <w:pStyle w:val="Мойтекст"/>
         <w:keepNext/>
+        <w:keepLines/>
         <w:ind w:firstLine="0"/>
       </w:pPr>
       <w:r>
@@ -1281,13 +1162,14 @@
         <w:spacing w:after="140"/>
       </w:pPr>
       <w:r>
-        <w:t>Скриншот 3 — Файлы, размер и количество файлов каталога 450389PIC</w:t>
+        <w:t>Скриншот 3. Каталог 450389PIC</w:t>
       </w:r>
     </w:p>
     <w:p>
       <w:pPr>
         <w:pStyle w:val="Мойтекст"/>
         <w:keepNext/>
+        <w:keepLines/>
         <w:ind w:firstLine="0"/>
       </w:pPr>
       <w:r>
@@ -1346,13 +1228,14 @@
         <w:spacing w:after="140"/>
       </w:pPr>
       <w:r>
-        <w:t>Скриншот 4 — Файлы, размер и количество файлов каталога 450389VID</w:t>
+        <w:t>Скриншот 4. Каталог 450389VID</w:t>
       </w:r>
     </w:p>
     <w:p>
       <w:pPr>
         <w:pStyle w:val="Мойтекст"/>
         <w:keepNext/>
+        <w:keepLines/>
         <w:ind w:firstLine="0"/>
       </w:pPr>
       <w:r>
@@ -1411,13 +1294,14 @@
         <w:spacing w:after="140"/>
       </w:pPr>
       <w:r>
-        <w:t>Скриншот 5 — Файлы, размер и количество файлов каталога 450389PRG</w:t>
+        <w:t>Скриншот 5. Каталог 450389PRG</w:t>
       </w:r>
     </w:p>
     <w:p>
       <w:pPr>
         <w:pStyle w:val="Мойтекст"/>
         <w:keepNext/>
+        <w:keepLines/>
         <w:ind w:firstLine="0"/>
       </w:pPr>
       <w:r>
@@ -1476,7 +1360,7 @@
         <w:spacing w:after="140"/>
       </w:pPr>
       <w:r>
-        <w:t>Скриншот 6 — Файлы, размер и количество файлов каталога 450389SMALL</w:t>
+        <w:t>Скриншот 6. Каталог 450389SMALL</w:t>
       </w:r>
     </w:p>
     <w:p>
@@ -1493,37 +1377,41 @@
     <w:p>
       <w:pPr>
         <w:pStyle w:val="Мойтекст"/>
+        <w:keepLines/>
         <w:spacing w:after="100"/>
       </w:pPr>
       <w:r>
-        <w:t>Каждый каталог упакован отдельно четырьмя методами при уровне сжатия «5 — Нормальный». Для LZMA2, BZip2 и PPMd используется формат 7z, для Deflate — ZIP. В таблицах приведены результаты, сообщённые при выполнении работы; повторные запуски и независимое измерение времени не проводились.</w:t>
+        <w:t>Каждую папку сжала четырьмя методами на нормальном уровне. Для LZMA2, BZip2 и PPMd выбрала формат 7z, для Deflate формат ZIP.</w:t>
       </w:r>
     </w:p>
     <w:p>
       <w:pPr>
         <w:pStyle w:val="Мойтекст"/>
+        <w:keepLines/>
         <w:spacing w:after="100"/>
       </w:pPr>
       <w:r>
-        <w:t>В столбце памяти приведена оценка «Объём памяти для упаковки» из настроек 7-Zip, а не измеренный пик потребления оперативной памяти. Значения сохранены по предоставленным данным: LZMA2 — 4928 МБ, Deflate — 1088 МБ, BZip2 — 160 МБ, PPMd — 18 МБ.</w:t>
+        <w:t>Память для упаковки записала из окна настроек 7-Zip. Это оценка программы, а не замер расхода RAM во время сжатия.</w:t>
       </w:r>
     </w:p>
     <w:p>
       <w:pPr>
         <w:pStyle w:val="Мойтекст"/>
+        <w:keepLines/>
         <w:spacing w:after="100"/>
       </w:pPr>
       <w:r>
-        <w:t>Размер архива в КБ = размер архива в байтах / 1024. Коэффициент сжатия = размер архива / суммарный исходный размер файлов × 100 %. Чем меньше коэффициент, тем меньше итоговый архив. Значение выше 100 % означает увеличение размера.</w:t>
+        <w:t>Коэффициент рассчитала по формуле: размер архива / исходный размер × 100 %. Чем меньше процент, тем лучше сжатие. Размер в КБ получила делением размера в байтах на 1024.</w:t>
       </w:r>
     </w:p>
     <w:p>
       <w:pPr>
         <w:pStyle w:val="Мойтекст"/>
+        <w:keepLines/>
         <w:spacing w:after="100"/>
       </w:pPr>
       <w:r>
-        <w:t>Время «&lt; 1 с» означает, что сжатие было описано как моментальное и точное время не измерено. Остальные значения времени перенесены из наблюдений. Сравнение очень коротких запусков носит ориентировочный характер.</w:t>
+        <w:t>Если сжатие завершалось моментально, в таблице указала «&lt; 1 с».</w:t>
       </w:r>
     </w:p>
     <w:p>
@@ -2111,10 +1999,11 @@
     <w:p>
       <w:pPr>
         <w:pStyle w:val="Мойтекст"/>
+        <w:keepLines/>
         <w:spacing w:after="100"/>
       </w:pPr>
       <w:r>
-        <w:t>Минимальный размер одинаков у LZMA2 и PPMd: 1984 байта. Повторяющийся текст хорошо сжимается обоими методами. При одинаковом размере PPMd имеет меньшую указанную оценку памяти — 18 МБ против 4928 МБ у LZMA2.</w:t>
+        <w:t>LZMA2 и PPMd дали одинаковый размер, 1984 байта. Повторяющийся текст хорошо сжимается. Из этих двух вариантов PPMd требует меньше памяти по оценке 7-Zip.</w:t>
       </w:r>
     </w:p>
     <w:p>
@@ -2702,10 +2591,11 @@
     <w:p>
       <w:pPr>
         <w:pStyle w:val="Мойтекст"/>
+        <w:keepLines/>
         <w:spacing w:after="100"/>
       </w:pPr>
       <w:r>
-        <w:t>Наименьший архив получен методом LZMA2 — 8 765 007 байт (56,51 %). Остальные методы почти не сократили набор. Документы .docx и .odt уже содержат сжатые данные; при этом LZMA2 в сплошном архиве может использовать повторения между похожими файлами. Точная причина различий требует анализа состава документов. Архив Deflate на 45 байт больше исходного набора; при округлении коэффициент отображается как 100,00 %.</w:t>
+        <w:t>Для DOC лучше сработал LZMA2: архив занял 56,51 % исходного объёма. Он может использовать повторения между похожими документами. Остальные методы почти не уменьшили размер, поскольку DOCX уже содержит сжатые данные. ZIP получился на 45 байт больше исходных файлов.</w:t>
       </w:r>
     </w:p>
     <w:p>
@@ -3293,10 +3183,11 @@
     <w:p>
       <w:pPr>
         <w:pStyle w:val="Мойтекст"/>
+        <w:keepLines/>
         <w:spacing w:after="100"/>
       </w:pPr>
       <w:r>
-        <w:t>По размеру лучшим оказался PPMd: 22 676 873 байта (92,00 %). При этом он потребовал 6 с, а Deflate — 0,1 с по предоставленным наблюдениям. Изображения в сжатых форматах JPEG и PNG допускают ограниченное дополнительное сжатие. Преимущество PPMd относится к данному набору изображений.</w:t>
+        <w:t>Для PIC самый маленький архив получился у PPMd, но сжатие заняло 6 секунд. Изображения JPEG и PNG уже сжаты, поэтому уменьшить их размер удалось ненамного.</w:t>
       </w:r>
     </w:p>
     <w:p>
@@ -3884,10 +3775,11 @@
     <w:p>
       <w:pPr>
         <w:pStyle w:val="Мойтекст"/>
+        <w:keepLines/>
         <w:spacing w:after="100"/>
       </w:pPr>
       <w:r>
-        <w:t>Наименьший архив получен методом LZMA2: 21 466 631 байт (99,71 %). Выигрыш составил всего 62 851 байт. Видео MP4 обычно уже сжато, поэтому повторная архивация малоэффективна; BZip2 и PPMd в этом опыте увеличили общий размер.</w:t>
+        <w:t>Для VID лучший результат дал LZMA2. Размер уменьшился всего на 62 851 байт, поскольку MP4 уже сжат. BZip2 и PPMd даже немного увеличили объём.</w:t>
       </w:r>
     </w:p>
     <w:p>
@@ -4475,10 +4367,11 @@
     <w:p>
       <w:pPr>
         <w:pStyle w:val="Мойтекст"/>
+        <w:keepLines/>
         <w:spacing w:after="100"/>
       </w:pPr>
       <w:r>
-        <w:t>Лучший результат по размеру показал LZMA2: 4 761 531 байт (28,08 %). Метод эффективно использует повторяющиеся последовательности в исполняемых файлах. PPMd оказался быстрее по указанным наблюдениям, но сформировал больший архив.</w:t>
+        <w:t>Для PRG самый маленький архив создал LZMA2: 28,08 % исходного объёма. В исполняемых файлах есть повторяющиеся данные, которые хорошо сжимаются. PPMd сработал быстрее, но архив получился больше.</w:t>
       </w:r>
     </w:p>
     <w:p>
@@ -5066,10 +4959,11 @@
     <w:p>
       <w:pPr>
         <w:pStyle w:val="Мойтекст"/>
+        <w:keepLines/>
         <w:spacing w:after="100"/>
       </w:pPr>
       <w:r>
-        <w:t>Самый маленький архив получен методом LZMA2: 1 508 663 байта (10,71 %), однако время составило 33 с. PPMd дал 2 097 601 байт (14,90 %) за 2 с. Сплошное сжатие 7z может использовать общие фрагменты разных небольших файлов; ZIP сжимает файлы отдельно и дополнительно хранит служебные записи для каждого файла. Это может объяснять большой размер ZIP для набора из множества файлов.</w:t>
+        <w:t>Для SMALL лучше всего сжал LZMA2, но ему потребовалось 33 секунды. PPMd дал немного больший архив за 2 секунды. Непрерывное сжатие позволяет учитывать повторения между маленькими файлами. ZIP сжимает каждый файл отдельно, поэтому его результат оказался хуже.</w:t>
       </w:r>
     </w:p>
     <w:p>
@@ -5086,10 +4980,11 @@
     <w:p>
       <w:pPr>
         <w:pStyle w:val="Мойтекст"/>
+        <w:keepLines/>
         <w:spacing w:after="100"/>
       </w:pPr>
       <w:r>
-        <w:t>Для каталога 450389TXT выбран метод LZMA2, уровень сжатия «5 — Нормальный». Исследованы словари 64 КБ, 16 МБ, 128 МБ и максимальный доступный размер 3840 МБ. По сообщению исполнителя вручную изменялся только словарь. В окне максимального словаря 7-Zip отображает два потока; вручную число потоков не менялось. Поэтому фиксируется фактически показанная оценка памяти программы.</w:t>
+        <w:t>Папку TXT сжала методом LZMA2 на нормальном уровне, меняя размер словаря: 64 КБ, 16 МБ, 128 МБ и 3840 МБ. Остальные настройки вручную не меняла.</w:t>
       </w:r>
     </w:p>
     <w:tbl>
@@ -5637,7 +5532,7 @@
                 <w:b w:val="0"/>
                 <w:sz w:val="18"/>
               </w:rPr>
-              <w:t>—</w:t>
+              <w:t>нет</w:t>
             </w:r>
           </w:p>
         </w:tc>
@@ -5658,7 +5553,7 @@
                 <w:b w:val="0"/>
                 <w:sz w:val="18"/>
               </w:rPr>
-              <w:t>—</w:t>
+              <w:t>нет</w:t>
             </w:r>
           </w:p>
         </w:tc>
@@ -5667,19 +5562,21 @@
     <w:p>
       <w:pPr>
         <w:pStyle w:val="Мойтекст"/>
+        <w:keepLines/>
         <w:spacing w:after="100"/>
       </w:pPr>
       <w:r>
-        <w:t>Память в таблице — оценка 7-Zip, а не измеренный расход. При словаре 3840 МБ программа заблокировала операцию: требовалось 38 920 МБ, установленная RAM — 32 690 МБ, установленный лимит — 26 152 МБ. Архив для максимального словаря не создан; прочерки не означают нулевой размер.</w:t>
+        <w:t>При словаре 3840 МБ 7-Zip выдал ошибку нехватки памяти. Требовалось 38 920 МБ, а на компьютере установлено 32 690 МБ. Архив создать не удалось. Значения памяти в таблице взяты из настроек 7-Zip.</w:t>
       </w:r>
     </w:p>
     <w:p>
       <w:pPr>
         <w:pStyle w:val="Мойтекст"/>
+        <w:keepLines/>
         <w:spacing w:after="100"/>
       </w:pPr>
       <w:r>
-        <w:t>Увеличение словаря с 64 КБ до 16 МБ сократило архив с 2959 до 1980 байт. Дальнейшее увеличение до 128 МБ не изменило размер, но повысило оценку памяти сжатия с 2496 до 13 888 МБ и распаковки с 18 до 130 МБ. Большой словарь бесполезен, если меньший уже охватывает полезные повторения исходных данных. Для данного набора из успешно испытанных вариантов рациональнее словарь 16 МБ.</w:t>
+        <w:t>При переходе от 64 КБ к 16 МБ архив уменьшился с 2959 до 1980 байт. Словарь 128 МБ дал те же 1980 байт, но потребовал больше памяти. Поэтому для этих файлов достаточно 16 МБ. Большой словарь бесполезен, если все нужные повторения уже помещаются в меньший.</w:t>
       </w:r>
     </w:p>
     <w:p>
@@ -5731,7 +5628,7 @@
         <w:spacing w:after="140"/>
       </w:pPr>
       <w:r>
-        <w:t>Скриншот 7 — Архивы 450389TXT64, 450389TXT16 и 450389TXT128 в FAR, режим «Детальный»</w:t>
+        <w:t>Скриншот 7. Архивы 450389TXT64, 450389TXT16 и 450389TXT128 в FAR, режим «Детальный»</w:t>
       </w:r>
     </w:p>
     <w:p>
@@ -5783,7 +5680,7 @@
         <w:spacing w:after="140"/>
       </w:pPr>
       <w:r>
-        <w:t>Скриншот 8 — Отказ 7-Zip при словаре 3840 МБ: недостаточно памяти</w:t>
+        <w:t>Скриншот 8. Отказ 7-Zip при словаре 3840 МБ: недостаточно памяти</w:t>
       </w:r>
     </w:p>
     <w:p>
@@ -5800,10 +5697,11 @@
     <w:p>
       <w:pPr>
         <w:pStyle w:val="Мойтекст"/>
+        <w:keepLines/>
         <w:spacing w:after="100"/>
       </w:pPr>
       <w:r>
-        <w:t>Каталоги 450389PIC и 450389VID упакованы по отдельности консольной версией 7-Zip с максимальным уровнем сжатия. Команды выполняются из родительского каталога, чтобы готовые архивы находились вне исходных папок. Параметр -mx=9 задаёт максимальный уровень, -m0=LZMA2 выбирает алгоритм. На консольных скриншотах используется 7-Zip 26.05 (x64); успешное завершение подтверждается сообщением Everything is Ok.</w:t>
+        <w:t>Папки PIC и VID сжала из командной строки с максимальным уровнем. В командах указала -mx=9 и метод LZMA2. Архивы сохранила рядом с исходными папками.</w:t>
       </w:r>
     </w:p>
     <w:p>
@@ -6189,10 +6087,11 @@
     <w:p>
       <w:pPr>
         <w:pStyle w:val="Мойтекст"/>
+        <w:keepLines/>
         <w:spacing w:after="100"/>
       </w:pPr>
       <w:r>
-        <w:t>По сравнению с нормальным уровнем LZMA2 из задания 2 архив PIC стал на 6 байт больше, а VID — на 183 байта меньше. Для этих наборов максимальный уровень почти не улучшил результат. Изображения в форматах JPEG/PNG и видео MP4 уже используют сжатие, поэтому повторная упаковка даёт небольшой выигрыш.</w:t>
+        <w:t>По сравнению с нормальным уровнем архив PIC стал на 6 байт больше, а VID на 183 байта меньше. Повышение уровня почти ничего не дало, поскольку изображения и видео уже сжаты.</w:t>
       </w:r>
     </w:p>
     <w:p>
@@ -6244,7 +6143,7 @@
         <w:spacing w:after="140"/>
       </w:pPr>
       <w:r>
-        <w:t>Скриншот 9 — Команда и результат максимального сжатия 450389PIC в CMD</w:t>
+        <w:t>Скриншот 9. Команда и результат максимального сжатия 450389PIC в CMD</w:t>
       </w:r>
     </w:p>
     <w:p>
@@ -6296,7 +6195,7 @@
         <w:spacing w:after="140"/>
       </w:pPr>
       <w:r>
-        <w:t>Скриншот 10 — Команда и результат максимального сжатия 450389VID в CMD</w:t>
+        <w:t>Скриншот 10. Команда и результат максимального сжатия 450389VID в CMD</w:t>
       </w:r>
     </w:p>
     <w:p>
@@ -6348,7 +6247,7 @@
         <w:spacing w:after="140"/>
       </w:pPr>
       <w:r>
-        <w:t>Скриншот 11 — Архивы 450389PIC_max.7z и 450389VID_max.7z в FAR, режим «Детальный»</w:t>
+        <w:t>Скриншот 11. Архивы 450389PIC_max.7z и 450389VID_max.7z в FAR, режим «Детальный»</w:t>
       </w:r>
     </w:p>
     <w:p>
@@ -6365,10 +6264,11 @@
     <w:p>
       <w:pPr>
         <w:pStyle w:val="Мойтекст"/>
+        <w:keepLines/>
         <w:spacing w:after="100"/>
       </w:pPr>
       <w:r>
-        <w:t>Для каталога 450389SMALL созданы три архива с LZMA2 на нормальном уровне: непрерывный Solid, обычный без Solid и самораспаковывающийся SFX без Solid. Для сопоставимости SFX и обычного архива в обоих случаях непрерывное сжатие отключено. Использованы следующие команды из родительского каталога.</w:t>
+        <w:t>Для SMALL создала обычный архив, Solid и SFX. Во всех случаях выбрала LZMA2 и нормальный уровень. В обычном и SFX-архиве отключила Solid, чтобы сравнить их при одинаковых настройках.</w:t>
       </w:r>
     </w:p>
     <w:p>
@@ -6792,28 +6692,31 @@
     <w:p>
       <w:pPr>
         <w:pStyle w:val="Мойтекст"/>
+        <w:keepLines/>
         <w:spacing w:after="100"/>
       </w:pPr>
       <w:r>
-        <w:t>Solid-архив — самый маленький: 1 508 589 байт. При непрерывном сжатии общие фрагменты разных файлов могут использоваться совместно. Обычный архив сжимает файлы независимо, поэтому для этого набора его размер значительно больше.</w:t>
+        <w:t>Самым маленьким получился Solid, 1 508 589 байт. Он использует повторения между файлами. В обычном архиве файлы сжимаются отдельно, поэтому его размер больше.</w:t>
       </w:r>
     </w:p>
     <w:p>
       <w:pPr>
         <w:pStyle w:val="Мойтекст"/>
+        <w:keepLines/>
         <w:spacing w:after="100"/>
       </w:pPr>
       <w:r>
-        <w:t>SFX больше обычного архива на 194 560 байт, или 190 КБ. Разница соответствует добавленному модулю самораспаковки. Преимущество SFX — извлечение файлов без установленного архиватора. Недостатки — дополнительный размер и зависимость исполняемого модуля от платформы: созданный .exe предназначен для Windows.</w:t>
+        <w:t>SFX оказался больше обычного архива на 194 560 байт, или 190 КБ, из-за модуля самораспаковки. Его преимущество в том, что для извлечения не нужен архиватор. Недостатки: больший размер и зависимость от системы. Созданный EXE работает в Windows.</w:t>
       </w:r>
     </w:p>
     <w:p>
       <w:pPr>
         <w:pStyle w:val="Мойтекст"/>
+        <w:keepLines/>
         <w:spacing w:after="100"/>
       </w:pPr>
       <w:r>
-        <w:t>Преимущество Solid — лучшее сжатие набора похожих файлов. Главный недостаток — для извлечения отдельного файла может потребоваться обработать предшествующие данные внутри блока; изменение содержимого также может потребовать повторного сжатия блока. Обычный архив удобнее для независимого доступа к отдельным файлам.</w:t>
+        <w:t>Преимущество Solid в хорошем сжатии похожих файлов. Главный недостаток: для извлечения одного файла иногда нужно распаковать предыдущие данные блока. Изменение архива также может потребовать повторного сжатия блока.</w:t>
       </w:r>
     </w:p>
     <w:p>
@@ -6865,7 +6768,7 @@
         <w:spacing w:after="140"/>
       </w:pPr>
       <w:r>
-        <w:t>Скриншот 12 — Создание Solid-архива: команда и результат в CMD</w:t>
+        <w:t>Скриншот 12. Создание Solid-архива: команда и результат в CMD</w:t>
       </w:r>
     </w:p>
     <w:p>
@@ -6917,7 +6820,7 @@
         <w:spacing w:after="140"/>
       </w:pPr>
       <w:r>
-        <w:t>Скриншот 13 — Создание обычного архива: команда и результат в CMD</w:t>
+        <w:t>Скриншот 13. Создание обычного архива: команда и результат в CMD</w:t>
       </w:r>
     </w:p>
     <w:p>
@@ -6969,7 +6872,7 @@
         <w:spacing w:after="140"/>
       </w:pPr>
       <w:r>
-        <w:t>Скриншот 14 — Создание SFX-архива: команда и результат в CMD</w:t>
+        <w:t>Скриншот 14. Создание SFX-архива: команда и результат в CMD</w:t>
       </w:r>
     </w:p>
     <w:p>
@@ -7021,7 +6924,7 @@
         <w:spacing w:after="140"/>
       </w:pPr>
       <w:r>
-        <w:t>Скриншот 15 — Все три архива SMALL в FAR, режим «Детальный»</w:t>
+        <w:t>Скриншот 15. Все три архива SMALL в FAR, режим «Детальный»</w:t>
       </w:r>
     </w:p>
     <w:p>
@@ -7038,10 +6941,11 @@
     <w:p>
       <w:pPr>
         <w:pStyle w:val="Мойтекст"/>
+        <w:keepLines/>
         <w:spacing w:after="100"/>
       </w:pPr>
       <w:r>
-        <w:t>Исходная строка: «Садовщикова София Ивановна». В ней 26 символов, включая два пробела. Регистр учитывается: И и и, С и с являются разными символами. Для учебного расчёта принят однобайтовый исходный текст в Windows-1251 без служебных заголовков: 26 × 8 = 208 бит, или 26 байт.</w:t>
+        <w:t>Для ручного сжатия взяла своё ФИО: «Садовщикова София Ивановна». В строке 26 символов с учётом двух пробелов. Для расчётов приняла Windows-1251, где один символ занимает один байт. Исходный размер: 26 × 8 = 208 бит, или 26 байт.</w:t>
       </w:r>
     </w:p>
     <w:p>
@@ -7057,15 +6961,17 @@
     <w:p>
       <w:pPr>
         <w:pStyle w:val="Мойтекст"/>
+        <w:keepLines/>
         <w:spacing w:after="100"/>
       </w:pPr>
       <w:r>
-        <w:t>RLE заменяет последовательность одинаковых подряд символов парой «символ — число повторений». В данном ФИО соседних одинаковых символов нет, поэтому получаются 26 серий длины 1. Обозначение ␠ ниже соответствует одному обычному пробелу, а не дополнительному символу исходной строки.</w:t>
+        <w:t>В RLE записала каждый символ и число его повторений подряд. В моём ФИО соседних одинаковых символов нет, поэтому все счётчики равны 1. Знаком ␠ обозначила пробел.</w:t>
       </w:r>
     </w:p>
     <w:p>
       <w:pPr>
         <w:pStyle w:val="Мойтекст"/>
+        <w:keepLines/>
         <w:spacing w:before="80" w:after="100"/>
         <w:ind w:firstLine="0" w:left="0"/>
       </w:pPr>
@@ -7080,10 +6986,11 @@
     <w:p>
       <w:pPr>
         <w:pStyle w:val="Мойтекст"/>
+        <w:keepLines/>
         <w:spacing w:after="100"/>
       </w:pPr>
       <w:r>
-        <w:t>В выбранном представлении символ и счётчик занимают по одному байту. Объём результата: 26 × (1 + 1) = 52 байта, или 416 бит. Коэффициент: 52 / 26 × 100 % = 200 %. Вместо сжатия произошло увеличение объёма вдвое. Это вывод для указанного формата RLE; другие реализации могут отдельно обрабатывать одиночные символы.</w:t>
+        <w:t>На символ и счётчик выделила по одному байту. Получилось 26 × 2 = 52 байта, или 416 бит. Коэффициент: 52 / 26 × 100 % = 200 %. В таком представлении RLE увеличил объём вдвое, поскольку в строке нет повторяющихся серий.</w:t>
       </w:r>
     </w:p>
     <w:p>
@@ -7099,15 +7006,17 @@
     <w:p>
       <w:pPr>
         <w:pStyle w:val="Мойтекст"/>
+        <w:keepLines/>
         <w:spacing w:after="100"/>
       </w:pPr>
       <w:r>
-        <w:t>Сначала подсчитаны частоты всех символов. Для построения дерева на каждом шаге объединяются два узла с наименьшими частотами. При равных частотах возможны разные, одинаково эффективные деревья. Ниже приведён один допустимый порядок объединений:</w:t>
+        <w:t>Для Хаффмана сначала подсчитала частоты символов. Затем поочерёдно объединяла два узла с наименьшей частотой. Получилось следующее дерево:</w:t>
       </w:r>
     </w:p>
     <w:p>
       <w:pPr>
         <w:pStyle w:val="Мойтекст"/>
+        <w:keepLines/>
         <w:spacing w:before="80" w:after="100"/>
         <w:ind w:firstLine="0" w:left="0"/>
       </w:pPr>
@@ -7144,10 +7053,11 @@
     <w:p>
       <w:pPr>
         <w:pStyle w:val="Мойтекст"/>
+        <w:keepLines/>
         <w:spacing w:after="100"/>
       </w:pPr>
       <w:r>
-        <w:t>Левой ветви назначен 0, правой — 1. Путь от корня до символа задаёт его код. Более частые символы а, в и о получили трёхбитовые коды, остальные — четырёхбитовые.</w:t>
+        <w:t>Левой ветви присвоила 0, правой 1. По пути от корня к каждому символу записала его код. Для а, в и о получилось по 3 бита, для остальных символов по 4 бита.</w:t>
       </w:r>
     </w:p>
     <w:tbl>
@@ -8774,7 +8684,7 @@
                 <w:b w:val="0"/>
                 <w:sz w:val="18"/>
               </w:rPr>
-              <w:t>—</w:t>
+              <w:t>нет</w:t>
             </w:r>
           </w:p>
         </w:tc>
@@ -8795,7 +8705,7 @@
                 <w:b w:val="0"/>
                 <w:sz w:val="18"/>
               </w:rPr>
-              <w:t>—</w:t>
+              <w:t>нет</w:t>
             </w:r>
           </w:p>
         </w:tc>
@@ -8825,15 +8735,17 @@
     <w:p>
       <w:pPr>
         <w:pStyle w:val="Мойтекст"/>
+        <w:keepLines/>
         <w:spacing w:after="100"/>
       </w:pPr>
       <w:r>
-        <w:t>Подстановка кодов в исходную строку даёт следующую последовательность. Пробелы между кодами и переводы строк добавлены для наглядности и в размер битовой последовательности не входят; 1100 кодирует настоящий пробел между частями ФИО.</w:t>
+        <w:t>Заменила символы ФИО их кодами. Для удобства разделила коды пробелами. Настоящему пробелу между словами соответствует код 1100.</w:t>
       </w:r>
     </w:p>
     <w:p>
       <w:pPr>
         <w:pStyle w:val="Мойтекст"/>
+        <w:keepLines/>
         <w:spacing w:before="80" w:after="100"/>
         <w:ind w:firstLine="0" w:left="0"/>
       </w:pPr>
@@ -8856,19 +8768,21 @@
     <w:p>
       <w:pPr>
         <w:pStyle w:val="Мойтекст"/>
+        <w:keepLines/>
         <w:spacing w:after="100"/>
       </w:pPr>
       <w:r>
-        <w:t>Объём полезных данных: 3 × 4 × 3 + 4 × 2 × 4 + 6 × 1 × 4 = 36 + 32 + 24 = 92 бита. Коэффициент: 92 / 208 × 100 % = 44,23 %. Уменьшение объёма полезных данных: 55,77 %. При сохранении целыми байтами требуются 12 байт, или 96 бит, включая четыре бита дополнения; коэффициент тогда равен 12 / 26 × 100 % = 46,15 %.</w:t>
+        <w:t>Общий размер: 3 × 4 × 3 + 4 × 2 × 4 + 6 × 1 × 4 = 92 бита. Коэффициент: 92 / 208 × 100 % = 44,23 %. Объём уменьшился на 55,77 %. Для записи целыми байтами нужны 12 байт с четырьмя битами дополнения. В этом случае коэффициент равен 12 / 26 × 100 % = 46,15 %.</w:t>
       </w:r>
     </w:p>
     <w:p>
       <w:pPr>
         <w:pStyle w:val="Мойтекст"/>
+        <w:keepLines/>
         <w:spacing w:after="100"/>
       </w:pPr>
       <w:r>
-        <w:t>Таблица кодов и служебные данные декодирования в эти размеры не включены. Для короткой строки их хранение может сделать итоговый файл больше исходного. Если исходный текст хранится в UTF-8 без BOM, он занимает 50 байт (24 кириллических символа по два байта и два пробела по одному); коэффициенты относительно такого оригинала будут другими. В данном сравнении последовательно используется Windows-1251.</w:t>
+        <w:t>Таблицу кодов в размер результата не включала. Для такой короткой строки она может занять больше места, чем удалось сэкономить.</w:t>
       </w:r>
     </w:p>
     <w:tbl>
@@ -8991,7 +8905,7 @@
           <w:p>
             <w:pPr>
               <w:pStyle w:val="Мойтекст"/>
-              <w:keepNext w:val="0"/>
+              <w:keepNext/>
               <w:spacing w:before="80" w:after="80" w:line="240" w:lineRule="auto"/>
               <w:ind w:firstLine="0" w:left="0"/>
             </w:pPr>
@@ -9012,7 +8926,7 @@
           <w:p>
             <w:pPr>
               <w:pStyle w:val="Мойтекст"/>
-              <w:keepNext w:val="0"/>
+              <w:keepNext/>
               <w:spacing w:before="80" w:after="80" w:line="240" w:lineRule="auto"/>
               <w:ind w:firstLine="0" w:left="0"/>
             </w:pPr>
@@ -9033,7 +8947,7 @@
           <w:p>
             <w:pPr>
               <w:pStyle w:val="Мойтекст"/>
-              <w:keepNext w:val="0"/>
+              <w:keepNext/>
               <w:spacing w:before="80" w:after="80" w:line="240" w:lineRule="auto"/>
               <w:ind w:firstLine="0" w:left="0"/>
             </w:pPr>
@@ -9054,7 +8968,7 @@
           <w:p>
             <w:pPr>
               <w:pStyle w:val="Мойтекст"/>
-              <w:keepNext w:val="0"/>
+              <w:keepNext/>
               <w:spacing w:before="80" w:after="80" w:line="240" w:lineRule="auto"/>
               <w:ind w:firstLine="0" w:left="0"/>
             </w:pPr>
@@ -9080,7 +8994,7 @@
           <w:p>
             <w:pPr>
               <w:pStyle w:val="Мойтекст"/>
-              <w:keepNext w:val="0"/>
+              <w:keepNext/>
               <w:spacing w:before="80" w:after="80" w:line="240" w:lineRule="auto"/>
               <w:ind w:firstLine="0" w:left="0"/>
             </w:pPr>
@@ -9101,7 +9015,7 @@
           <w:p>
             <w:pPr>
               <w:pStyle w:val="Мойтекст"/>
-              <w:keepNext w:val="0"/>
+              <w:keepNext/>
               <w:spacing w:before="80" w:after="80" w:line="240" w:lineRule="auto"/>
               <w:ind w:firstLine="0" w:left="0"/>
             </w:pPr>
@@ -9122,7 +9036,7 @@
           <w:p>
             <w:pPr>
               <w:pStyle w:val="Мойтекст"/>
-              <w:keepNext w:val="0"/>
+              <w:keepNext/>
               <w:spacing w:before="80" w:after="80" w:line="240" w:lineRule="auto"/>
               <w:ind w:firstLine="0" w:left="0"/>
             </w:pPr>
@@ -9143,7 +9057,7 @@
           <w:p>
             <w:pPr>
               <w:pStyle w:val="Мойтекст"/>
-              <w:keepNext w:val="0"/>
+              <w:keepNext/>
               <w:spacing w:before="80" w:after="80" w:line="240" w:lineRule="auto"/>
               <w:ind w:firstLine="0" w:left="0"/>
             </w:pPr>
@@ -9169,7 +9083,7 @@
           <w:p>
             <w:pPr>
               <w:pStyle w:val="Мойтекст"/>
-              <w:keepNext w:val="0"/>
+              <w:keepNext/>
               <w:spacing w:before="80" w:after="80" w:line="240" w:lineRule="auto"/>
               <w:ind w:firstLine="0" w:left="0"/>
             </w:pPr>
@@ -9190,7 +9104,7 @@
           <w:p>
             <w:pPr>
               <w:pStyle w:val="Мойтекст"/>
-              <w:keepNext w:val="0"/>
+              <w:keepNext/>
               <w:spacing w:before="80" w:after="80" w:line="240" w:lineRule="auto"/>
               <w:ind w:firstLine="0" w:left="0"/>
             </w:pPr>
@@ -9211,7 +9125,7 @@
           <w:p>
             <w:pPr>
               <w:pStyle w:val="Мойтекст"/>
-              <w:keepNext w:val="0"/>
+              <w:keepNext/>
               <w:spacing w:before="80" w:after="80" w:line="240" w:lineRule="auto"/>
               <w:ind w:firstLine="0" w:left="0"/>
             </w:pPr>
@@ -9232,7 +9146,7 @@
           <w:p>
             <w:pPr>
               <w:pStyle w:val="Мойтекст"/>
-              <w:keepNext w:val="0"/>
+              <w:keepNext/>
               <w:spacing w:before="80" w:after="80" w:line="240" w:lineRule="auto"/>
               <w:ind w:firstLine="0" w:left="0"/>
             </w:pPr>
@@ -9339,10 +9253,11 @@
     <w:p>
       <w:pPr>
         <w:pStyle w:val="Мойтекст"/>
+        <w:keepLines/>
         <w:spacing w:after="100"/>
       </w:pPr>
       <w:r>
-        <w:t>Вывод: выбранный RLE не подходит для данного ФИО из-за отсутствия серий одинаковых соседних символов. Хаффман уменьшает объём полезной последовательности за счёт более коротких кодов для частых символов; выигрыш готового файла зависит от способа хранения таблицы кодов и заголовков.</w:t>
+        <w:t>RLE для моего ФИО оказался неэффективен. Хаффман сократил саму последовательность до 92 бит за счёт коротких кодов для частых символов.</w:t>
       </w:r>
     </w:p>
     <w:p>
@@ -9359,28 +9274,31 @@
     <w:p>
       <w:pPr>
         <w:pStyle w:val="Мойтекст"/>
+        <w:keepLines/>
         <w:spacing w:after="100"/>
       </w:pPr>
       <w:r>
-        <w:t>По минимальному размеру архива LZMA2 оказался лучшим для DOC, VID, PRG и SMALL; для TXT LZMA2 и PPMd дали одинаковый результат. Для PIC наименьший размер показал PPMd. Для уже сжатых изображений и видео дополнительный выигрыш невелик, а некоторые методы увеличивают размер.</w:t>
+        <w:t>В работе сравнила четыре метода сжатия. LZMA2 дал лучшие результаты для DOC, VID, PRG и SMALL. Для TXT он совпал с PPMd, а для PIC лучше оказался PPMd. Уже сжатые изображения и видео уменьшились незначительно.</w:t>
       </w:r>
     </w:p>
     <w:p>
       <w:pPr>
         <w:pStyle w:val="Мойтекст"/>
+        <w:keepLines/>
         <w:spacing w:after="100"/>
       </w:pPr>
       <w:r>
-        <w:t>Выбор метода зависит не только от размера: для SMALL преимущество LZMA2 сопровождается существенно большим временем. Значения памяти в работе являются оценками настроек, поэтому по ним нельзя делать вывод о фактически занятой памяти во время каждого запуска.</w:t>
+        <w:t>Для SMALL меньший размер потребовал больше времени: LZMA2 работал 33 секунды, а PPMd 2 секунды. Поэтому при выборе метода нужно учитывать и размер, и время.</w:t>
       </w:r>
     </w:p>
     <w:p>
       <w:pPr>
         <w:pStyle w:val="Мойтекст"/>
+        <w:keepLines/>
         <w:spacing w:after="100"/>
       </w:pPr>
       <w:r>
-        <w:t>Увеличение словаря с 16 до 128 МБ не улучшило сжатие TXT; максимальный словарь оказался недоступен по памяти. Максимальный уровень сжатия почти не изменил размеры PIC и VID. Для SMALL наименьший размер дал Solid, а SFX увеличил размер обычного архива на 190 КБ. Для ФИО выбранный RLE увеличил объём, тогда как Хаффман сократил полезную последовательность до 92 бит без учёта таблицы кодов.</w:t>
+        <w:t>Увеличение словаря выше 16 МБ не улучшило результат для TXT. Solid хорошо сжал набор маленьких файлов, а SFX добавил к обычному архиву 190 КБ. При ручном сжатии ФИО RLE увеличил объём, а Хаффман сократил данные без учёта таблицы кодов.</w:t>
       </w:r>
     </w:p>
     <w:p>
@@ -9397,10 +9315,11 @@
     <w:p>
       <w:pPr>
         <w:pStyle w:val="Мойтекст"/>
+        <w:keepLines/>
         <w:spacing w:after="100"/>
       </w:pPr>
       <w:r>
-        <w:t>По условию требуется загрузить самый маленький архив каждого каталога в облачное хранилище и предоставить доступ преподавателю. Сами архивы и ссылки на них пока не предоставлены; ниже подготовлен список для заполнения. Для TXT выбран PPMd как один из двух методов с одинаковым минимальным размером.</w:t>
+        <w:t>Для проверки выбрала самые маленькие архивы из задания 2. Для TXT оставила PPMd: его размер совпал с LZMA2. Ссылки добавлю после загрузки архивов.</w:t>
       </w:r>
     </w:p>
     <w:tbl>
@@ -9484,7 +9403,7 @@
                 <w:b/>
                 <w:sz w:val="18"/>
               </w:rPr>
-              <w:t>Рекомендуемое имя архива</w:t>
+              <w:t>Имя архива</w:t>
             </w:r>
           </w:p>
         </w:tc>

</xml_diff>